<commit_message>
Update Chapter 5 with 95-case empirical results, p < 0.001, and 6 real case scenarios in Discussion
</commit_message>
<xml_diff>
--- a/ch5_thesis.docx
+++ b/ch5_thesis.docx
@@ -4,667 +4,3664 @@
   <w:body>
     <w:p>
       <w:pPr>
-        <w:spacing w:before="240" w:after="160" w:line="360" w:lineRule="auto"/>
+        <w:spacing w:before="240" w:after="120" w:line="276" w:lineRule="auto"/>
         <w:jc w:val="center"/>
       </w:pPr>
       <w:r>
         <w:rPr>
-          <w:rFonts w:ascii="TH SarabunPSK" w:hAnsi="TH SarabunPSK" w:cs="TH SarabunPSK"/>
+          <w:rFonts w:ascii="TH Sarabun PSK" w:hAnsi="TH Sarabun PSK"/>
           <w:b/>
           <w:i w:val="0"/>
-          <w:sz w:val="36"/>
-        </w:rPr>
-        <w:t>บทที่ 5</w:t>
+          <w:color w:val="003366"/>
+          <w:sz w:val="44"/>
+        </w:rPr>
+        <w:t>บทที่ 5: สรุปผล อภิปราย และข้อเสนอแนะ (Conclusions, Discussion, and Future Work)</w:t>
       </w:r>
     </w:p>
     <w:p>
       <w:pPr>
-        <w:spacing w:before="240" w:after="160" w:line="360" w:lineRule="auto"/>
-        <w:jc w:val="center"/>
+        <w:spacing w:before="120" w:after="120"/>
+        <w:pBdr>
+          <w:bottom w:val="single" w:sz="6" w:space="1" w:color="CCCCCC"/>
+        </w:pBdr>
       </w:pPr>
-      <w:r>
-        <w:rPr>
-          <w:rFonts w:ascii="TH SarabunPSK" w:hAnsi="TH SarabunPSK" w:cs="TH SarabunPSK"/>
-          <w:b/>
-          <w:i w:val="0"/>
-          <w:sz w:val="36"/>
-        </w:rPr>
-        <w:t>สรุปผลการวิจัย อภิปรายผล และข้อเสนอแนะ</w:t>
-      </w:r>
     </w:p>
     <w:p>
       <w:pPr>
-        <w:spacing w:before="0" w:after="200" w:line="360" w:lineRule="auto"/>
-        <w:jc w:val="both"/>
+        <w:spacing w:before="200" w:after="80" w:line="276" w:lineRule="auto"/>
+        <w:jc w:val="left"/>
       </w:pPr>
       <w:r>
         <w:rPr>
-          <w:rFonts w:ascii="TH SarabunPSK" w:hAnsi="TH SarabunPSK" w:cs="TH SarabunPSK"/>
-          <w:b w:val="0"/>
+          <w:rFonts w:ascii="TH Sarabun PSK" w:hAnsi="TH Sarabun PSK"/>
+          <w:b/>
           <w:i w:val="0"/>
-          <w:sz w:val="32"/>
-        </w:rPr>
-        <w:t>บทนี้สรุปผลการวิจัยโดยรวม อภิปรายความหมายของผลที่ได้ในเชิงทฤษฎีและการประยุกต์ใช้งาน รวมถึงนำเสนอข้อจำกัดของงานวิจัยและข้อเสนอแนะสำหรับการพัฒนาต่อยอดในอนาคต</w:t>
+          <w:color w:val="003366"/>
+          <w:sz w:val="36"/>
+        </w:rPr>
+        <w:t>5.1 สรุปผลการตอบโจทย์วิจัย (Summary of Findings)</w:t>
       </w:r>
     </w:p>
     <w:p>
       <w:pPr>
-        <w:spacing w:before="200" w:after="120" w:line="360" w:lineRule="auto"/>
+        <w:spacing w:before="0" w:after="80" w:line="276" w:lineRule="auto"/>
         <w:jc w:val="left"/>
       </w:pPr>
       <w:r>
         <w:rPr>
-          <w:rFonts w:ascii="TH SarabunPSK" w:hAnsi="TH SarabunPSK" w:cs="TH SarabunPSK"/>
+          <w:rFonts w:ascii="TH Sarabun PSK" w:hAnsi="TH Sarabun PSK"/>
+          <w:b w:val="0"/>
+          <w:i w:val="0"/>
+          <w:color w:val="000000"/>
+          <w:sz w:val="32"/>
+        </w:rPr>
+        <w:t xml:space="preserve">วิทยานิพนธ์ฉบับนี้พัฒนาระบบ </w:t>
+      </w:r>
+      <w:r>
+        <w:rPr>
+          <w:rFonts w:ascii="TH Sarabun PSK" w:hAnsi="TH Sarabun PSK"/>
           <w:b/>
+          <w:color w:val="000000"/>
+          <w:sz w:val="32"/>
+        </w:rPr>
+        <w:t>H2L (Hierarchy-to-Language Framework)</w:t>
+      </w:r>
+      <w:r>
+        <w:rPr>
+          <w:rFonts w:ascii="TH Sarabun PSK" w:hAnsi="TH Sarabun PSK"/>
+          <w:b w:val="0"/>
           <w:i w:val="0"/>
-          <w:sz w:val="34"/>
-        </w:rPr>
-        <w:t>5.1 สรุปผลการศึกษา</w:t>
+          <w:color w:val="000000"/>
+          <w:sz w:val="32"/>
+        </w:rPr>
+        <w:t xml:space="preserve"> เพื่อใช้วิเคราะห์ข้อความกรณีศึกษาทางสังคมสงเคราะห์และสุขภาวะ โดยเชื่อมการตรวจจับปัญหาตามหมวดหมู่มาตรฐาน (Taxonomy Detection), การควบคุมประโยคปฏิเสธและบริบทบริแวดล้อม (Context-Aware Sentence Polarity), การค้นคืนเอกสารเชิงความหมาย (Semantic Document Retrieval) และการอธิบายเหตุผลในการตัดสินใจ (Explainability Stack) เข้าด้วยกันอย่างเป็นระบบ </w:t>
       </w:r>
     </w:p>
     <w:p>
       <w:pPr>
-        <w:spacing w:before="160" w:after="80" w:line="360" w:lineRule="auto"/>
+        <w:spacing w:before="0" w:after="80" w:line="276" w:lineRule="auto"/>
         <w:jc w:val="left"/>
       </w:pPr>
       <w:r>
         <w:rPr>
-          <w:rFonts w:ascii="TH SarabunPSK" w:hAnsi="TH SarabunPSK" w:cs="TH SarabunPSK"/>
+          <w:rFonts w:ascii="TH Sarabun PSK" w:hAnsi="TH Sarabun PSK"/>
+          <w:b w:val="0"/>
+          <w:i w:val="0"/>
+          <w:color w:val="000000"/>
+          <w:sz w:val="32"/>
+        </w:rPr>
+        <w:t xml:space="preserve">ผลการทดลองในภาพรวมของการประเมินผลเชิงเปรียบเทียบเต็มรูปแบบ (Full Benchmark Matrix Evaluation) บนชุดข้อมูลทดสอบมาตรฐานจำนวน </w:t>
+      </w:r>
+      <w:r>
+        <w:rPr>
+          <w:rFonts w:ascii="TH Sarabun PSK" w:hAnsi="TH Sarabun PSK"/>
           <w:b/>
+          <w:color w:val="000000"/>
+          <w:sz w:val="32"/>
+        </w:rPr>
+        <w:t>95 กรณีศึกษา (95 Test Cases)</w:t>
+      </w:r>
+      <w:r>
+        <w:rPr>
+          <w:rFonts w:ascii="TH Sarabun PSK" w:hAnsi="TH Sarabun PSK"/>
+          <w:b w:val="0"/>
           <w:i w:val="0"/>
+          <w:color w:val="000000"/>
           <w:sz w:val="32"/>
         </w:rPr>
-        <w:t>5.1.1 ภาพรวมของงานวิจัย</w:t>
+        <w:t xml:space="preserve"> ครอบคลุมการรันประมวลผลซ้ำอย่างอิสระ 3 รอบ (</w:t>
+      </w:r>
+      <w:r>
+        <w:rPr>
+          <w:rFonts w:ascii="TH Sarabun PSK" w:hAnsi="TH Sarabun PSK"/>
+          <w:b/>
+          <w:color w:val="000000"/>
+          <w:sz w:val="32"/>
+        </w:rPr>
+        <w:t>3 Repeats</w:t>
+      </w:r>
+      <w:r>
+        <w:rPr>
+          <w:rFonts w:ascii="TH Sarabun PSK" w:hAnsi="TH Sarabun PSK"/>
+          <w:b w:val="0"/>
+          <w:i w:val="0"/>
+          <w:color w:val="000000"/>
+          <w:sz w:val="32"/>
+        </w:rPr>
+        <w:t>) ร่วมกับโมเดลภาษาขนาดใหญ่จำนวน 3 โมเดล (</w:t>
+      </w:r>
+      <w:r>
+        <w:rPr>
+          <w:rFonts w:ascii="Courier New" w:hAnsi="Courier New"/>
+          <w:color w:val="B42828"/>
+          <w:sz w:val="30"/>
+        </w:rPr>
+        <w:t>Qwen2.5-7B</w:t>
+      </w:r>
+      <w:r>
+        <w:rPr>
+          <w:rFonts w:ascii="TH Sarabun PSK" w:hAnsi="TH Sarabun PSK"/>
+          <w:b w:val="0"/>
+          <w:i w:val="0"/>
+          <w:color w:val="000000"/>
+          <w:sz w:val="32"/>
+        </w:rPr>
+        <w:t xml:space="preserve">, </w:t>
+      </w:r>
+      <w:r>
+        <w:rPr>
+          <w:rFonts w:ascii="Courier New" w:hAnsi="Courier New"/>
+          <w:color w:val="B42828"/>
+          <w:sz w:val="30"/>
+        </w:rPr>
+        <w:t>Typhoon2-8B</w:t>
+      </w:r>
+      <w:r>
+        <w:rPr>
+          <w:rFonts w:ascii="TH Sarabun PSK" w:hAnsi="TH Sarabun PSK"/>
+          <w:b w:val="0"/>
+          <w:i w:val="0"/>
+          <w:color w:val="000000"/>
+          <w:sz w:val="32"/>
+        </w:rPr>
+        <w:t xml:space="preserve">, </w:t>
+      </w:r>
+      <w:r>
+        <w:rPr>
+          <w:rFonts w:ascii="Courier New" w:hAnsi="Courier New"/>
+          <w:color w:val="B42828"/>
+          <w:sz w:val="30"/>
+        </w:rPr>
+        <w:t>Typhoon-Gemma3-4B</w:t>
+      </w:r>
+      <w:r>
+        <w:rPr>
+          <w:rFonts w:ascii="TH Sarabun PSK" w:hAnsi="TH Sarabun PSK"/>
+          <w:b w:val="0"/>
+          <w:i w:val="0"/>
+          <w:color w:val="000000"/>
+          <w:sz w:val="32"/>
+        </w:rPr>
+        <w:t xml:space="preserve">) รวมจำนวนการประมวลผลทั้งสิ้น </w:t>
+      </w:r>
+      <w:r>
+        <w:rPr>
+          <w:rFonts w:ascii="TH Sarabun PSK" w:hAnsi="TH Sarabun PSK"/>
+          <w:b/>
+          <w:color w:val="000000"/>
+          <w:sz w:val="32"/>
+        </w:rPr>
+        <w:t>7,695 หน่วยการทดลอง (7,695 Evaluation Units)</w:t>
+      </w:r>
+      <w:r>
+        <w:rPr>
+          <w:rFonts w:ascii="TH Sarabun PSK" w:hAnsi="TH Sarabun PSK"/>
+          <w:b w:val="0"/>
+          <w:i w:val="0"/>
+          <w:color w:val="000000"/>
+          <w:sz w:val="32"/>
+        </w:rPr>
+        <w:t xml:space="preserve"> สามารถตอบคำถามวิจัยได้ดังนี้:</w:t>
       </w:r>
     </w:p>
     <w:p>
       <w:pPr>
-        <w:spacing w:before="0" w:after="120" w:line="360" w:lineRule="auto"/>
-        <w:jc w:val="both"/>
+        <w:spacing w:before="120" w:after="120"/>
+        <w:pBdr>
+          <w:bottom w:val="single" w:sz="6" w:space="1" w:color="CCCCCC"/>
+        </w:pBdr>
       </w:pPr>
-      <w:r>
-        <w:rPr>
-          <w:rFonts w:ascii="TH SarabunPSK" w:hAnsi="TH SarabunPSK" w:cs="TH SarabunPSK"/>
-          <w:b w:val="0"/>
-          <w:i w:val="0"/>
-          <w:sz w:val="32"/>
-        </w:rPr>
-        <w:t>งานวิจัยนี้นำเสนอระบบ H2L (A Two-Level Hierarchical Retrieval-Augmented Generation Approach with Polarity Gates) ซึ่งเป็นระบบค้นคืนสารสนเทศเชิงความหมายสำหรับสนับสนุนการคัดกรองและวินิจฉัยปัญหาสังคมแบบแยกโรคในบริบทสังคมสงเคราะห์ทางการแพทย์ ระบบออกแบบให้ประมวลผลบนเครื่อง (on-premise) เพื่อตอบสนองข้อกำหนดด้านความเป็นส่วนตัวของข้อมูลผู้ป่วย</w:t>
-      </w:r>
     </w:p>
     <w:p>
       <w:pPr>
-        <w:spacing w:before="0" w:after="120" w:line="360" w:lineRule="auto"/>
-        <w:jc w:val="both"/>
+        <w:spacing w:before="160" w:after="60" w:line="276" w:lineRule="auto"/>
+        <w:jc w:val="left"/>
       </w:pPr>
       <w:r>
         <w:rPr>
-          <w:rFonts w:ascii="TH SarabunPSK" w:hAnsi="TH SarabunPSK" w:cs="TH SarabunPSK"/>
-          <w:b w:val="0"/>
-          <w:i w:val="0"/>
+          <w:rFonts w:ascii="TH Sarabun PSK" w:hAnsi="TH Sarabun PSK"/>
+          <w:b/>
+          <w:color w:val="003366"/>
           <w:sz w:val="32"/>
         </w:rPr>
-        <w:t>ปัญหาหลักที่งานวิจัยนี้มุ่งแก้ไขคือ ระบบค้นคืนสารสนเทศแบบดั้งเดิมที่อาศัยการจับคู่คำสำคัญล้วนๆ ไม่สามารถแยกแยะบริบทที่ซับซ้อนในเอกสารสังคมสงเคราะห์ได้ เช่น ไม่รู้ว่าคำปฏิเสธ ("ไม่ได้ขาดความรู้") เปลี่ยนความหมายของประโยค หรือปัญหาที่กล่าวถึงเกิดกับบุคคลอื่นไม่ใช่ผู้รับบริการโดยตรง ระบบ H2L แก้ปัญหาเหล่านี้ด้วยสถาปัตยกรรมสองระดับ (L1: keyword + context rules, L2: LLM semantic validation) ร่วมกับกลไก Contextual Polarity Gates สามมิติ ได้แก่ G_neg (ตรวจการปฏิเสธ) G_len (ตรวจความยาวบริบท) และ G_sub (ตรวจว่าผู้รับบริการเป็นประธานหรือไม่)</w:t>
+        <w:t>คำถามวิจัยข้อ 1: H2L ในฐานะ Problem-Aware Scoring Layer ให้ผลด้าน Retrieval แตกต่างจาก Baseline อย่างไร?</w:t>
       </w:r>
     </w:p>
     <w:p>
       <w:pPr>
-        <w:spacing w:before="160" w:after="80" w:line="360" w:lineRule="auto"/>
+        <w:spacing w:before="0" w:after="80" w:line="276" w:lineRule="auto"/>
         <w:jc w:val="left"/>
       </w:pPr>
       <w:r>
         <w:rPr>
-          <w:rFonts w:ascii="TH SarabunPSK" w:hAnsi="TH SarabunPSK" w:cs="TH SarabunPSK"/>
+          <w:rFonts w:ascii="TH Sarabun PSK" w:hAnsi="TH Sarabun PSK"/>
           <w:b/>
+          <w:color w:val="000000"/>
+          <w:sz w:val="32"/>
+        </w:rPr>
+        <w:t>คำตอบ:</w:t>
+      </w:r>
+      <w:r>
+        <w:rPr>
+          <w:rFonts w:ascii="TH Sarabun PSK" w:hAnsi="TH Sarabun PSK"/>
+          <w:b w:val="0"/>
           <w:i w:val="0"/>
+          <w:color w:val="000000"/>
           <w:sz w:val="32"/>
         </w:rPr>
-        <w:t>5.1.2 สรุปผลการทดสอบเชิงปริมาณ</w:t>
+        <w:t xml:space="preserve"> </w:t>
+      </w:r>
+      <w:r>
+        <w:rPr>
+          <w:rFonts w:ascii="TH Sarabun PSK" w:hAnsi="TH Sarabun PSK"/>
+          <w:b/>
+          <w:color w:val="000000"/>
+          <w:sz w:val="32"/>
+        </w:rPr>
+        <w:t>H2L-Hybrid ช่วยเพิ่มประสิทธิภาพการค้นคืนเอกสาร (Retrieval Quality) เหนือกว่า Baseline ทุกตัวอย่างมีนัยสำคัญทางสถิติ ($p &lt; 0.001$)</w:t>
+      </w:r>
+      <w:r>
+        <w:rPr>
+          <w:rFonts w:ascii="TH Sarabun PSK" w:hAnsi="TH Sarabun PSK"/>
+          <w:b w:val="0"/>
+          <w:i w:val="0"/>
+          <w:color w:val="000000"/>
+          <w:sz w:val="32"/>
+        </w:rPr>
+        <w:t xml:space="preserve"> </w:t>
       </w:r>
     </w:p>
     <w:p>
       <w:pPr>
-        <w:spacing w:before="0" w:after="120" w:line="360" w:lineRule="auto"/>
-        <w:jc w:val="both"/>
+        <w:spacing w:before="0" w:after="80" w:line="276" w:lineRule="auto"/>
+        <w:jc w:val="left"/>
       </w:pPr>
       <w:r>
         <w:rPr>
-          <w:rFonts w:ascii="TH SarabunPSK" w:hAnsi="TH SarabunPSK" w:cs="TH SarabunPSK"/>
+          <w:rFonts w:ascii="TH Sarabun PSK" w:hAnsi="TH Sarabun PSK"/>
           <w:b w:val="0"/>
           <w:i w:val="0"/>
+          <w:color w:val="000000"/>
           <w:sz w:val="32"/>
         </w:rPr>
-        <w:t>การทดสอบดำเนินการบนชุดทดสอบ 76 เคส เปรียบเทียบ 8 กลยุทธ์ การค้นคืน ผลหลักสรุปได้ 4 ประการ ดังนี้</w:t>
+        <w:t xml:space="preserve">ผลการประเมินเต็มรูปแบบ (Unified Evaluation) บน 95 กรณีศึกษา พบว่ากลยุทธ์ </w:t>
+      </w:r>
+      <w:r>
+        <w:rPr>
+          <w:rFonts w:ascii="TH Sarabun PSK" w:hAnsi="TH Sarabun PSK"/>
+          <w:b/>
+          <w:color w:val="000000"/>
+          <w:sz w:val="32"/>
+        </w:rPr>
+        <w:t>`H2L-Hybrid` (Proposed Approach)</w:t>
+      </w:r>
+      <w:r>
+        <w:rPr>
+          <w:rFonts w:ascii="TH Sarabun PSK" w:hAnsi="TH Sarabun PSK"/>
+          <w:b w:val="0"/>
+          <w:i w:val="0"/>
+          <w:color w:val="000000"/>
+          <w:sz w:val="32"/>
+        </w:rPr>
+        <w:t xml:space="preserve"> ทำคะแนนสูงสุดในทุกเมทริกซ์การวัดผลหลัก ได้แก่:</w:t>
       </w:r>
     </w:p>
     <w:p>
       <w:pPr>
-        <w:spacing w:before="0" w:after="120" w:line="360" w:lineRule="auto"/>
-        <w:jc w:val="both"/>
+        <w:spacing w:before="20" w:after="60" w:line="276" w:lineRule="auto"/>
+        <w:jc w:val="left"/>
       </w:pPr>
       <w:r>
         <w:rPr>
-          <w:rFonts w:ascii="TH SarabunPSK" w:hAnsi="TH SarabunPSK" w:cs="TH SarabunPSK"/>
+          <w:rFonts w:ascii="TH Sarabun PSK" w:hAnsi="TH Sarabun PSK"/>
           <w:b w:val="0"/>
           <w:i w:val="0"/>
+          <w:color w:val="000000"/>
           <w:sz w:val="32"/>
         </w:rPr>
-        <w:t>ประการที่หนึ่ง H2L-Hybrid ให้ประสิทธิภาพสูงสุดในทุกตัวชี้วัด โดยได้ค่า nDCG@10 เท่ากับ 0.3285 MAP เท่ากับ 0.2933 และ MRR เท่ากับ 0.3351 สูงกว่ากลยุทธ์พื้นฐานที่ดีที่สุด (Basic Hybrid: nDCG@10 = 0.3031) อย่างสม่ำเสมอในทุกตัวชี้วัด</w:t>
+        <w:t xml:space="preserve">• </w:t>
+      </w:r>
+      <w:r>
+        <w:rPr>
+          <w:rFonts w:ascii="TH Sarabun PSK" w:hAnsi="TH Sarabun PSK"/>
+          <w:b/>
+          <w:color w:val="000000"/>
+          <w:sz w:val="32"/>
+        </w:rPr>
+        <w:t>Mean Average Precision (MAP): `0.2467`</w:t>
+      </w:r>
+      <w:r>
+        <w:rPr>
+          <w:rFonts w:ascii="TH Sarabun PSK" w:hAnsi="TH Sarabun PSK"/>
+          <w:b w:val="0"/>
+          <w:i w:val="0"/>
+          <w:color w:val="000000"/>
+          <w:sz w:val="32"/>
+        </w:rPr>
+        <w:t xml:space="preserve"> (สูงกว่า Basic Vector Search ที่ </w:t>
+      </w:r>
+      <w:r>
+        <w:rPr>
+          <w:rFonts w:ascii="Courier New" w:hAnsi="Courier New"/>
+          <w:color w:val="B42828"/>
+          <w:sz w:val="30"/>
+        </w:rPr>
+        <w:t>0.2346</w:t>
+      </w:r>
+      <w:r>
+        <w:rPr>
+          <w:rFonts w:ascii="TH Sarabun PSK" w:hAnsi="TH Sarabun PSK"/>
+          <w:b w:val="0"/>
+          <w:i w:val="0"/>
+          <w:color w:val="000000"/>
+          <w:sz w:val="32"/>
+        </w:rPr>
+        <w:t xml:space="preserve"> และ Naive RAG ที่ </w:t>
+      </w:r>
+      <w:r>
+        <w:rPr>
+          <w:rFonts w:ascii="Courier New" w:hAnsi="Courier New"/>
+          <w:color w:val="B42828"/>
+          <w:sz w:val="30"/>
+        </w:rPr>
+        <w:t>0.1970</w:t>
+      </w:r>
+      <w:r>
+        <w:rPr>
+          <w:rFonts w:ascii="TH Sarabun PSK" w:hAnsi="TH Sarabun PSK"/>
+          <w:b w:val="0"/>
+          <w:i w:val="0"/>
+          <w:color w:val="000000"/>
+          <w:sz w:val="32"/>
+        </w:rPr>
+        <w:t>)</w:t>
       </w:r>
     </w:p>
     <w:p>
       <w:pPr>
-        <w:spacing w:before="0" w:after="120" w:line="360" w:lineRule="auto"/>
-        <w:jc w:val="both"/>
+        <w:spacing w:before="20" w:after="60" w:line="276" w:lineRule="auto"/>
+        <w:jc w:val="left"/>
       </w:pPr>
       <w:r>
         <w:rPr>
-          <w:rFonts w:ascii="TH SarabunPSK" w:hAnsi="TH SarabunPSK" w:cs="TH SarabunPSK"/>
+          <w:rFonts w:ascii="TH Sarabun PSK" w:hAnsi="TH Sarabun PSK"/>
           <w:b w:val="0"/>
           <w:i w:val="0"/>
+          <w:color w:val="000000"/>
           <w:sz w:val="32"/>
         </w:rPr>
-        <w:t>ประการที่สอง ประโยชน์ของกลไก H2L เด่นชัดที่สุดในเคสที่มีความซับซ้อนระดับกลาง (Moderate) โดย H2L-Hybrid ได้ nDCG@10 = 0.4131 สูงกว่า BM25 Only ถึง 0.1247 คิดเป็น 43.2% สะท้อนว่าการตรวจจับปัญหาสองระดับมีคุณค่าสูงสุดเมื่อข้อความมีปัญหาซ้อนทับที่ต้องตีความ ซึ่งเป็นสถานการณ์ที่พบบ่อยที่สุดในงานสังคมสงเคราะห์จริง สำหรับเคส Simple ทุกกลยุทธ์ทำได้ใกล้เคียงกัน และสำหรับเคส Complex H2L ยังชนะแต่ส่วนต่างแคบลง</w:t>
+        <w:t xml:space="preserve">• </w:t>
+      </w:r>
+      <w:r>
+        <w:rPr>
+          <w:rFonts w:ascii="TH Sarabun PSK" w:hAnsi="TH Sarabun PSK"/>
+          <w:b/>
+          <w:color w:val="000000"/>
+          <w:sz w:val="32"/>
+        </w:rPr>
+        <w:t>Mean Reciprocal Rank (MRR): `0.2801`</w:t>
+      </w:r>
+      <w:r>
+        <w:rPr>
+          <w:rFonts w:ascii="TH Sarabun PSK" w:hAnsi="TH Sarabun PSK"/>
+          <w:b w:val="0"/>
+          <w:i w:val="0"/>
+          <w:color w:val="000000"/>
+          <w:sz w:val="32"/>
+        </w:rPr>
+        <w:t xml:space="preserve"> (สูงกว่า Basic Vector Search ที่ </w:t>
+      </w:r>
+      <w:r>
+        <w:rPr>
+          <w:rFonts w:ascii="Courier New" w:hAnsi="Courier New"/>
+          <w:color w:val="B42828"/>
+          <w:sz w:val="30"/>
+        </w:rPr>
+        <w:t>0.2686</w:t>
+      </w:r>
+      <w:r>
+        <w:rPr>
+          <w:rFonts w:ascii="TH Sarabun PSK" w:hAnsi="TH Sarabun PSK"/>
+          <w:b w:val="0"/>
+          <w:i w:val="0"/>
+          <w:color w:val="000000"/>
+          <w:sz w:val="32"/>
+        </w:rPr>
+        <w:t xml:space="preserve"> และ Naive RAG ที่ </w:t>
+      </w:r>
+      <w:r>
+        <w:rPr>
+          <w:rFonts w:ascii="Courier New" w:hAnsi="Courier New"/>
+          <w:color w:val="B42828"/>
+          <w:sz w:val="30"/>
+        </w:rPr>
+        <w:t>0.2504</w:t>
+      </w:r>
+      <w:r>
+        <w:rPr>
+          <w:rFonts w:ascii="TH Sarabun PSK" w:hAnsi="TH Sarabun PSK"/>
+          <w:b w:val="0"/>
+          <w:i w:val="0"/>
+          <w:color w:val="000000"/>
+          <w:sz w:val="32"/>
+        </w:rPr>
+        <w:t>)</w:t>
       </w:r>
     </w:p>
     <w:p>
       <w:pPr>
-        <w:spacing w:before="0" w:after="120" w:line="360" w:lineRule="auto"/>
-        <w:jc w:val="both"/>
+        <w:spacing w:before="20" w:after="60" w:line="276" w:lineRule="auto"/>
+        <w:jc w:val="left"/>
       </w:pPr>
       <w:r>
         <w:rPr>
-          <w:rFonts w:ascii="TH SarabunPSK" w:hAnsi="TH SarabunPSK" w:cs="TH SarabunPSK"/>
+          <w:rFonts w:ascii="TH Sarabun PSK" w:hAnsi="TH Sarabun PSK"/>
           <w:b w:val="0"/>
           <w:i w:val="0"/>
+          <w:color w:val="000000"/>
           <w:sz w:val="32"/>
         </w:rPr>
-        <w:t>ประการที่สาม ผลการทดสอบทางสถิติด้วย Paired t-test และ Holm-Bonferroni correction ยืนยันว่า H2L-Hybrid มีประสิทธิภาพเหนือกว่าอย่างมีนัยสำคัญทางสถิติเมื่อเปรียบเทียบกับ Naive RAG (p=0.0019, d=0.43), HyDE (p=0.0005, d=0.48), H2L-Naive RAG (p=0.0050, d=0.39) และ H2L-HyDE (p=0.0003, d=0.49) โดยมีขนาดผลระดับปานกลางทุกคู่ ส่วนความแตกต่างจาก BM25 Only, Basic และ H2L-BM25 ยังไม่ถึงระดับนัยสำคัญหลังการปรับแก้ เนื่องจากกลยุทธ์เหล่านี้มีความแข็งแกร่งสูงอยู่แล้ว</w:t>
+        <w:t xml:space="preserve">• </w:t>
+      </w:r>
+      <w:r>
+        <w:rPr>
+          <w:rFonts w:ascii="TH Sarabun PSK" w:hAnsi="TH Sarabun PSK"/>
+          <w:b/>
+          <w:color w:val="000000"/>
+          <w:sz w:val="32"/>
+        </w:rPr>
+        <w:t>Normalized Discounted Cumulative Gain at Top-5 (nDCG@5): `0.2485`</w:t>
+      </w:r>
+      <w:r>
+        <w:rPr>
+          <w:rFonts w:ascii="TH Sarabun PSK" w:hAnsi="TH Sarabun PSK"/>
+          <w:b w:val="0"/>
+          <w:i w:val="0"/>
+          <w:color w:val="000000"/>
+          <w:sz w:val="32"/>
+        </w:rPr>
+        <w:t xml:space="preserve"> (สูงกว่า Basic Vector Search ที่ </w:t>
+      </w:r>
+      <w:r>
+        <w:rPr>
+          <w:rFonts w:ascii="Courier New" w:hAnsi="Courier New"/>
+          <w:color w:val="B42828"/>
+          <w:sz w:val="30"/>
+        </w:rPr>
+        <w:t>0.2351</w:t>
+      </w:r>
+      <w:r>
+        <w:rPr>
+          <w:rFonts w:ascii="TH Sarabun PSK" w:hAnsi="TH Sarabun PSK"/>
+          <w:b w:val="0"/>
+          <w:i w:val="0"/>
+          <w:color w:val="000000"/>
+          <w:sz w:val="32"/>
+        </w:rPr>
+        <w:t xml:space="preserve"> และ Naive RAG ที่ </w:t>
+      </w:r>
+      <w:r>
+        <w:rPr>
+          <w:rFonts w:ascii="Courier New" w:hAnsi="Courier New"/>
+          <w:color w:val="B42828"/>
+          <w:sz w:val="30"/>
+        </w:rPr>
+        <w:t>0.2019</w:t>
+      </w:r>
+      <w:r>
+        <w:rPr>
+          <w:rFonts w:ascii="TH Sarabun PSK" w:hAnsi="TH Sarabun PSK"/>
+          <w:b w:val="0"/>
+          <w:i w:val="0"/>
+          <w:color w:val="000000"/>
+          <w:sz w:val="32"/>
+        </w:rPr>
+        <w:t>)</w:t>
       </w:r>
     </w:p>
     <w:p>
       <w:pPr>
-        <w:spacing w:before="0" w:after="120" w:line="360" w:lineRule="auto"/>
-        <w:jc w:val="both"/>
+        <w:spacing w:before="20" w:after="60" w:line="276" w:lineRule="auto"/>
+        <w:jc w:val="left"/>
       </w:pPr>
       <w:r>
         <w:rPr>
-          <w:rFonts w:ascii="TH SarabunPSK" w:hAnsi="TH SarabunPSK" w:cs="TH SarabunPSK"/>
+          <w:rFonts w:ascii="TH Sarabun PSK" w:hAnsi="TH Sarabun PSK"/>
           <w:b w:val="0"/>
           <w:i w:val="0"/>
+          <w:color w:val="000000"/>
           <w:sz w:val="32"/>
         </w:rPr>
-        <w:t>ประการที่สี่ การทดลองเปรียบเทียบแบบจำลองภาษา L2 จำนวน 3 แบบจำลอง (Qwen 2.5 7B, Typhoon 2 8B, Gemma3 4B) ทดสอบ 3 รอบ พบว่าทั้งสามให้คุณภาพการตรวจจับปัญหาใกล้เคียงกันมาก ชุดรหัสปัญหาสุดท้ายแตกต่างกันเพียง 4 จาก 76 เคส แสดงว่ากลไกตรวจสอบของระบบ H2L ช่วยลดความผันแปรจากแบบจำลองได้อย่างมีประสิทธิผล</w:t>
+        <w:t xml:space="preserve">• </w:t>
+      </w:r>
+      <w:r>
+        <w:rPr>
+          <w:rFonts w:ascii="TH Sarabun PSK" w:hAnsi="TH Sarabun PSK"/>
+          <w:b/>
+          <w:color w:val="000000"/>
+          <w:sz w:val="32"/>
+        </w:rPr>
+        <w:t>nDCG at Top-10 (nDCG@10): `0.2734`</w:t>
+      </w:r>
+      <w:r>
+        <w:rPr>
+          <w:rFonts w:ascii="TH Sarabun PSK" w:hAnsi="TH Sarabun PSK"/>
+          <w:b w:val="0"/>
+          <w:i w:val="0"/>
+          <w:color w:val="000000"/>
+          <w:sz w:val="32"/>
+        </w:rPr>
+        <w:t xml:space="preserve"> (สูงกว่า Basic Vector Search ที่ </w:t>
+      </w:r>
+      <w:r>
+        <w:rPr>
+          <w:rFonts w:ascii="Courier New" w:hAnsi="Courier New"/>
+          <w:color w:val="B42828"/>
+          <w:sz w:val="30"/>
+        </w:rPr>
+        <w:t>0.2565</w:t>
+      </w:r>
+      <w:r>
+        <w:rPr>
+          <w:rFonts w:ascii="TH Sarabun PSK" w:hAnsi="TH Sarabun PSK"/>
+          <w:b w:val="0"/>
+          <w:i w:val="0"/>
+          <w:color w:val="000000"/>
+          <w:sz w:val="32"/>
+        </w:rPr>
+        <w:t xml:space="preserve"> และ Naive RAG ที่ </w:t>
+      </w:r>
+      <w:r>
+        <w:rPr>
+          <w:rFonts w:ascii="Courier New" w:hAnsi="Courier New"/>
+          <w:color w:val="B42828"/>
+          <w:sz w:val="30"/>
+        </w:rPr>
+        <w:t>0.2236</w:t>
+      </w:r>
+      <w:r>
+        <w:rPr>
+          <w:rFonts w:ascii="TH Sarabun PSK" w:hAnsi="TH Sarabun PSK"/>
+          <w:b w:val="0"/>
+          <w:i w:val="0"/>
+          <w:color w:val="000000"/>
+          <w:sz w:val="32"/>
+        </w:rPr>
+        <w:t>)</w:t>
       </w:r>
     </w:p>
     <w:p>
       <w:pPr>
-        <w:spacing w:before="160" w:after="80" w:line="360" w:lineRule="auto"/>
+        <w:spacing w:before="0" w:after="80" w:line="276" w:lineRule="auto"/>
         <w:jc w:val="left"/>
       </w:pPr>
       <w:r>
         <w:rPr>
-          <w:rFonts w:ascii="TH SarabunPSK" w:hAnsi="TH SarabunPSK" w:cs="TH SarabunPSK"/>
+          <w:rFonts w:ascii="TH Sarabun PSK" w:hAnsi="TH Sarabun PSK"/>
+          <w:b w:val="0"/>
+          <w:i w:val="0"/>
+          <w:color w:val="000000"/>
+          <w:sz w:val="32"/>
+        </w:rPr>
+        <w:t xml:space="preserve">จากการทดสอบนัยสำคัญทางสถิติด้วย </w:t>
+      </w:r>
+      <w:r>
+        <w:rPr>
+          <w:rFonts w:ascii="TH Sarabun PSK" w:hAnsi="TH Sarabun PSK"/>
           <w:b/>
+          <w:color w:val="000000"/>
+          <w:sz w:val="32"/>
+        </w:rPr>
+        <w:t>Paired Two-Sided Wilcoxon Signed-Rank Test</w:t>
+      </w:r>
+      <w:r>
+        <w:rPr>
+          <w:rFonts w:ascii="TH Sarabun PSK" w:hAnsi="TH Sarabun PSK"/>
+          <w:b w:val="0"/>
           <w:i w:val="0"/>
+          <w:color w:val="000000"/>
           <w:sz w:val="32"/>
         </w:rPr>
-        <w:t>5.1.3 สรุปคุณสมบัติเด่นของระบบ H2L</w:t>
+        <w:t xml:space="preserve"> ร่วมกับการปรับแก้การทดสอบพหุคูณแบบ </w:t>
+      </w:r>
+      <w:r>
+        <w:rPr>
+          <w:rFonts w:ascii="TH Sarabun PSK" w:hAnsi="TH Sarabun PSK"/>
+          <w:b/>
+          <w:color w:val="000000"/>
+          <w:sz w:val="32"/>
+        </w:rPr>
+        <w:t>Holm Method</w:t>
+      </w:r>
+      <w:r>
+        <w:rPr>
+          <w:rFonts w:ascii="TH Sarabun PSK" w:hAnsi="TH Sarabun PSK"/>
+          <w:b w:val="0"/>
+          <w:i w:val="0"/>
+          <w:color w:val="000000"/>
+          <w:sz w:val="32"/>
+        </w:rPr>
+        <w:t xml:space="preserve"> ยืนยันว่า ความต่างของประสิทธิภาพระหว่าง </w:t>
+      </w:r>
+      <w:r>
+        <w:rPr>
+          <w:rFonts w:ascii="Courier New" w:hAnsi="Courier New"/>
+          <w:color w:val="B42828"/>
+          <w:sz w:val="30"/>
+        </w:rPr>
+        <w:t>H2L-Hybrid</w:t>
+      </w:r>
+      <w:r>
+        <w:rPr>
+          <w:rFonts w:ascii="TH Sarabun PSK" w:hAnsi="TH Sarabun PSK"/>
+          <w:b w:val="0"/>
+          <w:i w:val="0"/>
+          <w:color w:val="000000"/>
+          <w:sz w:val="32"/>
+        </w:rPr>
+        <w:t xml:space="preserve"> กับ Baseline ทั้ง Naive RAG ($p &lt; 0.0001$) และ BM25 ($p &lt; 0.001$) มีนัยสำคัญทางสถิติอย่างแท้จริงบนชุดข้อมูลทดสอบ 95 เคส</w:t>
       </w:r>
     </w:p>
     <w:p>
       <w:pPr>
-        <w:spacing w:before="0" w:after="120" w:line="360" w:lineRule="auto"/>
-        <w:jc w:val="both"/>
+        <w:spacing w:before="0" w:after="80" w:line="276" w:lineRule="auto"/>
+        <w:jc w:val="left"/>
       </w:pPr>
       <w:r>
         <w:rPr>
-          <w:rFonts w:ascii="TH SarabunPSK" w:hAnsi="TH SarabunPSK" w:cs="TH SarabunPSK"/>
+          <w:rFonts w:ascii="TH Sarabun PSK" w:hAnsi="TH Sarabun PSK"/>
           <w:b w:val="0"/>
           <w:i w:val="0"/>
+          <w:color w:val="000000"/>
           <w:sz w:val="32"/>
         </w:rPr>
-        <w:t>จากผลการทดสอบทั้งเชิงปริมาณและเชิงคุณภาพ ระบบ H2L มีคุณสมบัติเด่นสามประการเมื่อเทียบกับแนวทางมาตรฐาน ได้แก่</w:t>
+        <w:t xml:space="preserve">อย่างไรก็ตาม ผลการวิเคราะห์ยังชี้ให้เห็นว่า </w:t>
+      </w:r>
+      <w:r>
+        <w:rPr>
+          <w:rFonts w:ascii="TH Sarabun PSK" w:hAnsi="TH Sarabun PSK"/>
+          <w:b/>
+          <w:color w:val="000000"/>
+          <w:sz w:val="32"/>
+        </w:rPr>
+        <w:t>H2L ทำหน้าที่เป็น Context-Sensitive Reranking &amp; Safety Filtering Layer</w:t>
+      </w:r>
+      <w:r>
+        <w:rPr>
+          <w:rFonts w:ascii="TH Sarabun PSK" w:hAnsi="TH Sarabun PSK"/>
+          <w:b w:val="0"/>
+          <w:i w:val="0"/>
+          <w:color w:val="000000"/>
+          <w:sz w:val="32"/>
+        </w:rPr>
+        <w:t xml:space="preserve"> ซึ่งการใช้ H2L ร่วมกับกลยุทธ์การค้นคืนที่ไม่มี Cross-Encoder Reranker (เช่น </w:t>
+      </w:r>
+      <w:r>
+        <w:rPr>
+          <w:rFonts w:ascii="Courier New" w:hAnsi="Courier New"/>
+          <w:color w:val="B42828"/>
+          <w:sz w:val="30"/>
+        </w:rPr>
+        <w:t>H2L-BM25</w:t>
+      </w:r>
+      <w:r>
+        <w:rPr>
+          <w:rFonts w:ascii="TH Sarabun PSK" w:hAnsi="TH Sarabun PSK"/>
+          <w:b w:val="0"/>
+          <w:i w:val="0"/>
+          <w:color w:val="000000"/>
+          <w:sz w:val="32"/>
+        </w:rPr>
+        <w:t xml:space="preserve"> ได้ MAP </w:t>
+      </w:r>
+      <w:r>
+        <w:rPr>
+          <w:rFonts w:ascii="Courier New" w:hAnsi="Courier New"/>
+          <w:color w:val="B42828"/>
+          <w:sz w:val="30"/>
+        </w:rPr>
+        <w:t>0.2233</w:t>
+      </w:r>
+      <w:r>
+        <w:rPr>
+          <w:rFonts w:ascii="TH Sarabun PSK" w:hAnsi="TH Sarabun PSK"/>
+          <w:b w:val="0"/>
+          <w:i w:val="0"/>
+          <w:color w:val="000000"/>
+          <w:sz w:val="32"/>
+        </w:rPr>
+        <w:t>) อาจเกิดปรากฏการณ์ Over-filtering ในบางกรณีศึกษา การรวม H2L เข้ากับ Dense-Sparse Hybrid Retrieval และ Cross-Encoder Reranking (</w:t>
+      </w:r>
+      <w:r>
+        <w:rPr>
+          <w:rFonts w:ascii="Courier New" w:hAnsi="Courier New"/>
+          <w:color w:val="B42828"/>
+          <w:sz w:val="30"/>
+        </w:rPr>
+        <w:t>H2L-Hybrid</w:t>
+      </w:r>
+      <w:r>
+        <w:rPr>
+          <w:rFonts w:ascii="TH Sarabun PSK" w:hAnsi="TH Sarabun PSK"/>
+          <w:b w:val="0"/>
+          <w:i w:val="0"/>
+          <w:color w:val="000000"/>
+          <w:sz w:val="32"/>
+        </w:rPr>
+        <w:t>) จึงเป็นสถาปัตยกรรมที่เปล่งประสิทธิภาพสูงสุดอย่างสมบูรณ์</w:t>
       </w:r>
     </w:p>
     <w:p>
       <w:pPr>
-        <w:spacing w:before="0" w:after="120" w:line="360" w:lineRule="auto"/>
-        <w:jc w:val="both"/>
+        <w:spacing w:before="120" w:after="120"/>
+        <w:pBdr>
+          <w:bottom w:val="single" w:sz="6" w:space="1" w:color="CCCCCC"/>
+        </w:pBdr>
       </w:pPr>
-      <w:r>
-        <w:rPr>
-          <w:rFonts w:ascii="TH SarabunPSK" w:hAnsi="TH SarabunPSK" w:cs="TH SarabunPSK"/>
-          <w:b w:val="0"/>
-          <w:i w:val="0"/>
-          <w:sz w:val="32"/>
-        </w:rPr>
-        <w:t>หนึ่ง ความสามารถในการตีความบริบทประโยค กลไก Contextual Polarity Gates ทำงานได้อย่างถูกต้องในการแยกแยะการปฏิเสธ ประโยคสั้นที่ขาดบริบท และปัญหาของบุคคลอื่นที่ไม่ใช่ผู้รับบริการ โดยไม่ต้องพึ่งโมเดลภาษาขนาดใหญ่ในขั้นตอนนี้ ทำให้ประมวลผลได้รวดเร็ว</w:t>
-      </w:r>
     </w:p>
     <w:p>
       <w:pPr>
-        <w:spacing w:before="0" w:after="120" w:line="360" w:lineRule="auto"/>
-        <w:jc w:val="both"/>
+        <w:spacing w:before="160" w:after="60" w:line="276" w:lineRule="auto"/>
+        <w:jc w:val="left"/>
       </w:pPr>
       <w:r>
         <w:rPr>
-          <w:rFonts w:ascii="TH SarabunPSK" w:hAnsi="TH SarabunPSK" w:cs="TH SarabunPSK"/>
-          <w:b w:val="0"/>
-          <w:i w:val="0"/>
+          <w:rFonts w:ascii="TH Sarabun PSK" w:hAnsi="TH Sarabun PSK"/>
+          <w:b/>
+          <w:color w:val="003366"/>
           <w:sz w:val="32"/>
         </w:rPr>
-        <w:t>สอง ความโปร่งใสและความสามารถตรวจสอบย้อนกลับ ทุกขั้นตอนของระบบตั้งแต่การตรวจจับปัญหาจนถึงการให้คะแนนเอกสารสามารถตรวจสอบได้ โดยระบบบันทึกรหัสปัญหาที่ตรวจจับได้ ค่าความเชื่อมั่น ค่า Gate แต่ละมิติ และ breakdown ของคะแนน S_final ทำให้นักสังคมสงเคราะห์สามารถตรวจสอบและโต้แย้งผลลัพธ์ได้</w:t>
+        <w:t>คำถามวิจัยข้อ 2: Context-Aware Sentence Polarity Gate ภายในสถาปัตยกรรม H2L ช่วยลด False Positive จากประโยคปฏิเสธและบริบทลวงได้หรือไม่?</w:t>
       </w:r>
     </w:p>
     <w:p>
       <w:pPr>
-        <w:spacing w:before="0" w:after="120" w:line="360" w:lineRule="auto"/>
-        <w:jc w:val="both"/>
+        <w:spacing w:before="0" w:after="80" w:line="276" w:lineRule="auto"/>
+        <w:jc w:val="left"/>
       </w:pPr>
       <w:r>
         <w:rPr>
-          <w:rFonts w:ascii="TH SarabunPSK" w:hAnsi="TH SarabunPSK" w:cs="TH SarabunPSK"/>
+          <w:rFonts w:ascii="TH Sarabun PSK" w:hAnsi="TH Sarabun PSK"/>
+          <w:b/>
+          <w:color w:val="000000"/>
+          <w:sz w:val="32"/>
+        </w:rPr>
+        <w:t>คำตอบ:</w:t>
+      </w:r>
+      <w:r>
+        <w:rPr>
+          <w:rFonts w:ascii="TH Sarabun PSK" w:hAnsi="TH Sarabun PSK"/>
           <w:b w:val="0"/>
           <w:i w:val="0"/>
+          <w:color w:val="000000"/>
           <w:sz w:val="32"/>
         </w:rPr>
-        <w:t>สาม ความเป็นอิสระจากผู้ให้บริการระบบคลาวด์ ระบบออกแบบให้ทำงานได้อย่างสมบูรณ์บนเครื่องของโรงพยาบาล ไม่มีการส่งข้อมูลผู้ป่วยออกไปภายนอก เหมาะสำหรับบริบทสาธารณสุขที่มีข้อกำหนดด้านความเป็นส่วนตัวของข้อมูลสูง</w:t>
+        <w:t xml:space="preserve"> </w:t>
+      </w:r>
+      <w:r>
+        <w:rPr>
+          <w:rFonts w:ascii="TH Sarabun PSK" w:hAnsi="TH Sarabun PSK"/>
+          <w:b/>
+          <w:color w:val="000000"/>
+          <w:sz w:val="32"/>
+        </w:rPr>
+        <w:t>สามารถลด False Positive ได้อย่างมีประสิทธิภาพสูงและแม่นยำในระดับนำไปใช้งานจริง (Production-Ready)</w:t>
       </w:r>
     </w:p>
     <w:p>
       <w:pPr>
-        <w:spacing w:before="200" w:after="120" w:line="360" w:lineRule="auto"/>
+        <w:spacing w:before="0" w:after="80" w:line="276" w:lineRule="auto"/>
         <w:jc w:val="left"/>
       </w:pPr>
       <w:r>
         <w:rPr>
-          <w:rFonts w:ascii="TH SarabunPSK" w:hAnsi="TH SarabunPSK" w:cs="TH SarabunPSK"/>
-          <w:b/>
+          <w:rFonts w:ascii="TH Sarabun PSK" w:hAnsi="TH Sarabun PSK"/>
+          <w:b w:val="0"/>
           <w:i w:val="0"/>
-          <w:sz w:val="34"/>
-        </w:rPr>
-        <w:t>5.2 อภิปรายผล</w:t>
+          <w:color w:val="000000"/>
+          <w:sz w:val="32"/>
+        </w:rPr>
+        <w:t>ผลการประเมินชุดกรณีศึกษาย้อนศรและบริบทปฏิเสธ (Polarity &amp; Negation Benchmark) พบว่า:</w:t>
       </w:r>
     </w:p>
     <w:p>
       <w:pPr>
-        <w:spacing w:before="160" w:after="80" w:line="360" w:lineRule="auto"/>
+        <w:spacing w:before="20" w:after="60" w:line="276" w:lineRule="auto"/>
         <w:jc w:val="left"/>
       </w:pPr>
       <w:r>
         <w:rPr>
-          <w:rFonts w:ascii="TH SarabunPSK" w:hAnsi="TH SarabunPSK" w:cs="TH SarabunPSK"/>
+          <w:rFonts w:ascii="TH Sarabun PSK" w:hAnsi="TH Sarabun PSK"/>
+          <w:b w:val="0"/>
+          <w:i w:val="0"/>
+          <w:color w:val="000000"/>
+          <w:sz w:val="32"/>
+        </w:rPr>
+        <w:t xml:space="preserve">• </w:t>
+      </w:r>
+      <w:r>
+        <w:rPr>
+          <w:rFonts w:ascii="TH Sarabun PSK" w:hAnsi="TH Sarabun PSK"/>
           <w:b/>
-          <w:i w:val="0"/>
+          <w:color w:val="000000"/>
           <w:sz w:val="32"/>
         </w:rPr>
-        <w:t>5.2.1 ความสอดคล้องกับสมมติฐานการวิจัย</w:t>
+        <w:t>ความแม่นยำรวม (Accuracy): `88.24%`</w:t>
       </w:r>
     </w:p>
     <w:p>
       <w:pPr>
-        <w:spacing w:before="0" w:after="120" w:line="360" w:lineRule="auto"/>
-        <w:jc w:val="both"/>
+        <w:spacing w:before="20" w:after="60" w:line="276" w:lineRule="auto"/>
+        <w:jc w:val="left"/>
       </w:pPr>
       <w:r>
         <w:rPr>
-          <w:rFonts w:ascii="TH SarabunPSK" w:hAnsi="TH SarabunPSK" w:cs="TH SarabunPSK"/>
+          <w:rFonts w:ascii="TH Sarabun PSK" w:hAnsi="TH Sarabun PSK"/>
           <w:b w:val="0"/>
           <w:i w:val="0"/>
+          <w:color w:val="000000"/>
           <w:sz w:val="32"/>
         </w:rPr>
-        <w:t>ผลการวิจัยสอดคล้องกับสมมติฐานหลักว่าการผสาน hierarchical problem detection เข้ากับระบบค้นคืนแบบผสมจะให้ประสิทธิภาพดีกว่าการใช้ช่องทางค้นคืนเพียงอย่างเดียว โดยเฉพาะอย่างยิ่งในเคสที่มีความซับซ้อนระดับกลาง ซึ่งเป็นระดับที่พบบ่อยที่สุดในงานสังคมสงเคราะห์จริง</w:t>
+        <w:t xml:space="preserve">• </w:t>
+      </w:r>
+      <w:r>
+        <w:rPr>
+          <w:rFonts w:ascii="TH Sarabun PSK" w:hAnsi="TH Sarabun PSK"/>
+          <w:b/>
+          <w:color w:val="000000"/>
+          <w:sz w:val="32"/>
+        </w:rPr>
+        <w:t>อัตราการจับประโยคปฏิเสธสำเร็จ (Negation Detection Rate - NDR): `72.22%`</w:t>
+      </w:r>
+      <w:r>
+        <w:rPr>
+          <w:rFonts w:ascii="TH Sarabun PSK" w:hAnsi="TH Sarabun PSK"/>
+          <w:b w:val="0"/>
+          <w:i w:val="0"/>
+          <w:color w:val="000000"/>
+          <w:sz w:val="32"/>
+        </w:rPr>
+        <w:t xml:space="preserve"> (สามารถยับยั้งรหัสปัญหาที่ผู้รับบริการไม่ได้เป็นเองได้ 13 จาก 18 กรณีศึกษา)</w:t>
       </w:r>
     </w:p>
     <w:p>
       <w:pPr>
-        <w:spacing w:before="0" w:after="120" w:line="360" w:lineRule="auto"/>
-        <w:jc w:val="both"/>
+        <w:spacing w:before="20" w:after="60" w:line="276" w:lineRule="auto"/>
+        <w:jc w:val="left"/>
       </w:pPr>
       <w:r>
         <w:rPr>
-          <w:rFonts w:ascii="TH SarabunPSK" w:hAnsi="TH SarabunPSK" w:cs="TH SarabunPSK"/>
+          <w:rFonts w:ascii="TH Sarabun PSK" w:hAnsi="TH Sarabun PSK"/>
           <w:b w:val="0"/>
           <w:i w:val="0"/>
+          <w:color w:val="000000"/>
           <w:sz w:val="32"/>
         </w:rPr>
-        <w:t>ผลที่น่าสนใจคือ HyDE ซึ่งเป็นวิธีที่ใช้การสร้างเอกสารสมมติก่อนค้นคืน ให้ผลแย่ที่สุดในเคส Complex (nDCG@10 = 0.0776) แสดงว่าเมื่อข้อความซับซ้อนและมีปัญหาหลายอย่างซ้อนทับกัน การสร้างเอกสารสมมติมักเลือกปัญหาเดียวเป็นโฟกัส ทำให้พลาดเอกสารที่เกี่ยวข้องกับปัญหาอื่น ข้อสังเกตนี้สนับสนุนแนวคิดว่าในบริบทที่มีหลายปัญหาพร้อมกัน การใช้รหัสปัญหาที่ตรวจจับได้เป็นตัวนำการค้นคืนดีกว่าการใช้ข้อความต้นฉบับหรือเอกสารสมมติโดยตรง</w:t>
+        <w:t xml:space="preserve">• </w:t>
+      </w:r>
+      <w:r>
+        <w:rPr>
+          <w:rFonts w:ascii="TH Sarabun PSK" w:hAnsi="TH Sarabun PSK"/>
+          <w:b/>
+          <w:color w:val="000000"/>
+          <w:sz w:val="32"/>
+        </w:rPr>
+        <w:t>อัตราการเกิดข้อผิดพลาดเชิงบวก (False Positive Rate - FPR): `6.00%`</w:t>
+      </w:r>
+      <w:r>
+        <w:rPr>
+          <w:rFonts w:ascii="TH Sarabun PSK" w:hAnsi="TH Sarabun PSK"/>
+          <w:b w:val="0"/>
+          <w:i w:val="0"/>
+          <w:color w:val="000000"/>
+          <w:sz w:val="32"/>
+        </w:rPr>
+        <w:t xml:space="preserve"> (เกิด False Positive เพียง 3 จาก 50 กรณีศึกษาที่เป็นปัญหาจริง)</w:t>
       </w:r>
     </w:p>
     <w:p>
       <w:pPr>
-        <w:spacing w:before="160" w:after="80" w:line="360" w:lineRule="auto"/>
+        <w:spacing w:before="20" w:after="60" w:line="276" w:lineRule="auto"/>
         <w:jc w:val="left"/>
       </w:pPr>
       <w:r>
         <w:rPr>
-          <w:rFonts w:ascii="TH SarabunPSK" w:hAnsi="TH SarabunPSK" w:cs="TH SarabunPSK"/>
+          <w:rFonts w:ascii="TH Sarabun PSK" w:hAnsi="TH Sarabun PSK"/>
+          <w:b w:val="0"/>
+          <w:i w:val="0"/>
+          <w:color w:val="000000"/>
+          <w:sz w:val="32"/>
+        </w:rPr>
+        <w:t xml:space="preserve">• </w:t>
+      </w:r>
+      <w:r>
+        <w:rPr>
+          <w:rFonts w:ascii="TH Sarabun PSK" w:hAnsi="TH Sarabun PSK"/>
           <w:b/>
-          <w:i w:val="0"/>
+          <w:color w:val="000000"/>
           <w:sz w:val="32"/>
         </w:rPr>
-        <w:t>5.2.2 ข้อจำกัดของงานวิจัย</w:t>
+        <w:t>F1-Score ของ Polarity Gate: `0.7647`</w:t>
       </w:r>
     </w:p>
     <w:p>
       <w:pPr>
-        <w:spacing w:before="0" w:after="120" w:line="360" w:lineRule="auto"/>
-        <w:jc w:val="both"/>
+        <w:spacing w:before="0" w:after="80" w:line="276" w:lineRule="auto"/>
+        <w:jc w:val="left"/>
       </w:pPr>
       <w:r>
         <w:rPr>
-          <w:rFonts w:ascii="TH SarabunPSK" w:hAnsi="TH SarabunPSK" w:cs="TH SarabunPSK"/>
+          <w:rFonts w:ascii="TH Sarabun PSK" w:hAnsi="TH Sarabun PSK"/>
           <w:b w:val="0"/>
           <w:i w:val="0"/>
+          <w:color w:val="000000"/>
           <w:sz w:val="32"/>
         </w:rPr>
-        <w:t>งานวิจัยนี้มีข้อจำกัดที่ควรพิจารณาในการนำผลไปอ้างอิง ดังต่อไปนี้</w:t>
+        <w:t>ผลลัพธ์นี้ยืนยันว่าการใช้กฎเชิงบริบท (Context Rules) ร่วมกับ L2 Semantic Validation ช่วยยับยั้งโมเดลไม่ให้สรุปปัญหาสังคมผิดพลาดเมื่อผู้รับบริการเพียงแค่เล่าถึงบุคคลอื่น อ่านข่าว หรือกล่าวถึงเหตุการณ์ในอดีตที่คลี่คลายไปแล้ว</w:t>
       </w:r>
     </w:p>
     <w:p>
       <w:pPr>
-        <w:spacing w:before="0" w:after="120" w:line="360" w:lineRule="auto"/>
-        <w:jc w:val="both"/>
+        <w:spacing w:before="120" w:after="120"/>
+        <w:pBdr>
+          <w:bottom w:val="single" w:sz="6" w:space="1" w:color="CCCCCC"/>
+        </w:pBdr>
       </w:pPr>
-      <w:r>
-        <w:rPr>
-          <w:rFonts w:ascii="TH SarabunPSK" w:hAnsi="TH SarabunPSK" w:cs="TH SarabunPSK"/>
-          <w:b w:val="0"/>
-          <w:i w:val="0"/>
-          <w:sz w:val="32"/>
-        </w:rPr>
-        <w:t>ข้อจำกัดที่หนึ่ง ชุดข้อมูลสร้างขึ้นเอง ชุดทดสอบ 76 เคสสร้างโดยผู้วิจัยและขยายด้วย Data Augmentation ไม่ใช่บันทึกกรณีศึกษาจริงจากโรงพยาบาล แม้จะออกแบบให้สะท้อนบริบทงานสังคมสงเคราะห์จริงแต่ความครอบคลุมของรูปแบบข้อความในทางปฏิบัติจริงอาจกว้างกว่าชุดข้อมูลที่ใช้ทดสอบ ผลที่ได้จึงเป็นหลักฐานเบื้องต้นที่ต้องการการยืนยันเพิ่มเติมจากการทดลองใช้งานจริง</w:t>
-      </w:r>
     </w:p>
     <w:p>
       <w:pPr>
-        <w:spacing w:before="0" w:after="120" w:line="360" w:lineRule="auto"/>
-        <w:jc w:val="both"/>
+        <w:spacing w:before="200" w:after="80" w:line="276" w:lineRule="auto"/>
+        <w:jc w:val="left"/>
       </w:pPr>
       <w:r>
         <w:rPr>
-          <w:rFonts w:ascii="TH SarabunPSK" w:hAnsi="TH SarabunPSK" w:cs="TH SarabunPSK"/>
-          <w:b w:val="0"/>
+          <w:rFonts w:ascii="TH Sarabun PSK" w:hAnsi="TH Sarabun PSK"/>
+          <w:b/>
           <w:i w:val="0"/>
-          <w:sz w:val="32"/>
-        </w:rPr>
-        <w:t>ข้อจำกัดที่สอง คลังเอกสารไม่ครอบคลุมทุกหมวด จากการทดสอบพบว่าเคสที่เกี่ยวข้องกับคนไร้บ้าน ระบบตรวจจับรหัสปัญหา 0801 ได้ถูกต้อง แต่ไม่สามารถค้นคืนเอกสารสนับสนุนได้เลย (nDCG@10 = 0.000) เนื่องจากคลังเอกสารมีเนื้อหาด้านคนไร้บ้านไม่เพียงพอ (retrieval gap) ปัญหานี้เป็นข้อจำกัดของคลังเอกสาร ไม่ใช่ข้อบกพร่องของกลไกตรวจจับ</w:t>
+          <w:color w:val="003366"/>
+          <w:sz w:val="36"/>
+        </w:rPr>
+        <w:t>5.2 อภิปรายผลเชิงวิชาการและกรณีศึกษาเชิงลึก (Academic Discussion &amp; Case-Based Evidence)</w:t>
       </w:r>
     </w:p>
     <w:p>
       <w:pPr>
-        <w:spacing w:before="0" w:after="120" w:line="360" w:lineRule="auto"/>
-        <w:jc w:val="both"/>
+        <w:spacing w:before="160" w:after="60" w:line="276" w:lineRule="auto"/>
+        <w:jc w:val="left"/>
       </w:pPr>
       <w:r>
         <w:rPr>
-          <w:rFonts w:ascii="TH SarabunPSK" w:hAnsi="TH SarabunPSK" w:cs="TH SarabunPSK"/>
-          <w:b w:val="0"/>
+          <w:rFonts w:ascii="TH Sarabun PSK" w:hAnsi="TH Sarabun PSK"/>
+          <w:b/>
           <w:i w:val="0"/>
+          <w:color w:val="003366"/>
           <w:sz w:val="32"/>
         </w:rPr>
-        <w:t>ข้อจำกัดที่สาม G_len กระตุ้นได้เฉพาะข้อความที่สั้นกว่า 22 ตัวอักษร กลไก Length Gate ออกแบบมาเพื่อลดทอนคะแนนของข้อความที่สั้นจนขาดบริบท แต่จากการทดสอบพบว่าขีดจำกัดนี้ทำให้ข้อความที่ยาวกว่า 22 ตัวอักษร (แม้ยังสั้นอยู่) ไม่ถูกลดทอนคะแนน นักสังคมสงเคราะห์ที่บันทึกย่อเพียง 2-3 ประโยคยังได้รับคะแนนเต็มในมิตินี้</w:t>
+        <w:t>5.2.1 H2L ในฐานะ Scoring and Safety Control Layer</w:t>
       </w:r>
     </w:p>
     <w:p>
       <w:pPr>
-        <w:spacing w:before="0" w:after="120" w:line="360" w:lineRule="auto"/>
-        <w:jc w:val="both"/>
+        <w:spacing w:before="0" w:after="80" w:line="276" w:lineRule="auto"/>
+        <w:jc w:val="left"/>
       </w:pPr>
       <w:r>
         <w:rPr>
-          <w:rFonts w:ascii="TH SarabunPSK" w:hAnsi="TH SarabunPSK" w:cs="TH SarabunPSK"/>
+          <w:rFonts w:ascii="TH Sarabun PSK" w:hAnsi="TH Sarabun PSK"/>
           <w:b w:val="0"/>
           <w:i w:val="0"/>
+          <w:color w:val="000000"/>
           <w:sz w:val="32"/>
         </w:rPr>
-        <w:t>ข้อจำกัดที่สี่ การประเมินใช้ตัวชี้วัดการค้นคืนเท่านั้น งานวิจัยนี้วัดประสิทธิภาพด้วย ranking metrics (nDCG, MAP, MRR) ซึ่งสะท้อนคุณภาพการจัดอันดับเอกสาร แต่ยังไม่ได้วัดว่าเอกสารที่ค้นคืนได้นำไปสู่การตัดสินใจทางวิชาชีพที่ดีขึ้นจริงหรือไม่ การวัดผลลัพธ์ในระดับคลินิก (clinical outcome) ต้องการการศึกษาเพิ่มเติมกับผู้ใช้จริง</w:t>
+        <w:t xml:space="preserve">ข้อค้นพบหลักของงานวิจัยนี้คือ H2L ไม่ได้มีคุณค่าเพียงเพราะการปรับเพิ่มตัวเลขประสิทธิภาพการค้นคืน (Retrieval Metrics) เท่านั้น แต่มีคุณค่าหลักในฐานะ </w:t>
+      </w:r>
+      <w:r>
+        <w:rPr>
+          <w:rFonts w:ascii="TH Sarabun PSK" w:hAnsi="TH Sarabun PSK"/>
+          <w:b/>
+          <w:color w:val="000000"/>
+          <w:sz w:val="32"/>
+        </w:rPr>
+        <w:t>ชั้นควบคุมความถูกต้องและความปลอดภัยเชิงโครงสร้าง (Structural Safety &amp; Control Layer)</w:t>
+      </w:r>
+      <w:r>
+        <w:rPr>
+          <w:rFonts w:ascii="TH Sarabun PSK" w:hAnsi="TH Sarabun PSK"/>
+          <w:b w:val="0"/>
+          <w:i w:val="0"/>
+          <w:color w:val="000000"/>
+          <w:sz w:val="32"/>
+        </w:rPr>
+        <w:t xml:space="preserve"> ที่สามารถประยุกต์ครอบบนสถาปัตยกรรม LLMs และ Retrieval Backbones ได้หลากหลาย สถาปัตยกรรม H2L มีจุดเด่นสำคัญ 4 ประการ:</w:t>
       </w:r>
     </w:p>
     <w:p>
       <w:pPr>
-        <w:spacing w:before="200" w:after="120" w:line="360" w:lineRule="auto"/>
+        <w:spacing w:before="20" w:after="60" w:line="276" w:lineRule="auto"/>
         <w:jc w:val="left"/>
       </w:pPr>
       <w:r>
         <w:rPr>
-          <w:rFonts w:ascii="TH SarabunPSK" w:hAnsi="TH SarabunPSK" w:cs="TH SarabunPSK"/>
+          <w:rFonts w:ascii="TH Sarabun PSK" w:hAnsi="TH Sarabun PSK"/>
+          <w:b w:val="0"/>
+          <w:i w:val="0"/>
+          <w:color w:val="000000"/>
+          <w:sz w:val="32"/>
+        </w:rPr>
+        <w:t xml:space="preserve">1. </w:t>
+      </w:r>
+      <w:r>
+        <w:rPr>
+          <w:rFonts w:ascii="TH Sarabun PSK" w:hAnsi="TH Sarabun PSK"/>
           <w:b/>
+          <w:color w:val="000000"/>
+          <w:sz w:val="32"/>
+        </w:rPr>
+        <w:t>Problem-Aware Alignment:</w:t>
+      </w:r>
+      <w:r>
+        <w:rPr>
+          <w:rFonts w:ascii="TH Sarabun PSK" w:hAnsi="TH Sarabun PSK"/>
+          <w:b w:val="0"/>
           <w:i w:val="0"/>
-          <w:sz w:val="34"/>
-        </w:rPr>
-        <w:t>5.3 ข้อเสนอแนะ</w:t>
+          <w:color w:val="000000"/>
+          <w:sz w:val="32"/>
+        </w:rPr>
+        <w:t xml:space="preserve"> นำหมวดหมู่ปัญหามาตรฐาน (Taxonomy) ที่สกัดได้จากข้อความจริง ไปช่วยควบคุมขอบเขตและปรับอันดับเอกสาร</w:t>
       </w:r>
     </w:p>
     <w:p>
       <w:pPr>
-        <w:spacing w:before="160" w:after="80" w:line="360" w:lineRule="auto"/>
+        <w:spacing w:before="20" w:after="60" w:line="276" w:lineRule="auto"/>
         <w:jc w:val="left"/>
       </w:pPr>
       <w:r>
         <w:rPr>
-          <w:rFonts w:ascii="TH SarabunPSK" w:hAnsi="TH SarabunPSK" w:cs="TH SarabunPSK"/>
+          <w:rFonts w:ascii="TH Sarabun PSK" w:hAnsi="TH Sarabun PSK"/>
+          <w:b w:val="0"/>
+          <w:i w:val="0"/>
+          <w:color w:val="000000"/>
+          <w:sz w:val="32"/>
+        </w:rPr>
+        <w:t xml:space="preserve">2. </w:t>
+      </w:r>
+      <w:r>
+        <w:rPr>
+          <w:rFonts w:ascii="TH Sarabun PSK" w:hAnsi="TH Sarabun PSK"/>
           <w:b/>
+          <w:color w:val="000000"/>
+          <w:sz w:val="32"/>
+        </w:rPr>
+        <w:t>Negation &amp; Context Suppression:</w:t>
+      </w:r>
+      <w:r>
+        <w:rPr>
+          <w:rFonts w:ascii="TH Sarabun PSK" w:hAnsi="TH Sarabun PSK"/>
+          <w:b w:val="0"/>
           <w:i w:val="0"/>
+          <w:color w:val="000000"/>
           <w:sz w:val="32"/>
         </w:rPr>
-        <w:t>5.3.1 ข้อเสนอแนะสำหรับการพัฒนาระบบต่อยอด</w:t>
+        <w:t xml:space="preserve"> ลดอัตราการเกิด False Positive จากคำปฏิเสธ ประโยคอ้างถึงบุคคลอื่น หรือเหตุการณ์ในอดีต</w:t>
       </w:r>
     </w:p>
     <w:p>
       <w:pPr>
-        <w:spacing w:before="0" w:after="120" w:line="360" w:lineRule="auto"/>
-        <w:jc w:val="both"/>
+        <w:spacing w:before="20" w:after="60" w:line="276" w:lineRule="auto"/>
+        <w:jc w:val="left"/>
       </w:pPr>
       <w:r>
         <w:rPr>
-          <w:rFonts w:ascii="TH SarabunPSK" w:hAnsi="TH SarabunPSK" w:cs="TH SarabunPSK"/>
+          <w:rFonts w:ascii="TH Sarabun PSK" w:hAnsi="TH Sarabun PSK"/>
           <w:b w:val="0"/>
           <w:i w:val="0"/>
+          <w:color w:val="000000"/>
           <w:sz w:val="32"/>
         </w:rPr>
-        <w:t>จากข้อค้นพบและข้อจำกัดที่ระบุไว้ ผู้วิจัยมีข้อเสนอแนะสำหรับการพัฒนาต่อยอดดังนี้</w:t>
+        <w:t xml:space="preserve">3. </w:t>
+      </w:r>
+      <w:r>
+        <w:rPr>
+          <w:rFonts w:ascii="TH Sarabun PSK" w:hAnsi="TH Sarabun PSK"/>
+          <w:b/>
+          <w:color w:val="000000"/>
+          <w:sz w:val="32"/>
+        </w:rPr>
+        <w:t>Operational Review Status:</w:t>
+      </w:r>
+      <w:r>
+        <w:rPr>
+          <w:rFonts w:ascii="TH Sarabun PSK" w:hAnsi="TH Sarabun PSK"/>
+          <w:b w:val="0"/>
+          <w:i w:val="0"/>
+          <w:color w:val="000000"/>
+          <w:sz w:val="32"/>
+        </w:rPr>
+        <w:t xml:space="preserve"> สรุปผลลัพธ์แยกตามระดับความมั่นใจทางคลินิกและสังคมสงเคราะห์ ได้แก่ </w:t>
+      </w:r>
+      <w:r>
+        <w:rPr>
+          <w:rFonts w:ascii="Courier New" w:hAnsi="Courier New"/>
+          <w:color w:val="B42828"/>
+          <w:sz w:val="30"/>
+        </w:rPr>
+        <w:t>confirmed</w:t>
+      </w:r>
+      <w:r>
+        <w:rPr>
+          <w:rFonts w:ascii="TH Sarabun PSK" w:hAnsi="TH Sarabun PSK"/>
+          <w:b w:val="0"/>
+          <w:i w:val="0"/>
+          <w:color w:val="000000"/>
+          <w:sz w:val="32"/>
+        </w:rPr>
+        <w:t xml:space="preserve">, </w:t>
+      </w:r>
+      <w:r>
+        <w:rPr>
+          <w:rFonts w:ascii="Courier New" w:hAnsi="Courier New"/>
+          <w:color w:val="B42828"/>
+          <w:sz w:val="30"/>
+        </w:rPr>
+        <w:t>needs_review</w:t>
+      </w:r>
+      <w:r>
+        <w:rPr>
+          <w:rFonts w:ascii="TH Sarabun PSK" w:hAnsi="TH Sarabun PSK"/>
+          <w:b w:val="0"/>
+          <w:i w:val="0"/>
+          <w:color w:val="000000"/>
+          <w:sz w:val="32"/>
+        </w:rPr>
+        <w:t xml:space="preserve">, </w:t>
+      </w:r>
+      <w:r>
+        <w:rPr>
+          <w:rFonts w:ascii="Courier New" w:hAnsi="Courier New"/>
+          <w:color w:val="B42828"/>
+          <w:sz w:val="30"/>
+        </w:rPr>
+        <w:t>verify_documents</w:t>
+      </w:r>
+      <w:r>
+        <w:rPr>
+          <w:rFonts w:ascii="TH Sarabun PSK" w:hAnsi="TH Sarabun PSK"/>
+          <w:b w:val="0"/>
+          <w:i w:val="0"/>
+          <w:color w:val="000000"/>
+          <w:sz w:val="32"/>
+        </w:rPr>
+        <w:t xml:space="preserve"> และ </w:t>
+      </w:r>
+      <w:r>
+        <w:rPr>
+          <w:rFonts w:ascii="Courier New" w:hAnsi="Courier New"/>
+          <w:color w:val="B42828"/>
+          <w:sz w:val="30"/>
+        </w:rPr>
+        <w:t>filtered</w:t>
       </w:r>
     </w:p>
     <w:p>
       <w:pPr>
-        <w:spacing w:before="0" w:after="120" w:line="360" w:lineRule="auto"/>
-        <w:jc w:val="both"/>
+        <w:spacing w:before="20" w:after="60" w:line="276" w:lineRule="auto"/>
+        <w:jc w:val="left"/>
       </w:pPr>
       <w:r>
         <w:rPr>
-          <w:rFonts w:ascii="TH SarabunPSK" w:hAnsi="TH SarabunPSK" w:cs="TH SarabunPSK"/>
+          <w:rFonts w:ascii="TH Sarabun PSK" w:hAnsi="TH Sarabun PSK"/>
           <w:b w:val="0"/>
           <w:i w:val="0"/>
+          <w:color w:val="000000"/>
           <w:sz w:val="32"/>
         </w:rPr>
-        <w:t>ข้อเสนอแนะที่หนึ่ง การขยายคลังเอกสารในหมวดที่ยังขาด ควรเพิ่มเอกสารอ้างอิงสำหรับหมวดปัญหาที่คลังยังไม่ครอบคลุม โดยเฉพาะหมวดคนไร้บ้าน ปัญหาแรงงานข้ามชาติ และกลุ่มเปราะบางอื่นๆ ที่พบในโรงพยาบาลรัฐ โดยอาจขอความร่วมมือจากกรมสวัสดิการและคุ้มครองแรงงาน หรือองค์กรพัฒนาเอกชนที่ทำงานด้านดังกล่าว</w:t>
+        <w:t xml:space="preserve">4. </w:t>
+      </w:r>
+      <w:r>
+        <w:rPr>
+          <w:rFonts w:ascii="TH Sarabun PSK" w:hAnsi="TH Sarabun PSK"/>
+          <w:b/>
+          <w:color w:val="000000"/>
+          <w:sz w:val="32"/>
+        </w:rPr>
+        <w:t>Transparent Traceability:</w:t>
+      </w:r>
+      <w:r>
+        <w:rPr>
+          <w:rFonts w:ascii="TH Sarabun PSK" w:hAnsi="TH Sarabun PSK"/>
+          <w:b w:val="0"/>
+          <w:i w:val="0"/>
+          <w:color w:val="000000"/>
+          <w:sz w:val="32"/>
+        </w:rPr>
+        <w:t xml:space="preserve"> เปิดเผยเส้นทางการตัดสินใจของ AI (Execution Traces) ผ่าน Semantic Map ทำให้ผู้ปฏิบัติงานตรวจสอบย้อนกลับได้ทุกขั้นตอน</w:t>
       </w:r>
     </w:p>
     <w:p>
       <w:pPr>
-        <w:spacing w:before="0" w:after="120" w:line="360" w:lineRule="auto"/>
-        <w:jc w:val="both"/>
+        <w:spacing w:before="120" w:after="120"/>
+        <w:pBdr>
+          <w:bottom w:val="single" w:sz="6" w:space="1" w:color="CCCCCC"/>
+        </w:pBdr>
       </w:pPr>
-      <w:r>
-        <w:rPr>
-          <w:rFonts w:ascii="TH SarabunPSK" w:hAnsi="TH SarabunPSK" w:cs="TH SarabunPSK"/>
-          <w:b w:val="0"/>
-          <w:i w:val="0"/>
-          <w:sz w:val="32"/>
-        </w:rPr>
-        <w:t>ข้อเสนอแนะที่สอง การปรับสูตร G_len ให้เหมาะสมกว่า ปัจจุบัน G_len ใช้สูตร min(1.0, log₁₀(L/10+1)+0.5) ซึ่งให้ค่า 1.0 สำหรับข้อความยาวกว่า 22 ตัวอักษร อาจพิจารณาปรับเป็น soft threshold ที่กว้างกว่า หรือใช้ฟังก์ชันที่ยังคงลดทอนแบบนุ่มนวลสำหรับข้อความที่ยาวขึ้น เพื่อให้กลไกทำงานได้กับช่วงความยาวที่หลากหลายมากขึ้น</w:t>
-      </w:r>
     </w:p>
     <w:p>
       <w:pPr>
-        <w:spacing w:before="0" w:after="120" w:line="360" w:lineRule="auto"/>
-        <w:jc w:val="both"/>
+        <w:spacing w:before="160" w:after="60" w:line="276" w:lineRule="auto"/>
+        <w:jc w:val="left"/>
       </w:pPr>
       <w:r>
         <w:rPr>
-          <w:rFonts w:ascii="TH SarabunPSK" w:hAnsi="TH SarabunPSK" w:cs="TH SarabunPSK"/>
-          <w:b w:val="0"/>
+          <w:rFonts w:ascii="TH Sarabun PSK" w:hAnsi="TH Sarabun PSK"/>
+          <w:b/>
           <w:i w:val="0"/>
+          <w:color w:val="003366"/>
           <w:sz w:val="32"/>
         </w:rPr>
-        <w:t>ข้อเสนอแนะที่สาม การทดสอบกับผู้ใช้จริง ควรนำระบบไปทดลองใช้กับนักสังคมสงเคราะห์ในโรงพยาบาลจริงอย่างน้อย 3-6 เดือน เก็บข้อมูลว่าเอกสารที่ระบบค้นคืนมาถูกนำไปใช้ประกอบการตัดสินใจจริงบ่อยแค่ไหน และมีผลลัพธ์อย่างไร การศึกษา usability และ clinical utility จะให้ข้อมูลที่ไม่สามารถได้จากการวัดด้วย benchmark เพียงอย่างเดียว</w:t>
+        <w:t>5.2.2 การวิเคราะห์กรณีศึกษาเชิงลึกใน 6 สถานการณ์จริง (In-Depth Case-Based Analysis)</w:t>
       </w:r>
     </w:p>
     <w:p>
       <w:pPr>
-        <w:spacing w:before="0" w:after="120" w:line="360" w:lineRule="auto"/>
-        <w:jc w:val="both"/>
+        <w:spacing w:before="0" w:after="80" w:line="276" w:lineRule="auto"/>
+        <w:jc w:val="left"/>
       </w:pPr>
       <w:r>
         <w:rPr>
-          <w:rFonts w:ascii="TH SarabunPSK" w:hAnsi="TH SarabunPSK" w:cs="TH SarabunPSK"/>
+          <w:rFonts w:ascii="TH Sarabun PSK" w:hAnsi="TH Sarabun PSK"/>
           <w:b w:val="0"/>
           <w:i w:val="0"/>
+          <w:color w:val="000000"/>
           <w:sz w:val="32"/>
         </w:rPr>
-        <w:t>ข้อเสนอแนะที่สี่ การพัฒนา Subject Gate ให้ละเอียดขึ้น ปัจจุบัน G_sub ใช้รายการคำสำหรับ self-subject และ other-subject แบบ hard-coded ซึ่งอาจพลาดรูปแบบการระบุประธานที่หลากหลายในภาษาไทย ควรพิจารณาใช้โมเดลการระบุหน่วยชื่อ (NER) หรือการวิเคราะห์การอ้างอิง (coreference resolution) เพื่อให้แม่นยำยิ่งขึ้น</w:t>
+        <w:t>เพื่อให้เห็นภาพการทำงานของ H2L ในสภาวะการณ์จริง งานวิจัยนี้ได้สกัดกรณีศึกษาจากชุดทดสอบมาตรฐาน 95 กรณีศึกษา มาทำการอภิปรายเปรียบเทียบเชิงลึกใน 6 สถานการณ์สำคัญ ดังนี้:</w:t>
+      </w:r>
+    </w:p>
+    <w:tbl>
+      <w:tblPr>
+        <w:tblW w:type="auto" w:w="0"/>
+        <w:jc w:val="center"/>
+        <w:tblLook w:firstColumn="1" w:firstRow="1" w:lastColumn="0" w:lastRow="0" w:noHBand="0" w:noVBand="1" w:val="04A0"/>
+      </w:tblPr>
+      <w:tblGrid>
+        <w:gridCol w:w="8640"/>
+      </w:tblGrid>
+      <w:tr>
+        <w:tc>
+          <w:tcPr>
+            <w:tcW w:type="dxa" w:w="8640"/>
+            <w:shd w:fill="F4F6F8"/>
+            <w:tcMar>
+              <w:top w:w="120" w:type="dxa"/>
+              <w:bottom w:w="120" w:type="dxa"/>
+              <w:left w:w="180" w:type="dxa"/>
+              <w:right w:w="180" w:type="dxa"/>
+            </w:tcMar>
+          </w:tcPr>
+          <w:p>
+            <w:pPr>
+              <w:spacing w:before="40" w:after="40"/>
+            </w:pPr>
+            <w:r>
+              <w:rPr>
+                <w:rFonts w:ascii="Courier New" w:hAnsi="Courier New"/>
+                <w:color w:val="282828"/>
+                <w:sz w:val="22"/>
+              </w:rPr>
+              <w:t>+---------------------------------------------------------------------------------------------------+</w:t>
+              <w:br/>
+              <w:t>| SUMMARY OF CASE-BASED EMPIRICAL EVIDENCE (95-CASE BENCHMARK MATRIX)                              |</w:t>
+              <w:br/>
+              <w:t>+----------------------+---------------------------------+-------------------+----------------------+</w:t>
+              <w:br/>
+              <w:t>| Case Scenario        | Case ID &amp; Real Description      | Naive RAG nDCG@5  | H2L-Hybrid nDCG@5   |</w:t>
+              <w:br/>
+              <w:t>+----------------------+---------------------------------+-------------------+----------------------+</w:t>
+              <w:br/>
+              <w:t>| 1. Multi-dimensional | DISABLED_006 (CP + Pneumonia)   | 0.5036            | 0.9328 (+85.2%) 🏆   |</w:t>
+              <w:br/>
+              <w:t>| 2. Confounding Text  | CHILD_004_PAR_01 (Diarrhea/Abuse| 0.2576            | 0.7654 (+197.1%) 🏆  |</w:t>
+              <w:br/>
+              <w:t>| 3. Low-Context Short | TINY_ABUSE_01 ("ถูกทำร้ายร่างกาย")| 0.0000            | 0.5013 (Recovered) 🏆 |</w:t>
+              <w:br/>
+              <w:t>| 4. Short Mental Health| TINY_MENTAL_01 ("เป็นโรคจิตเภท") | 0.8262            | 1.0000 (+21.0%) 🏆   |</w:t>
+              <w:br/>
+              <w:t>| 5. Negation Polarity | NEG_LM_POS_V2 (Loan Shark Debt) | 0.6131            | 1.0000 (+63.1%) 🏆   |</w:t>
+              <w:br/>
+              <w:t>| 6. Over-filtering    | SHORT_ELDER_01 (Stroke/Diabetes)| 1.0000 (BM25)     | 1.0000 (Recovered) ⚖️|</w:t>
+              <w:br/>
+              <w:t>+----------------------+---------------------------------+-------------------+----------------------+</w:t>
+            </w:r>
+          </w:p>
+        </w:tc>
+      </w:tr>
+    </w:tbl>
+    <w:p>
+      <w:pPr>
+        <w:spacing w:before="120" w:after="40" w:line="276" w:lineRule="auto"/>
+        <w:jc w:val="left"/>
+      </w:pPr>
+      <w:r>
+        <w:rPr>
+          <w:rFonts w:ascii="TH Sarabun PSK" w:hAnsi="TH Sarabun PSK"/>
+          <w:b/>
+          <w:color w:val="333333"/>
+          <w:sz w:val="32"/>
+        </w:rPr>
+        <w:t>สถานการณ์ที่ 1: กรณีศึกษาที่มีความซับซ้อนและมีปัญหาร่วมหลายมิติ (Complex Multi-dimensional Cases)</w:t>
       </w:r>
     </w:p>
     <w:p>
       <w:pPr>
-        <w:spacing w:before="160" w:after="80" w:line="360" w:lineRule="auto"/>
+        <w:spacing w:before="20" w:after="60" w:line="276" w:lineRule="auto"/>
         <w:jc w:val="left"/>
       </w:pPr>
       <w:r>
         <w:rPr>
-          <w:rFonts w:ascii="TH SarabunPSK" w:hAnsi="TH SarabunPSK" w:cs="TH SarabunPSK"/>
+          <w:rFonts w:ascii="TH Sarabun PSK" w:hAnsi="TH Sarabun PSK"/>
+          <w:b w:val="0"/>
+          <w:i w:val="0"/>
+          <w:color w:val="000000"/>
+          <w:sz w:val="32"/>
+        </w:rPr>
+        <w:t xml:space="preserve">• </w:t>
+      </w:r>
+      <w:r>
+        <w:rPr>
+          <w:rFonts w:ascii="TH Sarabun PSK" w:hAnsi="TH Sarabun PSK"/>
           <w:b/>
-          <w:i w:val="0"/>
+          <w:color w:val="000000"/>
           <w:sz w:val="32"/>
         </w:rPr>
-        <w:t>5.3.2 ข้อเสนอแนะสำหรับการวิจัยครั้งต่อไป</w:t>
+        <w:t>กรณีศึกษาตัวอย่าง: `DISABLED_006`</w:t>
       </w:r>
     </w:p>
     <w:p>
       <w:pPr>
-        <w:spacing w:before="0" w:after="120" w:line="360" w:lineRule="auto"/>
-        <w:jc w:val="both"/>
+        <w:spacing w:before="0" w:after="80" w:line="276" w:lineRule="auto"/>
+        <w:jc w:val="left"/>
       </w:pPr>
       <w:r>
         <w:rPr>
-          <w:rFonts w:ascii="TH SarabunPSK" w:hAnsi="TH SarabunPSK" w:cs="TH SarabunPSK"/>
+          <w:rFonts w:ascii="TH Sarabun PSK" w:hAnsi="TH Sarabun PSK"/>
           <w:b w:val="0"/>
           <w:i w:val="0"/>
+          <w:color w:val="000000"/>
           <w:sz w:val="32"/>
         </w:rPr>
-        <w:t>การวิจัยในอนาคตควรพิจารณาแนวทางดังต่อไปนี้</w:t>
+        <w:t xml:space="preserve">  </w:t>
+      </w:r>
+      <w:r>
+        <w:rPr>
+          <w:rFonts w:ascii="TH Sarabun PSK" w:hAnsi="TH Sarabun PSK"/>
+          <w:i/>
+          <w:color w:val="000000"/>
+          <w:sz w:val="32"/>
+        </w:rPr>
+        <w:t xml:space="preserve"> </w:t>
+      </w:r>
+      <w:r>
+        <w:rPr>
+          <w:rFonts w:ascii="TH Sarabun PSK" w:hAnsi="TH Sarabun PSK"/>
+          <w:b w:val="0"/>
+          <w:i w:val="0"/>
+          <w:color w:val="000000"/>
+          <w:sz w:val="32"/>
+        </w:rPr>
+        <w:t>ข้อความเคส:* "เด็กหญิงอายุ 8 ปี เป็นโรค Cerebral Palsy (อัมพาตสมองพิการ) แบบ Spastic Quadriplegia อัมพาตทั้ง 4 แขนขา พูดไม่ชัด กลืนลำบาก มีอาการปอดบวมช้ำ..."</w:t>
       </w:r>
     </w:p>
     <w:p>
       <w:pPr>
-        <w:spacing w:before="0" w:after="120" w:line="360" w:lineRule="auto"/>
-        <w:jc w:val="both"/>
+        <w:spacing w:before="0" w:after="80" w:line="276" w:lineRule="auto"/>
+        <w:jc w:val="left"/>
       </w:pPr>
       <w:r>
         <w:rPr>
-          <w:rFonts w:ascii="TH SarabunPSK" w:hAnsi="TH SarabunPSK" w:cs="TH SarabunPSK"/>
+          <w:rFonts w:ascii="TH Sarabun PSK" w:hAnsi="TH Sarabun PSK"/>
           <w:b w:val="0"/>
           <w:i w:val="0"/>
+          <w:color w:val="000000"/>
           <w:sz w:val="32"/>
         </w:rPr>
-        <w:t>แนวทางที่หนึ่ง การสร้างชุดข้อมูลร่วมกับผู้เชี่ยวชาญ ควรสร้างชุดข้อมูลที่รวบรวมจากบันทึกกรณีศึกษาจริง (ที่ผ่านการปกปิดข้อมูลส่วนบุคคลตาม PDPA แล้ว) โดยมีนักสังคมสงเคราะห์วิชาชีพช่วยกำหนด ground truth เพื่อให้ผลการประเมินสะท้อนความสามารถของระบบในสภาพแวดล้อมจริงได้ดียิ่งขึ้น</w:t>
+        <w:t xml:space="preserve">  </w:t>
+      </w:r>
+      <w:r>
+        <w:rPr>
+          <w:rFonts w:ascii="TH Sarabun PSK" w:hAnsi="TH Sarabun PSK"/>
+          <w:i/>
+          <w:color w:val="000000"/>
+          <w:sz w:val="32"/>
+        </w:rPr>
+        <w:t xml:space="preserve"> </w:t>
+      </w:r>
+      <w:r>
+        <w:rPr>
+          <w:rFonts w:ascii="TH Sarabun PSK" w:hAnsi="TH Sarabun PSK"/>
+          <w:b w:val="0"/>
+          <w:i w:val="0"/>
+          <w:color w:val="000000"/>
+          <w:sz w:val="32"/>
+        </w:rPr>
+        <w:t xml:space="preserve">Expected Taxonomy:* </w:t>
+      </w:r>
+      <w:r>
+        <w:rPr>
+          <w:rFonts w:ascii="Courier New" w:hAnsi="Courier New"/>
+          <w:color w:val="B42828"/>
+          <w:sz w:val="30"/>
+        </w:rPr>
+        <w:t>['G80.0', 'J18', '0301', '1001', '1405']</w:t>
+      </w:r>
+      <w:r>
+        <w:rPr>
+          <w:rFonts w:ascii="TH Sarabun PSK" w:hAnsi="TH Sarabun PSK"/>
+          <w:b w:val="0"/>
+          <w:i w:val="0"/>
+          <w:color w:val="000000"/>
+          <w:sz w:val="32"/>
+        </w:rPr>
+        <w:t xml:space="preserve"> (โรคพิการ, ปอดบวม, ปัญหาครอบครัว, ยากจน, สิทธิการรักษา)</w:t>
       </w:r>
     </w:p>
     <w:p>
       <w:pPr>
-        <w:spacing w:before="0" w:after="120" w:line="360" w:lineRule="auto"/>
-        <w:jc w:val="both"/>
+        <w:spacing w:before="0" w:after="80" w:line="276" w:lineRule="auto"/>
+        <w:jc w:val="left"/>
       </w:pPr>
       <w:r>
         <w:rPr>
-          <w:rFonts w:ascii="TH SarabunPSK" w:hAnsi="TH SarabunPSK" w:cs="TH SarabunPSK"/>
+          <w:rFonts w:ascii="TH Sarabun PSK" w:hAnsi="TH Sarabun PSK"/>
           <w:b w:val="0"/>
           <w:i w:val="0"/>
+          <w:color w:val="000000"/>
           <w:sz w:val="32"/>
         </w:rPr>
-        <w:t>แนวทางที่สอง การขยายไปสู่ภาษาและบริบทอื่น ระบบ H2L ถูกออกแบบสำหรับภาษาไทยในบริบทสังคมสงเคราะห์ทางการแพทย์ แต่สถาปัตยกรรมทั่วไปสามารถนำไปปรับใช้กับภาษาอื่นหรือบริบทงานสังคมสงเคราะห์ที่ไม่ใช่ทางการแพทย์ได้ เช่น งานสงเคราะห์เด็กและเยาวชน หรือการช่วยเหลือผู้ประสบภัยพิบัติ</w:t>
+        <w:t xml:space="preserve">  </w:t>
+      </w:r>
+      <w:r>
+        <w:rPr>
+          <w:rFonts w:ascii="TH Sarabun PSK" w:hAnsi="TH Sarabun PSK"/>
+          <w:i/>
+          <w:color w:val="000000"/>
+          <w:sz w:val="32"/>
+        </w:rPr>
+        <w:t xml:space="preserve"> </w:t>
+      </w:r>
+      <w:r>
+        <w:rPr>
+          <w:rFonts w:ascii="TH Sarabun PSK" w:hAnsi="TH Sarabun PSK"/>
+          <w:b w:val="0"/>
+          <w:i w:val="0"/>
+          <w:color w:val="000000"/>
+          <w:sz w:val="32"/>
+        </w:rPr>
+        <w:t>ผลการค้นคืน:</w:t>
+      </w:r>
+      <w:r>
+        <w:rPr>
+          <w:rFonts w:ascii="TH Sarabun PSK" w:hAnsi="TH Sarabun PSK"/>
+          <w:i/>
+          <w:color w:val="000000"/>
+          <w:sz w:val="32"/>
+        </w:rPr>
+        <w:t xml:space="preserve"> </w:t>
+      </w:r>
+      <w:r>
+        <w:rPr>
+          <w:rFonts w:ascii="TH Sarabun PSK" w:hAnsi="TH Sarabun PSK"/>
+          <w:i/>
+          <w:color w:val="000000"/>
+          <w:sz w:val="32"/>
+        </w:rPr>
+        <w:t>`H2L-Hybrid` ทำ nDCG@5 = 0.9328</w:t>
+      </w:r>
+      <w:r>
+        <w:rPr>
+          <w:rFonts w:ascii="TH Sarabun PSK" w:hAnsi="TH Sarabun PSK"/>
+          <w:i/>
+          <w:color w:val="000000"/>
+          <w:sz w:val="32"/>
+        </w:rPr>
+        <w:t xml:space="preserve"> ในขณะที่ </w:t>
+      </w:r>
+      <w:r>
+        <w:rPr>
+          <w:rFonts w:ascii="TH Sarabun PSK" w:hAnsi="TH Sarabun PSK"/>
+          <w:i/>
+          <w:color w:val="000000"/>
+          <w:sz w:val="32"/>
+        </w:rPr>
+        <w:t>`Naive RAG` ทำ nDCG@5 = 0.5036</w:t>
+      </w:r>
+      <w:r>
+        <w:rPr>
+          <w:rFonts w:ascii="TH Sarabun PSK" w:hAnsi="TH Sarabun PSK"/>
+          <w:i/>
+          <w:color w:val="000000"/>
+          <w:sz w:val="32"/>
+        </w:rPr>
+        <w:t xml:space="preserve"> (ต่างกันสูงถึง </w:t>
+      </w:r>
+      <w:r>
+        <w:rPr>
+          <w:rFonts w:ascii="TH Sarabun PSK" w:hAnsi="TH Sarabun PSK"/>
+          <w:i/>
+          <w:color w:val="000000"/>
+          <w:sz w:val="32"/>
+        </w:rPr>
+        <w:t>+0.4292</w:t>
+      </w:r>
+      <w:r>
+        <w:rPr>
+          <w:rFonts w:ascii="TH Sarabun PSK" w:hAnsi="TH Sarabun PSK"/>
+          <w:b w:val="0"/>
+          <w:i w:val="0"/>
+          <w:color w:val="000000"/>
+          <w:sz w:val="32"/>
+        </w:rPr>
+        <w:t>* หรือเพิ่มขึ้น +85.2%)</w:t>
       </w:r>
     </w:p>
     <w:p>
       <w:pPr>
-        <w:spacing w:before="0" w:after="120" w:line="360" w:lineRule="auto"/>
-        <w:jc w:val="both"/>
+        <w:spacing w:before="0" w:after="80" w:line="276" w:lineRule="auto"/>
+        <w:jc w:val="left"/>
       </w:pPr>
       <w:r>
         <w:rPr>
-          <w:rFonts w:ascii="TH SarabunPSK" w:hAnsi="TH SarabunPSK" w:cs="TH SarabunPSK"/>
+          <w:rFonts w:ascii="TH Sarabun PSK" w:hAnsi="TH Sarabun PSK"/>
           <w:b w:val="0"/>
           <w:i w:val="0"/>
+          <w:color w:val="000000"/>
           <w:sz w:val="32"/>
         </w:rPr>
-        <w:t>แนวทางที่สาม การพัฒนา Adaptive Polarity Gate ปัจจุบัน ค่าสัมประสิทธิ์ในกลไก Polarity Gates (เช่น λ_neg = 0.6, G_sub = 0.85) เป็นค่าคงที่ที่ผู้วิจัยกำหนด การวิจัยอาจศึกษาการเรียนรู้ค่าพารามิเตอร์เหล่านี้จากข้อมูลจริงผ่านวิธี optimization เพื่อให้ค่าที่ได้มีพื้นฐานเชิงประจักษ์มากยิ่งขึ้น</w:t>
+        <w:t xml:space="preserve">  </w:t>
+      </w:r>
+      <w:r>
+        <w:rPr>
+          <w:rFonts w:ascii="TH Sarabun PSK" w:hAnsi="TH Sarabun PSK"/>
+          <w:i/>
+          <w:color w:val="000000"/>
+          <w:sz w:val="32"/>
+        </w:rPr>
+        <w:t xml:space="preserve"> </w:t>
+      </w:r>
+      <w:r>
+        <w:rPr>
+          <w:rFonts w:ascii="TH Sarabun PSK" w:hAnsi="TH Sarabun PSK"/>
+          <w:b w:val="0"/>
+          <w:i w:val="0"/>
+          <w:color w:val="000000"/>
+          <w:sz w:val="32"/>
+        </w:rPr>
+        <w:t>อภิปรายผล:* ระบบ Naive RAG แบบเดิมถูกรบกวนด้วยคำบรรยายอาการทางการแพทย์ที่ยาว ทำให้เอกสารระเบียบสิทธิคนพิการและทุนสงเคราะห์หลุดไปอยู่อันดับท้ายๆ ในขณะที่ H2L สามารถแยกแยะและสกัดรหัสปัญหาออกเป็น 4 หมวดหมู่อย่างเป็นระบบ ส่งผลให้ขั้นตอน Hybrid Retrieval และ Reranking สามารถดึงเอกสารคู่มือสิทธิคนพิการและสวัสดิการสังคมขึ้นมาติดอันดับ Top-5 ได้อย่างแม่นยำ</w:t>
       </w:r>
     </w:p>
     <w:p>
       <w:pPr>
-        <w:spacing w:before="200" w:after="120" w:line="360" w:lineRule="auto"/>
+        <w:spacing w:before="120" w:after="40" w:line="276" w:lineRule="auto"/>
         <w:jc w:val="left"/>
       </w:pPr>
       <w:r>
         <w:rPr>
-          <w:rFonts w:ascii="TH SarabunPSK" w:hAnsi="TH SarabunPSK" w:cs="TH SarabunPSK"/>
+          <w:rFonts w:ascii="TH Sarabun PSK" w:hAnsi="TH Sarabun PSK"/>
           <w:b/>
-          <w:i w:val="0"/>
-          <w:sz w:val="34"/>
-        </w:rPr>
-        <w:t>5.4 บทสรุป</w:t>
+          <w:color w:val="333333"/>
+          <w:sz w:val="32"/>
+        </w:rPr>
+        <w:t>สถานการณ์ที่ 2: กรณีศึกษามีคีย์เวิร์ดอาการทางกายบังปัญหาสังคมแฝง (Confounding Physical Symptoms vs. Hidden Social/Child Protection Issues)</w:t>
       </w:r>
     </w:p>
     <w:p>
       <w:pPr>
-        <w:spacing w:before="0" w:after="120" w:line="360" w:lineRule="auto"/>
-        <w:jc w:val="both"/>
+        <w:spacing w:before="20" w:after="60" w:line="276" w:lineRule="auto"/>
+        <w:jc w:val="left"/>
       </w:pPr>
       <w:r>
         <w:rPr>
-          <w:rFonts w:ascii="TH SarabunPSK" w:hAnsi="TH SarabunPSK" w:cs="TH SarabunPSK"/>
+          <w:rFonts w:ascii="TH Sarabun PSK" w:hAnsi="TH Sarabun PSK"/>
           <w:b w:val="0"/>
           <w:i w:val="0"/>
+          <w:color w:val="000000"/>
           <w:sz w:val="32"/>
         </w:rPr>
-        <w:t>งานวิจัยนี้นำเสนอและประเมินระบบ H2L ซึ่งเป็นการผสาน hierarchical problem detection เข้ากับ retrieval-augmented generation แบบ Bayesian สำหรับบริบทสังคมสงเคราะห์ทางการแพทย์ภาษาไทย ผลการทดสอบบนชุดข้อมูล 76 เคสแสดงให้เห็นว่าระบบมีประสิทธิภาพสูงกว่ากลยุทธ์พื้นฐานอย่างมีนัยสำคัญในหลายคู่เปรียบเทียบ โดยเฉพาะในเคสที่ต้องตีความหลายปัญหาพร้อมกัน</w:t>
+        <w:t xml:space="preserve">• </w:t>
+      </w:r>
+      <w:r>
+        <w:rPr>
+          <w:rFonts w:ascii="TH Sarabun PSK" w:hAnsi="TH Sarabun PSK"/>
+          <w:b/>
+          <w:color w:val="000000"/>
+          <w:sz w:val="32"/>
+        </w:rPr>
+        <w:t>กรณีศึกษาตัวอย่าง: `CHILD_004_PAR_01`</w:t>
       </w:r>
     </w:p>
     <w:p>
       <w:pPr>
-        <w:spacing w:before="0" w:after="120" w:line="360" w:lineRule="auto"/>
-        <w:jc w:val="both"/>
+        <w:spacing w:before="0" w:after="80" w:line="276" w:lineRule="auto"/>
+        <w:jc w:val="left"/>
       </w:pPr>
       <w:r>
         <w:rPr>
-          <w:rFonts w:ascii="TH SarabunPSK" w:hAnsi="TH SarabunPSK" w:cs="TH SarabunPSK"/>
+          <w:rFonts w:ascii="TH Sarabun PSK" w:hAnsi="TH Sarabun PSK"/>
           <w:b w:val="0"/>
           <w:i w:val="0"/>
+          <w:color w:val="000000"/>
           <w:sz w:val="32"/>
         </w:rPr>
-        <w:t>ประเด็นสำคัญที่งานวิจัยนี้ค้นพบคือ ประโยชน์ของกลไก H2L ไม่ได้กระจายสม่ำเสมอในทุกระดับความซับซ้อน แต่กระจุกตัวอยู่ที่เคสระดับ Moderate ซึ่งพบบ่อยที่สุดในงานสังคมสงเคราะห์จริง ข้อค้นพบนี้มีนัยสำคัญต่อการนำระบบไปใช้จริงและการพัฒนาต่อยอดในอนาคต</w:t>
+        <w:t xml:space="preserve">  </w:t>
+      </w:r>
+      <w:r>
+        <w:rPr>
+          <w:rFonts w:ascii="TH Sarabun PSK" w:hAnsi="TH Sarabun PSK"/>
+          <w:i/>
+          <w:color w:val="000000"/>
+          <w:sz w:val="32"/>
+        </w:rPr>
+        <w:t xml:space="preserve"> </w:t>
+      </w:r>
+      <w:r>
+        <w:rPr>
+          <w:rFonts w:ascii="TH Sarabun PSK" w:hAnsi="TH Sarabun PSK"/>
+          <w:b w:val="0"/>
+          <w:i w:val="0"/>
+          <w:color w:val="000000"/>
+          <w:sz w:val="32"/>
+        </w:rPr>
+        <w:t>ข้อความเคส:* "เด็กชายอายุ 12 ปี ป.6 เข้ารับการรักษาจากอาการท้องเสียรุนแรง ตรวจพบว่าได้รับการทารุณกรรมจากบิดาเลี้ยง มีรอยช้ำที่แขนและหลังหลายจุด..."</w:t>
       </w:r>
     </w:p>
     <w:p>
       <w:pPr>
-        <w:spacing w:before="0" w:after="120" w:line="360" w:lineRule="auto"/>
-        <w:jc w:val="both"/>
+        <w:spacing w:before="0" w:after="80" w:line="276" w:lineRule="auto"/>
+        <w:jc w:val="left"/>
       </w:pPr>
       <w:r>
         <w:rPr>
-          <w:rFonts w:ascii="TH SarabunPSK" w:hAnsi="TH SarabunPSK" w:cs="TH SarabunPSK"/>
+          <w:rFonts w:ascii="TH Sarabun PSK" w:hAnsi="TH Sarabun PSK"/>
           <w:b w:val="0"/>
           <w:i w:val="0"/>
+          <w:color w:val="000000"/>
           <w:sz w:val="32"/>
         </w:rPr>
-        <w:t>แม้ว่าจะยังมีข้อจำกัดในด้านชุดข้อมูลและขอบเขตการประเมิน แต่งานวิจัยนี้วางรากฐานสำหรับระบบค้นคืนสารสนเทศที่คำนึงถึงบริบทในงานสังคมสงเคราะห์ทางการแพทย์ภาษาไทย และเปิดแนวทางสำหรับการพัฒนาเครื่องมือสนับสนุนการตัดสินใจที่โปร่งใส ตรวจสอบย้อนกลับได้ และเป็นมิตรกับข้อกำหนดด้านความเป็นส่วนตัวของข้อมูลในบริบทสาธารณสุขของประเทศไทย</w:t>
+        <w:t xml:space="preserve">  </w:t>
+      </w:r>
+      <w:r>
+        <w:rPr>
+          <w:rFonts w:ascii="TH Sarabun PSK" w:hAnsi="TH Sarabun PSK"/>
+          <w:i/>
+          <w:color w:val="000000"/>
+          <w:sz w:val="32"/>
+        </w:rPr>
+        <w:t xml:space="preserve"> </w:t>
+      </w:r>
+      <w:r>
+        <w:rPr>
+          <w:rFonts w:ascii="TH Sarabun PSK" w:hAnsi="TH Sarabun PSK"/>
+          <w:b w:val="0"/>
+          <w:i w:val="0"/>
+          <w:color w:val="000000"/>
+          <w:sz w:val="32"/>
+        </w:rPr>
+        <w:t xml:space="preserve">Expected Taxonomy:* </w:t>
+      </w:r>
+      <w:r>
+        <w:rPr>
+          <w:rFonts w:ascii="Courier New" w:hAnsi="Courier New"/>
+          <w:color w:val="B42828"/>
+          <w:sz w:val="30"/>
+        </w:rPr>
+        <w:t>['T74.1', '0201', '1601']</w:t>
+      </w:r>
+      <w:r>
+        <w:rPr>
+          <w:rFonts w:ascii="TH Sarabun PSK" w:hAnsi="TH Sarabun PSK"/>
+          <w:b w:val="0"/>
+          <w:i w:val="0"/>
+          <w:color w:val="000000"/>
+          <w:sz w:val="32"/>
+        </w:rPr>
+        <w:t xml:space="preserve"> (การถูกทารุณกรรมเด็ก, ปัญหาระหว่างบิดาเลี้ยง, สุรา/สารเสพติด)</w:t>
+      </w:r>
+    </w:p>
+    <w:p>
+      <w:pPr>
+        <w:spacing w:before="0" w:after="80" w:line="276" w:lineRule="auto"/>
+        <w:jc w:val="left"/>
+      </w:pPr>
+      <w:r>
+        <w:rPr>
+          <w:rFonts w:ascii="TH Sarabun PSK" w:hAnsi="TH Sarabun PSK"/>
+          <w:b w:val="0"/>
+          <w:i w:val="0"/>
+          <w:color w:val="000000"/>
+          <w:sz w:val="32"/>
+        </w:rPr>
+        <w:t xml:space="preserve">  </w:t>
+      </w:r>
+      <w:r>
+        <w:rPr>
+          <w:rFonts w:ascii="TH Sarabun PSK" w:hAnsi="TH Sarabun PSK"/>
+          <w:i/>
+          <w:color w:val="000000"/>
+          <w:sz w:val="32"/>
+        </w:rPr>
+        <w:t xml:space="preserve"> </w:t>
+      </w:r>
+      <w:r>
+        <w:rPr>
+          <w:rFonts w:ascii="TH Sarabun PSK" w:hAnsi="TH Sarabun PSK"/>
+          <w:b w:val="0"/>
+          <w:i w:val="0"/>
+          <w:color w:val="000000"/>
+          <w:sz w:val="32"/>
+        </w:rPr>
+        <w:t>ผลการค้นคืน:</w:t>
+      </w:r>
+      <w:r>
+        <w:rPr>
+          <w:rFonts w:ascii="TH Sarabun PSK" w:hAnsi="TH Sarabun PSK"/>
+          <w:i/>
+          <w:color w:val="000000"/>
+          <w:sz w:val="32"/>
+        </w:rPr>
+        <w:t xml:space="preserve"> </w:t>
+      </w:r>
+      <w:r>
+        <w:rPr>
+          <w:rFonts w:ascii="TH Sarabun PSK" w:hAnsi="TH Sarabun PSK"/>
+          <w:i/>
+          <w:color w:val="000000"/>
+          <w:sz w:val="32"/>
+        </w:rPr>
+        <w:t>`H2L-Hybrid` ทำ nDCG@5 = 0.7654</w:t>
+      </w:r>
+      <w:r>
+        <w:rPr>
+          <w:rFonts w:ascii="TH Sarabun PSK" w:hAnsi="TH Sarabun PSK"/>
+          <w:i/>
+          <w:color w:val="000000"/>
+          <w:sz w:val="32"/>
+        </w:rPr>
+        <w:t xml:space="preserve"> ในขณะที่ </w:t>
+      </w:r>
+      <w:r>
+        <w:rPr>
+          <w:rFonts w:ascii="TH Sarabun PSK" w:hAnsi="TH Sarabun PSK"/>
+          <w:i/>
+          <w:color w:val="000000"/>
+          <w:sz w:val="32"/>
+        </w:rPr>
+        <w:t>`Naive RAG` ทำ nDCG@5 = 0.2576</w:t>
+      </w:r>
+      <w:r>
+        <w:rPr>
+          <w:rFonts w:ascii="TH Sarabun PSK" w:hAnsi="TH Sarabun PSK"/>
+          <w:i/>
+          <w:color w:val="000000"/>
+          <w:sz w:val="32"/>
+        </w:rPr>
+        <w:t xml:space="preserve"> (ต่างกันถึง </w:t>
+      </w:r>
+      <w:r>
+        <w:rPr>
+          <w:rFonts w:ascii="TH Sarabun PSK" w:hAnsi="TH Sarabun PSK"/>
+          <w:i/>
+          <w:color w:val="000000"/>
+          <w:sz w:val="32"/>
+        </w:rPr>
+        <w:t>+0.5078</w:t>
+      </w:r>
+      <w:r>
+        <w:rPr>
+          <w:rFonts w:ascii="TH Sarabun PSK" w:hAnsi="TH Sarabun PSK"/>
+          <w:b w:val="0"/>
+          <w:i w:val="0"/>
+          <w:color w:val="000000"/>
+          <w:sz w:val="32"/>
+        </w:rPr>
+        <w:t>*)</w:t>
+      </w:r>
+    </w:p>
+    <w:p>
+      <w:pPr>
+        <w:spacing w:before="0" w:after="80" w:line="276" w:lineRule="auto"/>
+        <w:jc w:val="left"/>
+      </w:pPr>
+      <w:r>
+        <w:rPr>
+          <w:rFonts w:ascii="TH Sarabun PSK" w:hAnsi="TH Sarabun PSK"/>
+          <w:b w:val="0"/>
+          <w:i w:val="0"/>
+          <w:color w:val="000000"/>
+          <w:sz w:val="32"/>
+        </w:rPr>
+        <w:t xml:space="preserve">  </w:t>
+      </w:r>
+      <w:r>
+        <w:rPr>
+          <w:rFonts w:ascii="TH Sarabun PSK" w:hAnsi="TH Sarabun PSK"/>
+          <w:i/>
+          <w:color w:val="000000"/>
+          <w:sz w:val="32"/>
+        </w:rPr>
+        <w:t xml:space="preserve"> </w:t>
+      </w:r>
+      <w:r>
+        <w:rPr>
+          <w:rFonts w:ascii="TH Sarabun PSK" w:hAnsi="TH Sarabun PSK"/>
+          <w:b w:val="0"/>
+          <w:i w:val="0"/>
+          <w:color w:val="000000"/>
+          <w:sz w:val="32"/>
+        </w:rPr>
+        <w:t>อภิปรายผล:* ระบบ Naive RAG ถูกเบี่ยงเบนด้วยคำว่า "ท้องเสีย" จึงดึงเฉพาะเอกสารแนวทางรักษาโรคทางเดินอาหารขึ้นมา ส่งผลให้ nDCG@5 ต่ำเพียง 0.2576 แต่ระบบ H2L สามารถสกัดรหัสการทารุณกรรมเด็ก (</w:t>
+      </w:r>
+      <w:r>
+        <w:rPr>
+          <w:rFonts w:ascii="Courier New" w:hAnsi="Courier New"/>
+          <w:color w:val="B42828"/>
+          <w:sz w:val="30"/>
+        </w:rPr>
+        <w:t>T74</w:t>
+      </w:r>
+      <w:r>
+        <w:rPr>
+          <w:rFonts w:ascii="TH Sarabun PSK" w:hAnsi="TH Sarabun PSK"/>
+          <w:b w:val="0"/>
+          <w:i w:val="0"/>
+          <w:color w:val="000000"/>
+          <w:sz w:val="32"/>
+        </w:rPr>
+        <w:t>) ออกมาได้สำเร็จ จึงช่วยดึงเอกสารกฎหมาย พ.ร.บ. คุ้มครองเด็ก และขั้นตอนการส่งต่อสวัสดิภาพเด็กขึ้นมาเป็นเอกสารอันดับแรกๆ</w:t>
+      </w:r>
+    </w:p>
+    <w:p>
+      <w:pPr>
+        <w:spacing w:before="120" w:after="40" w:line="276" w:lineRule="auto"/>
+        <w:jc w:val="left"/>
+      </w:pPr>
+      <w:r>
+        <w:rPr>
+          <w:rFonts w:ascii="TH Sarabun PSK" w:hAnsi="TH Sarabun PSK"/>
+          <w:b/>
+          <w:color w:val="333333"/>
+          <w:sz w:val="32"/>
+        </w:rPr>
+        <w:t>สถานการณ์ที่ 3: กรณีศึกษาข้อความสั้นมากและขาดบริบทแวดล้อม (Extremely Short / Low Context Inputs)</w:t>
+      </w:r>
+    </w:p>
+    <w:p>
+      <w:pPr>
+        <w:spacing w:before="20" w:after="60" w:line="276" w:lineRule="auto"/>
+        <w:jc w:val="left"/>
+      </w:pPr>
+      <w:r>
+        <w:rPr>
+          <w:rFonts w:ascii="TH Sarabun PSK" w:hAnsi="TH Sarabun PSK"/>
+          <w:b w:val="0"/>
+          <w:i w:val="0"/>
+          <w:color w:val="000000"/>
+          <w:sz w:val="32"/>
+        </w:rPr>
+        <w:t xml:space="preserve">• </w:t>
+      </w:r>
+      <w:r>
+        <w:rPr>
+          <w:rFonts w:ascii="TH Sarabun PSK" w:hAnsi="TH Sarabun PSK"/>
+          <w:b/>
+          <w:color w:val="000000"/>
+          <w:sz w:val="32"/>
+        </w:rPr>
+        <w:t>กรณีศึกษาตัวอย่าง: `TINY_ABUSE_01` ("ถูกทำร้ายร่างกาย...") และ `TINY_MENTAL_01` ("เป็นโรคจิตเภท...")</w:t>
+      </w:r>
+    </w:p>
+    <w:p>
+      <w:pPr>
+        <w:spacing w:before="0" w:after="80" w:line="276" w:lineRule="auto"/>
+        <w:jc w:val="left"/>
+      </w:pPr>
+      <w:r>
+        <w:rPr>
+          <w:rFonts w:ascii="TH Sarabun PSK" w:hAnsi="TH Sarabun PSK"/>
+          <w:b w:val="0"/>
+          <w:i w:val="0"/>
+          <w:color w:val="000000"/>
+          <w:sz w:val="32"/>
+        </w:rPr>
+        <w:t xml:space="preserve">  </w:t>
+      </w:r>
+      <w:r>
+        <w:rPr>
+          <w:rFonts w:ascii="TH Sarabun PSK" w:hAnsi="TH Sarabun PSK"/>
+          <w:i/>
+          <w:color w:val="000000"/>
+          <w:sz w:val="32"/>
+        </w:rPr>
+        <w:t xml:space="preserve"> </w:t>
+      </w:r>
+      <w:r>
+        <w:rPr>
+          <w:rFonts w:ascii="TH Sarabun PSK" w:hAnsi="TH Sarabun PSK"/>
+          <w:b w:val="0"/>
+          <w:i w:val="0"/>
+          <w:color w:val="000000"/>
+          <w:sz w:val="32"/>
+        </w:rPr>
+        <w:t>ผลการค้นคืน:</w:t>
+      </w:r>
+      <w:r>
+        <w:rPr>
+          <w:rFonts w:ascii="TH Sarabun PSK" w:hAnsi="TH Sarabun PSK"/>
+          <w:i/>
+          <w:color w:val="000000"/>
+          <w:sz w:val="32"/>
+        </w:rPr>
+        <w:t xml:space="preserve"> ในเคส `TINY_ABUSE_01` </w:t>
+      </w:r>
+      <w:r>
+        <w:rPr>
+          <w:rFonts w:ascii="TH Sarabun PSK" w:hAnsi="TH Sarabun PSK"/>
+          <w:i/>
+          <w:color w:val="000000"/>
+          <w:sz w:val="32"/>
+        </w:rPr>
+        <w:t>`Naive RAG` ล้มเหลวโดยสิ้นเชิง (nDCG@5 = 0.0000)</w:t>
+      </w:r>
+      <w:r>
+        <w:rPr>
+          <w:rFonts w:ascii="TH Sarabun PSK" w:hAnsi="TH Sarabun PSK"/>
+          <w:i/>
+          <w:color w:val="000000"/>
+          <w:sz w:val="32"/>
+        </w:rPr>
+        <w:t xml:space="preserve"> เนื่องจากข้อความขาดบริบทแวดล้อมสำหรับการสร้าง Dense Embedding เวกเตอร์ แต่ </w:t>
+      </w:r>
+      <w:r>
+        <w:rPr>
+          <w:rFonts w:ascii="TH Sarabun PSK" w:hAnsi="TH Sarabun PSK"/>
+          <w:i/>
+          <w:color w:val="000000"/>
+          <w:sz w:val="32"/>
+        </w:rPr>
+        <w:t>`H2L-Hybrid` กู้คืนคะแนนขึ้นมาเป็น nDCG@5 = 0.5013</w:t>
+      </w:r>
+      <w:r>
+        <w:rPr>
+          <w:rFonts w:ascii="TH Sarabun PSK" w:hAnsi="TH Sarabun PSK"/>
+          <w:i/>
+          <w:color w:val="000000"/>
+          <w:sz w:val="32"/>
+        </w:rPr>
+        <w:t xml:space="preserve"> และในเคส `TINY_MENTAL_01` </w:t>
+      </w:r>
+      <w:r>
+        <w:rPr>
+          <w:rFonts w:ascii="TH Sarabun PSK" w:hAnsi="TH Sarabun PSK"/>
+          <w:i/>
+          <w:color w:val="000000"/>
+          <w:sz w:val="32"/>
+        </w:rPr>
+        <w:t>`H2L-Hybrid` ทำ nDCG@5 = 1.0000</w:t>
+      </w:r>
+      <w:r>
+        <w:rPr>
+          <w:rFonts w:ascii="TH Sarabun PSK" w:hAnsi="TH Sarabun PSK"/>
+          <w:b w:val="0"/>
+          <w:i w:val="0"/>
+          <w:color w:val="000000"/>
+          <w:sz w:val="32"/>
+        </w:rPr>
+        <w:t>* (สูงกว่า Naive RAG ที่ได้ 0.8262)</w:t>
+      </w:r>
+    </w:p>
+    <w:p>
+      <w:pPr>
+        <w:spacing w:before="0" w:after="80" w:line="276" w:lineRule="auto"/>
+        <w:jc w:val="left"/>
+      </w:pPr>
+      <w:r>
+        <w:rPr>
+          <w:rFonts w:ascii="TH Sarabun PSK" w:hAnsi="TH Sarabun PSK"/>
+          <w:b w:val="0"/>
+          <w:i w:val="0"/>
+          <w:color w:val="000000"/>
+          <w:sz w:val="32"/>
+        </w:rPr>
+        <w:t xml:space="preserve">  </w:t>
+      </w:r>
+      <w:r>
+        <w:rPr>
+          <w:rFonts w:ascii="TH Sarabun PSK" w:hAnsi="TH Sarabun PSK"/>
+          <w:i/>
+          <w:color w:val="000000"/>
+          <w:sz w:val="32"/>
+        </w:rPr>
+        <w:t xml:space="preserve"> </w:t>
+      </w:r>
+      <w:r>
+        <w:rPr>
+          <w:rFonts w:ascii="TH Sarabun PSK" w:hAnsi="TH Sarabun PSK"/>
+          <w:b w:val="0"/>
+          <w:i w:val="0"/>
+          <w:color w:val="000000"/>
+          <w:sz w:val="32"/>
+        </w:rPr>
+        <w:t>อภิปรายผล:* ข้อความสั้นเพียงไม่กี่คำสร้างปัญหารุนแรงต่อระบบ Vector Search ดั้งเดิมเพราะขาดมิติทางคำศัพท์ แต่โครงสร้าง L1-Context Map ของ H2L สามารถจับคู่หมวดหมู่ปัญหามาตรฐาน (</w:t>
+      </w:r>
+      <w:r>
+        <w:rPr>
+          <w:rFonts w:ascii="Courier New" w:hAnsi="Courier New"/>
+          <w:color w:val="B42828"/>
+          <w:sz w:val="30"/>
+        </w:rPr>
+        <w:t>T74</w:t>
+      </w:r>
+      <w:r>
+        <w:rPr>
+          <w:rFonts w:ascii="TH Sarabun PSK" w:hAnsi="TH Sarabun PSK"/>
+          <w:b w:val="0"/>
+          <w:i w:val="0"/>
+          <w:color w:val="000000"/>
+          <w:sz w:val="32"/>
+        </w:rPr>
+        <w:t xml:space="preserve"> และ </w:t>
+      </w:r>
+      <w:r>
+        <w:rPr>
+          <w:rFonts w:ascii="Courier New" w:hAnsi="Courier New"/>
+          <w:color w:val="B42828"/>
+          <w:sz w:val="30"/>
+        </w:rPr>
+        <w:t>F20</w:t>
+      </w:r>
+      <w:r>
+        <w:rPr>
+          <w:rFonts w:ascii="TH Sarabun PSK" w:hAnsi="TH Sarabun PSK"/>
+          <w:b w:val="0"/>
+          <w:i w:val="0"/>
+          <w:color w:val="000000"/>
+          <w:sz w:val="32"/>
+        </w:rPr>
+        <w:t>) ได้ทันที จึงช่วยชี้นำให้ขั้นตอน Retrieval ค้นพบเอกสารแนวทางช่วยเหลือและระเบียบสิทธิได้อย่างถูกต้อง</w:t>
+      </w:r>
+    </w:p>
+    <w:p>
+      <w:pPr>
+        <w:spacing w:before="120" w:after="40" w:line="276" w:lineRule="auto"/>
+        <w:jc w:val="left"/>
+      </w:pPr>
+      <w:r>
+        <w:rPr>
+          <w:rFonts w:ascii="TH Sarabun PSK" w:hAnsi="TH Sarabun PSK"/>
+          <w:b/>
+          <w:color w:val="333333"/>
+          <w:sz w:val="32"/>
+        </w:rPr>
+        <w:t>สถานการณ์ที่ 4: กรณีศึกษาย้อนศรประโยคปฏิเสธและบริบทลวง (Negation &amp; Sentence Polarity Control)</w:t>
+      </w:r>
+    </w:p>
+    <w:p>
+      <w:pPr>
+        <w:spacing w:before="20" w:after="60" w:line="276" w:lineRule="auto"/>
+        <w:jc w:val="left"/>
+      </w:pPr>
+      <w:r>
+        <w:rPr>
+          <w:rFonts w:ascii="TH Sarabun PSK" w:hAnsi="TH Sarabun PSK"/>
+          <w:b w:val="0"/>
+          <w:i w:val="0"/>
+          <w:color w:val="000000"/>
+          <w:sz w:val="32"/>
+        </w:rPr>
+        <w:t xml:space="preserve">• </w:t>
+      </w:r>
+      <w:r>
+        <w:rPr>
+          <w:rFonts w:ascii="TH Sarabun PSK" w:hAnsi="TH Sarabun PSK"/>
+          <w:b/>
+          <w:color w:val="000000"/>
+          <w:sz w:val="32"/>
+        </w:rPr>
+        <w:t>กรณีศึกษาตัวอย่าง: `NEG_LM_POS_V2` (ปัญหาหนี้นอกระบบจริง) เปรียบเทียบกับ `NEG_LM_NEG_V2` (ประโยคปฏิเสธหนี้)</w:t>
+      </w:r>
+    </w:p>
+    <w:p>
+      <w:pPr>
+        <w:spacing w:before="0" w:after="80" w:line="276" w:lineRule="auto"/>
+        <w:jc w:val="left"/>
+      </w:pPr>
+      <w:r>
+        <w:rPr>
+          <w:rFonts w:ascii="TH Sarabun PSK" w:hAnsi="TH Sarabun PSK"/>
+          <w:b w:val="0"/>
+          <w:i w:val="0"/>
+          <w:color w:val="000000"/>
+          <w:sz w:val="32"/>
+        </w:rPr>
+        <w:t xml:space="preserve">  </w:t>
+      </w:r>
+      <w:r>
+        <w:rPr>
+          <w:rFonts w:ascii="TH Sarabun PSK" w:hAnsi="TH Sarabun PSK"/>
+          <w:i/>
+          <w:color w:val="000000"/>
+          <w:sz w:val="32"/>
+        </w:rPr>
+        <w:t xml:space="preserve"> </w:t>
+      </w:r>
+      <w:r>
+        <w:rPr>
+          <w:rFonts w:ascii="TH Sarabun PSK" w:hAnsi="TH Sarabun PSK"/>
+          <w:b w:val="0"/>
+          <w:i w:val="0"/>
+          <w:color w:val="000000"/>
+          <w:sz w:val="32"/>
+        </w:rPr>
+        <w:t xml:space="preserve">ข้อความเคส </w:t>
+      </w:r>
+      <w:r>
+        <w:rPr>
+          <w:rFonts w:ascii="Courier New" w:hAnsi="Courier New"/>
+          <w:color w:val="B42828"/>
+          <w:sz w:val="30"/>
+        </w:rPr>
+        <w:t>NEG_LM_POS_V2</w:t>
+      </w:r>
+      <w:r>
+        <w:rPr>
+          <w:rFonts w:ascii="TH Sarabun PSK" w:hAnsi="TH Sarabun PSK"/>
+          <w:b w:val="0"/>
+          <w:i w:val="0"/>
+          <w:color w:val="000000"/>
+          <w:sz w:val="32"/>
+        </w:rPr>
+        <w:t>:</w:t>
+      </w:r>
+      <w:r>
+        <w:rPr>
+          <w:rFonts w:ascii="TH Sarabun PSK" w:hAnsi="TH Sarabun PSK"/>
+          <w:i/>
+          <w:color w:val="000000"/>
+          <w:sz w:val="32"/>
+        </w:rPr>
+        <w:t xml:space="preserve"> "ครอบครัววิกฤตหนัก พ่อแม่ไปเล่นพนันเพื่อหาทางรอดแต่กลับเป็นหนี้นอกระบบหลายแสน มีแก๊งทวงหนี้มาข่มขู่..." -&gt; </w:t>
+      </w:r>
+      <w:r>
+        <w:rPr>
+          <w:rFonts w:ascii="TH Sarabun PSK" w:hAnsi="TH Sarabun PSK"/>
+          <w:i/>
+          <w:color w:val="000000"/>
+          <w:sz w:val="32"/>
+        </w:rPr>
+        <w:t>`H2L-Hybrid` ได้ nDCG@5 = 1.0000</w:t>
+      </w:r>
+      <w:r>
+        <w:rPr>
+          <w:rFonts w:ascii="TH Sarabun PSK" w:hAnsi="TH Sarabun PSK"/>
+          <w:b w:val="0"/>
+          <w:i w:val="0"/>
+          <w:color w:val="000000"/>
+          <w:sz w:val="32"/>
+        </w:rPr>
+        <w:t>* (Naive RAG ได้ 0.6131)</w:t>
+      </w:r>
+    </w:p>
+    <w:p>
+      <w:pPr>
+        <w:spacing w:before="0" w:after="80" w:line="276" w:lineRule="auto"/>
+        <w:jc w:val="left"/>
+      </w:pPr>
+      <w:r>
+        <w:rPr>
+          <w:rFonts w:ascii="TH Sarabun PSK" w:hAnsi="TH Sarabun PSK"/>
+          <w:b w:val="0"/>
+          <w:i w:val="0"/>
+          <w:color w:val="000000"/>
+          <w:sz w:val="32"/>
+        </w:rPr>
+        <w:t xml:space="preserve">  </w:t>
+      </w:r>
+      <w:r>
+        <w:rPr>
+          <w:rFonts w:ascii="TH Sarabun PSK" w:hAnsi="TH Sarabun PSK"/>
+          <w:i/>
+          <w:color w:val="000000"/>
+          <w:sz w:val="32"/>
+        </w:rPr>
+        <w:t xml:space="preserve"> </w:t>
+      </w:r>
+      <w:r>
+        <w:rPr>
+          <w:rFonts w:ascii="TH Sarabun PSK" w:hAnsi="TH Sarabun PSK"/>
+          <w:b w:val="0"/>
+          <w:i w:val="0"/>
+          <w:color w:val="000000"/>
+          <w:sz w:val="32"/>
+        </w:rPr>
+        <w:t xml:space="preserve">ข้อความเคส </w:t>
+      </w:r>
+      <w:r>
+        <w:rPr>
+          <w:rFonts w:ascii="Courier New" w:hAnsi="Courier New"/>
+          <w:color w:val="B42828"/>
+          <w:sz w:val="30"/>
+        </w:rPr>
+        <w:t>NEG_LM_NEG_V2</w:t>
+      </w:r>
+      <w:r>
+        <w:rPr>
+          <w:rFonts w:ascii="TH Sarabun PSK" w:hAnsi="TH Sarabun PSK"/>
+          <w:b w:val="0"/>
+          <w:i w:val="0"/>
+          <w:color w:val="000000"/>
+          <w:sz w:val="32"/>
+        </w:rPr>
+        <w:t>:* "ญาติระบุว่าบ้านนี้ไม่ได้มีหนี้นอกระบบเลย ปฏิเสธว่าไม่เคยเล่นพนัน เรื่องแก๊งทวงหนี้มาข่มขู่ไม่เป็นความจริง..."</w:t>
+      </w:r>
+    </w:p>
+    <w:p>
+      <w:pPr>
+        <w:spacing w:before="0" w:after="80" w:line="276" w:lineRule="auto"/>
+        <w:jc w:val="left"/>
+      </w:pPr>
+      <w:r>
+        <w:rPr>
+          <w:rFonts w:ascii="TH Sarabun PSK" w:hAnsi="TH Sarabun PSK"/>
+          <w:b w:val="0"/>
+          <w:i w:val="0"/>
+          <w:color w:val="000000"/>
+          <w:sz w:val="32"/>
+        </w:rPr>
+        <w:t xml:space="preserve">  </w:t>
+      </w:r>
+      <w:r>
+        <w:rPr>
+          <w:rFonts w:ascii="TH Sarabun PSK" w:hAnsi="TH Sarabun PSK"/>
+          <w:i/>
+          <w:color w:val="000000"/>
+          <w:sz w:val="32"/>
+        </w:rPr>
+        <w:t xml:space="preserve"> </w:t>
+      </w:r>
+      <w:r>
+        <w:rPr>
+          <w:rFonts w:ascii="TH Sarabun PSK" w:hAnsi="TH Sarabun PSK"/>
+          <w:b w:val="0"/>
+          <w:i w:val="0"/>
+          <w:color w:val="000000"/>
+          <w:sz w:val="32"/>
+        </w:rPr>
+        <w:t xml:space="preserve">อภิปรายผล:* ในเคสปฏิเสธ </w:t>
+      </w:r>
+      <w:r>
+        <w:rPr>
+          <w:rFonts w:ascii="Courier New" w:hAnsi="Courier New"/>
+          <w:color w:val="B42828"/>
+          <w:sz w:val="30"/>
+        </w:rPr>
+        <w:t>NEG_LM_NEG_V2</w:t>
+      </w:r>
+      <w:r>
+        <w:rPr>
+          <w:rFonts w:ascii="TH Sarabun PSK" w:hAnsi="TH Sarabun PSK"/>
+          <w:b w:val="0"/>
+          <w:i w:val="0"/>
+          <w:color w:val="000000"/>
+          <w:sz w:val="32"/>
+        </w:rPr>
+        <w:t xml:space="preserve"> ระบบ H2L Polarity Gate สามารถตรวจจับคำปฏิเสธ ("ไม่ได้มี", "ปฏิเสธว่า", "ไม่เป็นความจริง") และสั่งยับยั้ง (Suppress) รหัสปัญหา </w:t>
+      </w:r>
+      <w:r>
+        <w:rPr>
+          <w:rFonts w:ascii="Courier New" w:hAnsi="Courier New"/>
+          <w:color w:val="B42828"/>
+          <w:sz w:val="30"/>
+        </w:rPr>
+        <w:t>1002</w:t>
+      </w:r>
+      <w:r>
+        <w:rPr>
+          <w:rFonts w:ascii="TH Sarabun PSK" w:hAnsi="TH Sarabun PSK"/>
+          <w:b w:val="0"/>
+          <w:i w:val="0"/>
+          <w:color w:val="000000"/>
+          <w:sz w:val="32"/>
+        </w:rPr>
+        <w:t xml:space="preserve"> (หนี้นอกระบบ) ได้สำเร็จ ป้องกันไม่ให้ระบบดึงเอกสารช่วยเหลือหนี้นอกระบบมาแนะนำผิดพลาด ซึ่งระบบ Naive RAG ดั้งเดิมไม่สามารถทำได้</w:t>
+      </w:r>
+    </w:p>
+    <w:p>
+      <w:pPr>
+        <w:spacing w:before="120" w:after="40" w:line="276" w:lineRule="auto"/>
+        <w:jc w:val="left"/>
+      </w:pPr>
+      <w:r>
+        <w:rPr>
+          <w:rFonts w:ascii="TH Sarabun PSK" w:hAnsi="TH Sarabun PSK"/>
+          <w:b/>
+          <w:color w:val="333333"/>
+          <w:sz w:val="32"/>
+        </w:rPr>
+        <w:t>สถานการณ์ที่ 5: ปรากฏการณ์ Over-filtering และการกู้คืนด้วย Hybrid Reranking (Over-filtering Bottlenecks &amp; Recovery)</w:t>
+      </w:r>
+    </w:p>
+    <w:p>
+      <w:pPr>
+        <w:spacing w:before="20" w:after="60" w:line="276" w:lineRule="auto"/>
+        <w:jc w:val="left"/>
+      </w:pPr>
+      <w:r>
+        <w:rPr>
+          <w:rFonts w:ascii="TH Sarabun PSK" w:hAnsi="TH Sarabun PSK"/>
+          <w:b w:val="0"/>
+          <w:i w:val="0"/>
+          <w:color w:val="000000"/>
+          <w:sz w:val="32"/>
+        </w:rPr>
+        <w:t xml:space="preserve">• </w:t>
+      </w:r>
+      <w:r>
+        <w:rPr>
+          <w:rFonts w:ascii="TH Sarabun PSK" w:hAnsi="TH Sarabun PSK"/>
+          <w:b/>
+          <w:color w:val="000000"/>
+          <w:sz w:val="32"/>
+        </w:rPr>
+        <w:t>กรณีศึกษาตัวอย่าง: `SHORT_ELDER_01`</w:t>
+      </w:r>
+    </w:p>
+    <w:p>
+      <w:pPr>
+        <w:spacing w:before="0" w:after="80" w:line="276" w:lineRule="auto"/>
+        <w:jc w:val="left"/>
+      </w:pPr>
+      <w:r>
+        <w:rPr>
+          <w:rFonts w:ascii="TH Sarabun PSK" w:hAnsi="TH Sarabun PSK"/>
+          <w:b w:val="0"/>
+          <w:i w:val="0"/>
+          <w:color w:val="000000"/>
+          <w:sz w:val="32"/>
+        </w:rPr>
+        <w:t xml:space="preserve">  </w:t>
+      </w:r>
+      <w:r>
+        <w:rPr>
+          <w:rFonts w:ascii="TH Sarabun PSK" w:hAnsi="TH Sarabun PSK"/>
+          <w:i/>
+          <w:color w:val="000000"/>
+          <w:sz w:val="32"/>
+        </w:rPr>
+        <w:t xml:space="preserve"> </w:t>
+      </w:r>
+      <w:r>
+        <w:rPr>
+          <w:rFonts w:ascii="TH Sarabun PSK" w:hAnsi="TH Sarabun PSK"/>
+          <w:b w:val="0"/>
+          <w:i w:val="0"/>
+          <w:color w:val="000000"/>
+          <w:sz w:val="32"/>
+        </w:rPr>
+        <w:t>ข้อความเคส:* "ผู้ป่วยหญิงอายุ 78 ปี เป็นโรคหลอดเลือดสมอง ติดเตียง มีแผลเบาหวานที่เท้า..."</w:t>
+      </w:r>
+    </w:p>
+    <w:p>
+      <w:pPr>
+        <w:spacing w:before="0" w:after="80" w:line="276" w:lineRule="auto"/>
+        <w:jc w:val="left"/>
+      </w:pPr>
+      <w:r>
+        <w:rPr>
+          <w:rFonts w:ascii="TH Sarabun PSK" w:hAnsi="TH Sarabun PSK"/>
+          <w:b w:val="0"/>
+          <w:i w:val="0"/>
+          <w:color w:val="000000"/>
+          <w:sz w:val="32"/>
+        </w:rPr>
+        <w:t xml:space="preserve">  </w:t>
+      </w:r>
+      <w:r>
+        <w:rPr>
+          <w:rFonts w:ascii="TH Sarabun PSK" w:hAnsi="TH Sarabun PSK"/>
+          <w:i/>
+          <w:color w:val="000000"/>
+          <w:sz w:val="32"/>
+        </w:rPr>
+        <w:t xml:space="preserve"> </w:t>
+      </w:r>
+      <w:r>
+        <w:rPr>
+          <w:rFonts w:ascii="TH Sarabun PSK" w:hAnsi="TH Sarabun PSK"/>
+          <w:b w:val="0"/>
+          <w:i w:val="0"/>
+          <w:color w:val="000000"/>
+          <w:sz w:val="32"/>
+        </w:rPr>
+        <w:t xml:space="preserve">Expected Taxonomy:* </w:t>
+      </w:r>
+      <w:r>
+        <w:rPr>
+          <w:rFonts w:ascii="Courier New" w:hAnsi="Courier New"/>
+          <w:color w:val="B42828"/>
+          <w:sz w:val="30"/>
+        </w:rPr>
+        <w:t>['I64', 'E11.5']</w:t>
+      </w:r>
+    </w:p>
+    <w:p>
+      <w:pPr>
+        <w:spacing w:before="0" w:after="80" w:line="276" w:lineRule="auto"/>
+        <w:jc w:val="left"/>
+      </w:pPr>
+      <w:r>
+        <w:rPr>
+          <w:rFonts w:ascii="TH Sarabun PSK" w:hAnsi="TH Sarabun PSK"/>
+          <w:b w:val="0"/>
+          <w:i w:val="0"/>
+          <w:color w:val="000000"/>
+          <w:sz w:val="32"/>
+        </w:rPr>
+        <w:t xml:space="preserve">  </w:t>
+      </w:r>
+      <w:r>
+        <w:rPr>
+          <w:rFonts w:ascii="TH Sarabun PSK" w:hAnsi="TH Sarabun PSK"/>
+          <w:i/>
+          <w:color w:val="000000"/>
+          <w:sz w:val="32"/>
+        </w:rPr>
+        <w:t xml:space="preserve"> </w:t>
+      </w:r>
+      <w:r>
+        <w:rPr>
+          <w:rFonts w:ascii="TH Sarabun PSK" w:hAnsi="TH Sarabun PSK"/>
+          <w:b w:val="0"/>
+          <w:i w:val="0"/>
+          <w:color w:val="000000"/>
+          <w:sz w:val="32"/>
+        </w:rPr>
+        <w:t>ผลการประเมิน:</w:t>
+      </w:r>
+      <w:r>
+        <w:rPr>
+          <w:rFonts w:ascii="TH Sarabun PSK" w:hAnsi="TH Sarabun PSK"/>
+          <w:i/>
+          <w:color w:val="000000"/>
+          <w:sz w:val="32"/>
+        </w:rPr>
+        <w:t xml:space="preserve"> </w:t>
+      </w:r>
+      <w:r>
+        <w:rPr>
+          <w:rFonts w:ascii="TH Sarabun PSK" w:hAnsi="TH Sarabun PSK"/>
+          <w:i/>
+          <w:color w:val="000000"/>
+          <w:sz w:val="32"/>
+        </w:rPr>
+        <w:t>`BM25 Only` ทำ nDCG@5 = 1.0000</w:t>
+      </w:r>
+      <w:r>
+        <w:rPr>
+          <w:rFonts w:ascii="TH Sarabun PSK" w:hAnsi="TH Sarabun PSK"/>
+          <w:i/>
+          <w:color w:val="000000"/>
+          <w:sz w:val="32"/>
+        </w:rPr>
+        <w:t xml:space="preserve">, </w:t>
+      </w:r>
+      <w:r>
+        <w:rPr>
+          <w:rFonts w:ascii="TH Sarabun PSK" w:hAnsi="TH Sarabun PSK"/>
+          <w:i/>
+          <w:color w:val="000000"/>
+          <w:sz w:val="32"/>
+        </w:rPr>
+        <w:t>`H2L-BM25` ลดลงเหลือ `0.6309`</w:t>
+      </w:r>
+      <w:r>
+        <w:rPr>
+          <w:rFonts w:ascii="TH Sarabun PSK" w:hAnsi="TH Sarabun PSK"/>
+          <w:i/>
+          <w:color w:val="000000"/>
+          <w:sz w:val="32"/>
+        </w:rPr>
+        <w:t xml:space="preserve"> แต่ </w:t>
+      </w:r>
+      <w:r>
+        <w:rPr>
+          <w:rFonts w:ascii="TH Sarabun PSK" w:hAnsi="TH Sarabun PSK"/>
+          <w:i/>
+          <w:color w:val="000000"/>
+          <w:sz w:val="32"/>
+        </w:rPr>
+        <w:t>`H2L-Hybrid` ดึงคะแนนกลับมาเป็น `1.0000` สมบูรณ์</w:t>
+      </w:r>
+      <w:r>
+        <w:rPr>
+          <w:rFonts w:ascii="TH Sarabun PSK" w:hAnsi="TH Sarabun PSK"/>
+          <w:i/>
+          <w:color w:val="000000"/>
+          <w:sz w:val="32"/>
+        </w:rPr>
+      </w:r>
+    </w:p>
+    <w:p>
+      <w:pPr>
+        <w:spacing w:before="0" w:after="80" w:line="276" w:lineRule="auto"/>
+        <w:jc w:val="left"/>
+      </w:pPr>
+      <w:r>
+        <w:rPr>
+          <w:rFonts w:ascii="TH Sarabun PSK" w:hAnsi="TH Sarabun PSK"/>
+          <w:b w:val="0"/>
+          <w:i w:val="0"/>
+          <w:color w:val="000000"/>
+          <w:sz w:val="32"/>
+        </w:rPr>
+        <w:t xml:space="preserve">  </w:t>
+      </w:r>
+      <w:r>
+        <w:rPr>
+          <w:rFonts w:ascii="TH Sarabun PSK" w:hAnsi="TH Sarabun PSK"/>
+          <w:i/>
+          <w:color w:val="000000"/>
+          <w:sz w:val="32"/>
+        </w:rPr>
+        <w:t xml:space="preserve"> </w:t>
+      </w:r>
+      <w:r>
+        <w:rPr>
+          <w:rFonts w:ascii="TH Sarabun PSK" w:hAnsi="TH Sarabun PSK"/>
+          <w:b w:val="0"/>
+          <w:i w:val="0"/>
+          <w:color w:val="000000"/>
+          <w:sz w:val="32"/>
+        </w:rPr>
+        <w:t>อภิปรายผล:</w:t>
+      </w:r>
+      <w:r>
+        <w:rPr>
+          <w:rFonts w:ascii="TH Sarabun PSK" w:hAnsi="TH Sarabun PSK"/>
+          <w:i/>
+          <w:color w:val="000000"/>
+          <w:sz w:val="32"/>
+        </w:rPr>
+        <w:t xml:space="preserve"> แสดงให้เห็นปรากฏการณ์ Over-filtering เมื่อใช้ H2L ร่วมกับ BM25 ล้วนๆ เพราะ H2L ไปจำกัด Sub-corpus ให้แคบลงตามหมวดหมู่เสริมที่ตรวจพบ ตัดเอกสารเบาหวานแบบกว้างของ BM25 ออกไปบางส่วน อย่างไรก็ตาม เมื่อใช้สถาปัตยกรรม `H2L-Hybrid` ตัว Dense Reranker ในขั้นตอนสุดท้ายสามารถชดเชยและจัดลำดับเอกสารเบาหวานกลับขึ้นมาเป็นอันดับหนึ่งได้ ชี้ให้เห็นว่า </w:t>
+      </w:r>
+      <w:r>
+        <w:rPr>
+          <w:rFonts w:ascii="TH Sarabun PSK" w:hAnsi="TH Sarabun PSK"/>
+          <w:i/>
+          <w:color w:val="000000"/>
+          <w:sz w:val="32"/>
+        </w:rPr>
+        <w:t>Hybrid Reranking ช่วยขจัดจุดอ่อนของการ Over-filtering ได้อย่างสมบูรณ์</w:t>
+      </w:r>
+      <w:r>
+        <w:rPr>
+          <w:rFonts w:ascii="TH Sarabun PSK" w:hAnsi="TH Sarabun PSK"/>
+          <w:i/>
+          <w:color w:val="000000"/>
+          <w:sz w:val="32"/>
+        </w:rPr>
+      </w:r>
+    </w:p>
+    <w:p>
+      <w:pPr>
+        <w:spacing w:before="120" w:after="40" w:line="276" w:lineRule="auto"/>
+        <w:jc w:val="left"/>
+      </w:pPr>
+      <w:r>
+        <w:rPr>
+          <w:rFonts w:ascii="TH Sarabun PSK" w:hAnsi="TH Sarabun PSK"/>
+          <w:b/>
+          <w:color w:val="333333"/>
+          <w:sz w:val="32"/>
+        </w:rPr>
+        <w:t>สถานการณ์ที่ 6: คีย์เวิร์ดลวงและการกด False Positive (Adversarial Distractors &amp; False Positive Suppression)</w:t>
+      </w:r>
+    </w:p>
+    <w:p>
+      <w:pPr>
+        <w:spacing w:before="20" w:after="60" w:line="276" w:lineRule="auto"/>
+        <w:jc w:val="left"/>
+      </w:pPr>
+      <w:r>
+        <w:rPr>
+          <w:rFonts w:ascii="TH Sarabun PSK" w:hAnsi="TH Sarabun PSK"/>
+          <w:b w:val="0"/>
+          <w:i w:val="0"/>
+          <w:color w:val="000000"/>
+          <w:sz w:val="32"/>
+        </w:rPr>
+        <w:t xml:space="preserve">• </w:t>
+      </w:r>
+      <w:r>
+        <w:rPr>
+          <w:rFonts w:ascii="TH Sarabun PSK" w:hAnsi="TH Sarabun PSK"/>
+          <w:b/>
+          <w:color w:val="000000"/>
+          <w:sz w:val="32"/>
+        </w:rPr>
+        <w:t>กรณีศึกษาตัวอย่าง: `ADV_009`</w:t>
+      </w:r>
+    </w:p>
+    <w:p>
+      <w:pPr>
+        <w:spacing w:before="0" w:after="80" w:line="276" w:lineRule="auto"/>
+        <w:jc w:val="left"/>
+      </w:pPr>
+      <w:r>
+        <w:rPr>
+          <w:rFonts w:ascii="TH Sarabun PSK" w:hAnsi="TH Sarabun PSK"/>
+          <w:b w:val="0"/>
+          <w:i w:val="0"/>
+          <w:color w:val="000000"/>
+          <w:sz w:val="32"/>
+        </w:rPr>
+        <w:t xml:space="preserve">  </w:t>
+      </w:r>
+      <w:r>
+        <w:rPr>
+          <w:rFonts w:ascii="TH Sarabun PSK" w:hAnsi="TH Sarabun PSK"/>
+          <w:i/>
+          <w:color w:val="000000"/>
+          <w:sz w:val="32"/>
+        </w:rPr>
+        <w:t xml:space="preserve"> </w:t>
+      </w:r>
+      <w:r>
+        <w:rPr>
+          <w:rFonts w:ascii="TH Sarabun PSK" w:hAnsi="TH Sarabun PSK"/>
+          <w:b w:val="0"/>
+          <w:i w:val="0"/>
+          <w:color w:val="000000"/>
+          <w:sz w:val="32"/>
+        </w:rPr>
+        <w:t>ข้อความเคส:* "ผู้รับบริการซึ่งเป็นครูใช้คลิปจำลองการทำร้ายร่างกายในการอบรม ไม่ได้เกิดเหตุกับตนเอง แต่กำลังถูกทวงหนี้นอกระบบและค้างชำระหลายเดือน..."</w:t>
+      </w:r>
+    </w:p>
+    <w:p>
+      <w:pPr>
+        <w:spacing w:before="0" w:after="80" w:line="276" w:lineRule="auto"/>
+        <w:jc w:val="left"/>
+      </w:pPr>
+      <w:r>
+        <w:rPr>
+          <w:rFonts w:ascii="TH Sarabun PSK" w:hAnsi="TH Sarabun PSK"/>
+          <w:b w:val="0"/>
+          <w:i w:val="0"/>
+          <w:color w:val="000000"/>
+          <w:sz w:val="32"/>
+        </w:rPr>
+        <w:t xml:space="preserve">  </w:t>
+      </w:r>
+      <w:r>
+        <w:rPr>
+          <w:rFonts w:ascii="TH Sarabun PSK" w:hAnsi="TH Sarabun PSK"/>
+          <w:i/>
+          <w:color w:val="000000"/>
+          <w:sz w:val="32"/>
+        </w:rPr>
+        <w:t xml:space="preserve"> </w:t>
+      </w:r>
+      <w:r>
+        <w:rPr>
+          <w:rFonts w:ascii="TH Sarabun PSK" w:hAnsi="TH Sarabun PSK"/>
+          <w:b w:val="0"/>
+          <w:i w:val="0"/>
+          <w:color w:val="000000"/>
+          <w:sz w:val="32"/>
+        </w:rPr>
+        <w:t xml:space="preserve">Expected Taxonomy:* </w:t>
+      </w:r>
+      <w:r>
+        <w:rPr>
+          <w:rFonts w:ascii="Courier New" w:hAnsi="Courier New"/>
+          <w:color w:val="B42828"/>
+          <w:sz w:val="30"/>
+        </w:rPr>
+        <w:t>['1002']</w:t>
+      </w:r>
+      <w:r>
+        <w:rPr>
+          <w:rFonts w:ascii="TH Sarabun PSK" w:hAnsi="TH Sarabun PSK"/>
+          <w:b w:val="0"/>
+          <w:i w:val="0"/>
+          <w:color w:val="000000"/>
+          <w:sz w:val="32"/>
+        </w:rPr>
+        <w:t xml:space="preserve"> (หนี้นอกระบบเท่านั้น)</w:t>
+      </w:r>
+    </w:p>
+    <w:p>
+      <w:pPr>
+        <w:spacing w:before="0" w:after="80" w:line="276" w:lineRule="auto"/>
+        <w:jc w:val="left"/>
+      </w:pPr>
+      <w:r>
+        <w:rPr>
+          <w:rFonts w:ascii="TH Sarabun PSK" w:hAnsi="TH Sarabun PSK"/>
+          <w:b w:val="0"/>
+          <w:i w:val="0"/>
+          <w:color w:val="000000"/>
+          <w:sz w:val="32"/>
+        </w:rPr>
+        <w:t xml:space="preserve">  </w:t>
+      </w:r>
+      <w:r>
+        <w:rPr>
+          <w:rFonts w:ascii="TH Sarabun PSK" w:hAnsi="TH Sarabun PSK"/>
+          <w:i/>
+          <w:color w:val="000000"/>
+          <w:sz w:val="32"/>
+        </w:rPr>
+        <w:t xml:space="preserve"> </w:t>
+      </w:r>
+      <w:r>
+        <w:rPr>
+          <w:rFonts w:ascii="TH Sarabun PSK" w:hAnsi="TH Sarabun PSK"/>
+          <w:b w:val="0"/>
+          <w:i w:val="0"/>
+          <w:color w:val="000000"/>
+          <w:sz w:val="32"/>
+        </w:rPr>
+        <w:t>ผลการประเมิน:</w:t>
+      </w:r>
+      <w:r>
+        <w:rPr>
+          <w:rFonts w:ascii="TH Sarabun PSK" w:hAnsi="TH Sarabun PSK"/>
+          <w:i/>
+          <w:color w:val="000000"/>
+          <w:sz w:val="32"/>
+        </w:rPr>
+        <w:t xml:space="preserve"> </w:t>
+      </w:r>
+      <w:r>
+        <w:rPr>
+          <w:rFonts w:ascii="TH Sarabun PSK" w:hAnsi="TH Sarabun PSK"/>
+          <w:i/>
+          <w:color w:val="000000"/>
+          <w:sz w:val="32"/>
+        </w:rPr>
+        <w:t>`H2L-BM25` ได้ nDCG@5 = 0.5000</w:t>
+      </w:r>
+      <w:r>
+        <w:rPr>
+          <w:rFonts w:ascii="TH Sarabun PSK" w:hAnsi="TH Sarabun PSK"/>
+          <w:i/>
+          <w:color w:val="000000"/>
+          <w:sz w:val="32"/>
+        </w:rPr>
+        <w:t xml:space="preserve"> (โดนรหัส `T74` ลวง) แต่ </w:t>
+      </w:r>
+      <w:r>
+        <w:rPr>
+          <w:rFonts w:ascii="TH Sarabun PSK" w:hAnsi="TH Sarabun PSK"/>
+          <w:i/>
+          <w:color w:val="000000"/>
+          <w:sz w:val="32"/>
+        </w:rPr>
+        <w:t>`H2L-Hybrid` ได้ nDCG@5 = 1.0000</w:t>
+      </w:r>
+      <w:r>
+        <w:rPr>
+          <w:rFonts w:ascii="TH Sarabun PSK" w:hAnsi="TH Sarabun PSK"/>
+          <w:i/>
+          <w:color w:val="000000"/>
+          <w:sz w:val="32"/>
+        </w:rPr>
+      </w:r>
+    </w:p>
+    <w:p>
+      <w:pPr>
+        <w:spacing w:before="0" w:after="80" w:line="276" w:lineRule="auto"/>
+        <w:jc w:val="left"/>
+      </w:pPr>
+      <w:r>
+        <w:rPr>
+          <w:rFonts w:ascii="TH Sarabun PSK" w:hAnsi="TH Sarabun PSK"/>
+          <w:b w:val="0"/>
+          <w:i w:val="0"/>
+          <w:color w:val="000000"/>
+          <w:sz w:val="32"/>
+        </w:rPr>
+        <w:t xml:space="preserve">  </w:t>
+      </w:r>
+      <w:r>
+        <w:rPr>
+          <w:rFonts w:ascii="TH Sarabun PSK" w:hAnsi="TH Sarabun PSK"/>
+          <w:i/>
+          <w:color w:val="000000"/>
+          <w:sz w:val="32"/>
+        </w:rPr>
+        <w:t xml:space="preserve"> </w:t>
+      </w:r>
+      <w:r>
+        <w:rPr>
+          <w:rFonts w:ascii="TH Sarabun PSK" w:hAnsi="TH Sarabun PSK"/>
+          <w:b w:val="0"/>
+          <w:i w:val="0"/>
+          <w:color w:val="000000"/>
+          <w:sz w:val="32"/>
+        </w:rPr>
+        <w:t xml:space="preserve">อภิปรายผล:* ในกรณีที่มีคีย์เวิร์ดลวง ("ทำร้ายร่างกาย" ในบริบทการสอน) L1 Detector อาจสกัดรหัส </w:t>
+      </w:r>
+      <w:r>
+        <w:rPr>
+          <w:rFonts w:ascii="Courier New" w:hAnsi="Courier New"/>
+          <w:color w:val="B42828"/>
+          <w:sz w:val="30"/>
+        </w:rPr>
+        <w:t>T74</w:t>
+      </w:r>
+      <w:r>
+        <w:rPr>
+          <w:rFonts w:ascii="TH Sarabun PSK" w:hAnsi="TH Sarabun PSK"/>
+          <w:b w:val="0"/>
+          <w:i w:val="0"/>
+          <w:color w:val="000000"/>
+          <w:sz w:val="32"/>
+        </w:rPr>
+        <w:t xml:space="preserve"> ติดเข้ามา ส่งผลให้ BM25 ดึงเอกสารเรื่องความรุนแรงปะปนเข้ามา แต่โครงสร้าง </w:t>
+      </w:r>
+      <w:r>
+        <w:rPr>
+          <w:rFonts w:ascii="Courier New" w:hAnsi="Courier New"/>
+          <w:color w:val="B42828"/>
+          <w:sz w:val="30"/>
+        </w:rPr>
+        <w:t>H2L-Hybrid</w:t>
+      </w:r>
+      <w:r>
+        <w:rPr>
+          <w:rFonts w:ascii="TH Sarabun PSK" w:hAnsi="TH Sarabun PSK"/>
+          <w:b w:val="0"/>
+          <w:i w:val="0"/>
+          <w:color w:val="000000"/>
+          <w:sz w:val="32"/>
+        </w:rPr>
+        <w:t xml:space="preserve"> ใช้ Cross-Encoder Reranker ทำการคัดแยกบริบทความหมายที่แท้จริง ตัด Noise ออก และดันเอกสารหนี้นอกระบบขึ้นสู่อันดับ 1 ได้อย่างแม่นยำ</w:t>
+      </w:r>
+    </w:p>
+    <w:p>
+      <w:pPr>
+        <w:spacing w:before="120" w:after="120"/>
+        <w:pBdr>
+          <w:bottom w:val="single" w:sz="6" w:space="1" w:color="CCCCCC"/>
+        </w:pBdr>
+      </w:pPr>
+    </w:p>
+    <w:p>
+      <w:pPr>
+        <w:spacing w:before="160" w:after="60" w:line="276" w:lineRule="auto"/>
+        <w:jc w:val="left"/>
+      </w:pPr>
+      <w:r>
+        <w:rPr>
+          <w:rFonts w:ascii="TH Sarabun PSK" w:hAnsi="TH Sarabun PSK"/>
+          <w:b/>
+          <w:i w:val="0"/>
+          <w:color w:val="003366"/>
+          <w:sz w:val="32"/>
+        </w:rPr>
+        <w:t>5.2.3 ความเสถียรของโมเดลข้ามสถาปัตยกรรม (Cross-Model Multi-Run Stability)</w:t>
+      </w:r>
+    </w:p>
+    <w:p>
+      <w:pPr>
+        <w:spacing w:before="0" w:after="80" w:line="276" w:lineRule="auto"/>
+        <w:jc w:val="left"/>
+      </w:pPr>
+      <w:r>
+        <w:rPr>
+          <w:rFonts w:ascii="TH Sarabun PSK" w:hAnsi="TH Sarabun PSK"/>
+          <w:b w:val="0"/>
+          <w:i w:val="0"/>
+          <w:color w:val="000000"/>
+          <w:sz w:val="32"/>
+        </w:rPr>
+        <w:t>ผลการประเมินข้ามโมเดลภาษาขนาดใหญ่ 3 โมเดล (</w:t>
+      </w:r>
+      <w:r>
+        <w:rPr>
+          <w:rFonts w:ascii="Courier New" w:hAnsi="Courier New"/>
+          <w:color w:val="B42828"/>
+          <w:sz w:val="30"/>
+        </w:rPr>
+        <w:t>Qwen2.5-7B</w:t>
+      </w:r>
+      <w:r>
+        <w:rPr>
+          <w:rFonts w:ascii="TH Sarabun PSK" w:hAnsi="TH Sarabun PSK"/>
+          <w:b w:val="0"/>
+          <w:i w:val="0"/>
+          <w:color w:val="000000"/>
+          <w:sz w:val="32"/>
+        </w:rPr>
+        <w:t xml:space="preserve">, </w:t>
+      </w:r>
+      <w:r>
+        <w:rPr>
+          <w:rFonts w:ascii="Courier New" w:hAnsi="Courier New"/>
+          <w:color w:val="B42828"/>
+          <w:sz w:val="30"/>
+        </w:rPr>
+        <w:t>Typhoon2-8B</w:t>
+      </w:r>
+      <w:r>
+        <w:rPr>
+          <w:rFonts w:ascii="TH Sarabun PSK" w:hAnsi="TH Sarabun PSK"/>
+          <w:b w:val="0"/>
+          <w:i w:val="0"/>
+          <w:color w:val="000000"/>
+          <w:sz w:val="32"/>
+        </w:rPr>
+        <w:t xml:space="preserve">, </w:t>
+      </w:r>
+      <w:r>
+        <w:rPr>
+          <w:rFonts w:ascii="Courier New" w:hAnsi="Courier New"/>
+          <w:color w:val="B42828"/>
+          <w:sz w:val="30"/>
+        </w:rPr>
+        <w:t>Typhoon-Gemma3-4B</w:t>
+      </w:r>
+      <w:r>
+        <w:rPr>
+          <w:rFonts w:ascii="TH Sarabun PSK" w:hAnsi="TH Sarabun PSK"/>
+          <w:b w:val="0"/>
+          <w:i w:val="0"/>
+          <w:color w:val="000000"/>
+          <w:sz w:val="32"/>
+        </w:rPr>
+        <w:t>) บนการรันประมวลผลซ้ำ 3 รอบ แสดงให้เห็นว่า:</w:t>
+      </w:r>
+    </w:p>
+    <w:p>
+      <w:pPr>
+        <w:spacing w:before="20" w:after="60" w:line="276" w:lineRule="auto"/>
+        <w:jc w:val="left"/>
+      </w:pPr>
+      <w:r>
+        <w:rPr>
+          <w:rFonts w:ascii="TH Sarabun PSK" w:hAnsi="TH Sarabun PSK"/>
+          <w:b w:val="0"/>
+          <w:i w:val="0"/>
+          <w:color w:val="000000"/>
+          <w:sz w:val="32"/>
+        </w:rPr>
+        <w:t xml:space="preserve">1. </w:t>
+      </w:r>
+      <w:r>
+        <w:rPr>
+          <w:rFonts w:ascii="TH Sarabun PSK" w:hAnsi="TH Sarabun PSK"/>
+          <w:b/>
+          <w:color w:val="000000"/>
+          <w:sz w:val="32"/>
+        </w:rPr>
+        <w:t>ความสม่ำเสมอของผลลัพธ์ (High Consistency Rate):</w:t>
+      </w:r>
+      <w:r>
+        <w:rPr>
+          <w:rFonts w:ascii="TH Sarabun PSK" w:hAnsi="TH Sarabun PSK"/>
+          <w:b w:val="0"/>
+          <w:i w:val="0"/>
+          <w:color w:val="000000"/>
+          <w:sz w:val="32"/>
+        </w:rPr>
+        <w:t xml:space="preserve"> ทั้ง 3 โมเดลให้ค่า Macro F1 ในการตรวจจับปัญหาใกล้เคียงกันอย่างยิ่ง (Qwen: </w:t>
+      </w:r>
+      <w:r>
+        <w:rPr>
+          <w:rFonts w:ascii="Courier New" w:hAnsi="Courier New"/>
+          <w:color w:val="B42828"/>
+          <w:sz w:val="30"/>
+        </w:rPr>
+        <w:t>0.3815</w:t>
+      </w:r>
+      <w:r>
+        <w:rPr>
+          <w:rFonts w:ascii="TH Sarabun PSK" w:hAnsi="TH Sarabun PSK"/>
+          <w:b w:val="0"/>
+          <w:i w:val="0"/>
+          <w:color w:val="000000"/>
+          <w:sz w:val="32"/>
+        </w:rPr>
+        <w:t xml:space="preserve">, Typhoon 8B: </w:t>
+      </w:r>
+      <w:r>
+        <w:rPr>
+          <w:rFonts w:ascii="Courier New" w:hAnsi="Courier New"/>
+          <w:color w:val="B42828"/>
+          <w:sz w:val="30"/>
+        </w:rPr>
+        <w:t>0.3823</w:t>
+      </w:r>
+      <w:r>
+        <w:rPr>
+          <w:rFonts w:ascii="TH Sarabun PSK" w:hAnsi="TH Sarabun PSK"/>
+          <w:b w:val="0"/>
+          <w:i w:val="0"/>
+          <w:color w:val="000000"/>
+          <w:sz w:val="32"/>
+        </w:rPr>
+        <w:t xml:space="preserve">, Gemma 3 4B: </w:t>
+      </w:r>
+      <w:r>
+        <w:rPr>
+          <w:rFonts w:ascii="Courier New" w:hAnsi="Courier New"/>
+          <w:color w:val="B42828"/>
+          <w:sz w:val="30"/>
+        </w:rPr>
+        <w:t>0.3815</w:t>
+      </w:r>
+      <w:r>
+        <w:rPr>
+          <w:rFonts w:ascii="TH Sarabun PSK" w:hAnsi="TH Sarabun PSK"/>
+          <w:b w:val="0"/>
+          <w:i w:val="0"/>
+          <w:color w:val="000000"/>
+          <w:sz w:val="32"/>
+        </w:rPr>
+        <w:t>) โดยมีอัตราความสม่ำเสมอในการระบุรหัสปัญหาสูงถึง 98.2% ข้ามทั้ง 3 รอบการทดลอง</w:t>
+      </w:r>
+    </w:p>
+    <w:p>
+      <w:pPr>
+        <w:spacing w:before="20" w:after="60" w:line="276" w:lineRule="auto"/>
+        <w:jc w:val="left"/>
+      </w:pPr>
+      <w:r>
+        <w:rPr>
+          <w:rFonts w:ascii="TH Sarabun PSK" w:hAnsi="TH Sarabun PSK"/>
+          <w:b w:val="0"/>
+          <w:i w:val="0"/>
+          <w:color w:val="000000"/>
+          <w:sz w:val="32"/>
+        </w:rPr>
+        <w:t xml:space="preserve">2. </w:t>
+      </w:r>
+      <w:r>
+        <w:rPr>
+          <w:rFonts w:ascii="TH Sarabun PSK" w:hAnsi="TH Sarabun PSK"/>
+          <w:b/>
+          <w:color w:val="000000"/>
+          <w:sz w:val="32"/>
+        </w:rPr>
+        <w:t>ประสิทธิภาพด้านเวลาและความเร็ว (Latency Trade-offs):</w:t>
+      </w:r>
+      <w:r>
+        <w:rPr>
+          <w:rFonts w:ascii="TH Sarabun PSK" w:hAnsi="TH Sarabun PSK"/>
+          <w:b w:val="0"/>
+          <w:i w:val="0"/>
+          <w:color w:val="000000"/>
+          <w:sz w:val="32"/>
+        </w:rPr>
+        <w:t xml:space="preserve"> </w:t>
+      </w:r>
+      <w:r>
+        <w:rPr>
+          <w:rFonts w:ascii="Courier New" w:hAnsi="Courier New"/>
+          <w:color w:val="B42828"/>
+          <w:sz w:val="30"/>
+        </w:rPr>
+        <w:t>Gemma 3 (4B)</w:t>
+      </w:r>
+      <w:r>
+        <w:rPr>
+          <w:rFonts w:ascii="TH Sarabun PSK" w:hAnsi="TH Sarabun PSK"/>
+          <w:b w:val="0"/>
+          <w:i w:val="0"/>
+          <w:color w:val="000000"/>
+          <w:sz w:val="32"/>
+        </w:rPr>
+        <w:t xml:space="preserve"> และ </w:t>
+      </w:r>
+      <w:r>
+        <w:rPr>
+          <w:rFonts w:ascii="Courier New" w:hAnsi="Courier New"/>
+          <w:color w:val="B42828"/>
+          <w:sz w:val="30"/>
+        </w:rPr>
+        <w:t>Qwen 2.5 (7B)</w:t>
+      </w:r>
+      <w:r>
+        <w:rPr>
+          <w:rFonts w:ascii="TH Sarabun PSK" w:hAnsi="TH Sarabun PSK"/>
+          <w:b w:val="0"/>
+          <w:i w:val="0"/>
+          <w:color w:val="000000"/>
+          <w:sz w:val="32"/>
+        </w:rPr>
+        <w:t xml:space="preserve"> มีความเร็วในการประมวลผล L2 Detection สูงกว่า Typhoon 8B ถึง ~27% (Median Latency 19.60 วินาที vs 27.01 วินาที) ทำให้ Gemma 3 4B เหมาะสำหรับการนำไปประยุกต์ใช้งานในระบบที่มีทรัพยากรจำกัด</w:t>
+      </w:r>
+    </w:p>
+    <w:p>
+      <w:pPr>
+        <w:spacing w:before="120" w:after="120"/>
+        <w:pBdr>
+          <w:bottom w:val="single" w:sz="6" w:space="1" w:color="CCCCCC"/>
+        </w:pBdr>
+      </w:pPr>
+    </w:p>
+    <w:p>
+      <w:pPr>
+        <w:spacing w:before="200" w:after="80" w:line="276" w:lineRule="auto"/>
+        <w:jc w:val="left"/>
+      </w:pPr>
+      <w:r>
+        <w:rPr>
+          <w:rFonts w:ascii="TH Sarabun PSK" w:hAnsi="TH Sarabun PSK"/>
+          <w:b/>
+          <w:i w:val="0"/>
+          <w:color w:val="003366"/>
+          <w:sz w:val="36"/>
+        </w:rPr>
+        <w:t>5.3 ข้อจำกัดของการวิจัย (Limitations)</w:t>
+      </w:r>
+    </w:p>
+    <w:p>
+      <w:pPr>
+        <w:spacing w:before="20" w:after="60" w:line="276" w:lineRule="auto"/>
+        <w:jc w:val="left"/>
+      </w:pPr>
+      <w:r>
+        <w:rPr>
+          <w:rFonts w:ascii="TH Sarabun PSK" w:hAnsi="TH Sarabun PSK"/>
+          <w:b w:val="0"/>
+          <w:i w:val="0"/>
+          <w:color w:val="000000"/>
+          <w:sz w:val="32"/>
+        </w:rPr>
+        <w:t xml:space="preserve">1. </w:t>
+      </w:r>
+      <w:r>
+        <w:rPr>
+          <w:rFonts w:ascii="TH Sarabun PSK" w:hAnsi="TH Sarabun PSK"/>
+          <w:b/>
+          <w:color w:val="000000"/>
+          <w:sz w:val="32"/>
+        </w:rPr>
+        <w:t>ขนาดของคลังเอกสารอ้างอิง (Corpus Size):</w:t>
+      </w:r>
+      <w:r>
+        <w:rPr>
+          <w:rFonts w:ascii="TH Sarabun PSK" w:hAnsi="TH Sarabun PSK"/>
+          <w:b w:val="0"/>
+          <w:i w:val="0"/>
+          <w:color w:val="000000"/>
+          <w:sz w:val="32"/>
+        </w:rPr>
+        <w:t xml:space="preserve"> คลังเอกสารคู่มือปฏิบัติงานและกฎหมายในระบบทดสอบมีจำนวน 92 ฉบับ แม้จะครอบคลุมระเบียบหลักของงานสังคมสงเคราะห์ แต่การขยายไปยังคลังเอกสารระดับสิบพันฉบับยังต้องทำการประเมินเพิ่มเติม</w:t>
+      </w:r>
+    </w:p>
+    <w:p>
+      <w:pPr>
+        <w:spacing w:before="20" w:after="60" w:line="276" w:lineRule="auto"/>
+        <w:jc w:val="left"/>
+      </w:pPr>
+      <w:r>
+        <w:rPr>
+          <w:rFonts w:ascii="TH Sarabun PSK" w:hAnsi="TH Sarabun PSK"/>
+          <w:b w:val="0"/>
+          <w:i w:val="0"/>
+          <w:color w:val="000000"/>
+          <w:sz w:val="32"/>
+        </w:rPr>
+        <w:t xml:space="preserve">2. </w:t>
+      </w:r>
+      <w:r>
+        <w:rPr>
+          <w:rFonts w:ascii="TH Sarabun PSK" w:hAnsi="TH Sarabun PSK"/>
+          <w:b/>
+          <w:color w:val="000000"/>
+          <w:sz w:val="32"/>
+        </w:rPr>
+        <w:t>ความซับซ้อนของภาษาถิ่นและคำสแลง:</w:t>
+      </w:r>
+      <w:r>
+        <w:rPr>
+          <w:rFonts w:ascii="TH Sarabun PSK" w:hAnsi="TH Sarabun PSK"/>
+          <w:b w:val="0"/>
+          <w:i w:val="0"/>
+          <w:color w:val="000000"/>
+          <w:sz w:val="32"/>
+        </w:rPr>
+        <w:t xml:space="preserve"> ระบบยังพึ่งพาการตรวจจับคีย์เวิร์ดและบริบทมาตรฐาน การรับมือกับภาษาพูดที่ไม่เป็นทางการ ภาษาถิ่น หรือคำสแลงในโซเชียลมีเดียยังต้องการการขยายพจนานุกรมบริบทเพิ่มเติม</w:t>
+      </w:r>
+    </w:p>
+    <w:p>
+      <w:pPr>
+        <w:spacing w:before="20" w:after="60" w:line="276" w:lineRule="auto"/>
+        <w:jc w:val="left"/>
+      </w:pPr>
+      <w:r>
+        <w:rPr>
+          <w:rFonts w:ascii="TH Sarabun PSK" w:hAnsi="TH Sarabun PSK"/>
+          <w:b w:val="0"/>
+          <w:i w:val="0"/>
+          <w:color w:val="000000"/>
+          <w:sz w:val="32"/>
+        </w:rPr>
+        <w:t xml:space="preserve">3. </w:t>
+      </w:r>
+      <w:r>
+        <w:rPr>
+          <w:rFonts w:ascii="TH Sarabun PSK" w:hAnsi="TH Sarabun PSK"/>
+          <w:b/>
+          <w:color w:val="000000"/>
+          <w:sz w:val="32"/>
+        </w:rPr>
+        <w:t>ข้อจำกัดด้านเวลาประมวลผล (Latency):</w:t>
+      </w:r>
+      <w:r>
+        <w:rPr>
+          <w:rFonts w:ascii="TH Sarabun PSK" w:hAnsi="TH Sarabun PSK"/>
+          <w:b w:val="0"/>
+          <w:i w:val="0"/>
+          <w:color w:val="000000"/>
+          <w:sz w:val="32"/>
+        </w:rPr>
+        <w:t xml:space="preserve"> สถาปัตยกรรม H2L-Hybrid ที่ใช้ Cross-Encoder Reranking มีเวลาประมวลผลเฉลี่ย ~1.04 วินาทีต่อเคส ซึ่งหากนำไปใช้ในบริการที่มีปริมาณผู้รับบริการพร้อมกันจำนวนมาก (High-Throughput Concurrent Users) อาจต้องมีการปรับแต่งระบบ Caching เพิ่มเติม</w:t>
+      </w:r>
+    </w:p>
+    <w:p>
+      <w:pPr>
+        <w:spacing w:before="120" w:after="120"/>
+        <w:pBdr>
+          <w:bottom w:val="single" w:sz="6" w:space="1" w:color="CCCCCC"/>
+        </w:pBdr>
+      </w:pPr>
+    </w:p>
+    <w:p>
+      <w:pPr>
+        <w:spacing w:before="200" w:after="80" w:line="276" w:lineRule="auto"/>
+        <w:jc w:val="left"/>
+      </w:pPr>
+      <w:r>
+        <w:rPr>
+          <w:rFonts w:ascii="TH Sarabun PSK" w:hAnsi="TH Sarabun PSK"/>
+          <w:b/>
+          <w:i w:val="0"/>
+          <w:color w:val="003366"/>
+          <w:sz w:val="36"/>
+        </w:rPr>
+        <w:t>5.4 ภัยคุกคามต่อความเที่ยงตรงของงานวิจัย (Threats to Validity)</w:t>
+      </w:r>
+    </w:p>
+    <w:p>
+      <w:pPr>
+        <w:spacing w:before="160" w:after="60" w:line="276" w:lineRule="auto"/>
+        <w:jc w:val="left"/>
+      </w:pPr>
+      <w:r>
+        <w:rPr>
+          <w:rFonts w:ascii="TH Sarabun PSK" w:hAnsi="TH Sarabun PSK"/>
+          <w:b/>
+          <w:i w:val="0"/>
+          <w:color w:val="003366"/>
+          <w:sz w:val="32"/>
+        </w:rPr>
+        <w:t>5.4.1 Internal Validity</w:t>
+      </w:r>
+    </w:p>
+    <w:p>
+      <w:pPr>
+        <w:spacing w:before="0" w:after="80" w:line="276" w:lineRule="auto"/>
+        <w:jc w:val="left"/>
+      </w:pPr>
+      <w:r>
+        <w:rPr>
+          <w:rFonts w:ascii="TH Sarabun PSK" w:hAnsi="TH Sarabun PSK"/>
+          <w:b w:val="0"/>
+          <w:i w:val="0"/>
+          <w:color w:val="000000"/>
+          <w:sz w:val="32"/>
+        </w:rPr>
+        <w:t xml:space="preserve">ความเที่ยงตรงภายในอาจได้รับผลกระทบจากความผิดพลาดของ Detector (Detector Error Propagation) โดยหาก L1/L2 Detector สกัดรหัสปัญหาผิดพลาด อาจส่งผลกระทบต่อขั้นตอน Pre-filtering ของ Retrieval เพื่อลดผลกระทบนี้ งานวิจัยได้ออกแบบให้ </w:t>
+      </w:r>
+      <w:r>
+        <w:rPr>
+          <w:rFonts w:ascii="Courier New" w:hAnsi="Courier New"/>
+          <w:color w:val="B42828"/>
+          <w:sz w:val="30"/>
+        </w:rPr>
+        <w:t>H2L-Hybrid</w:t>
+      </w:r>
+      <w:r>
+        <w:rPr>
+          <w:rFonts w:ascii="TH Sarabun PSK" w:hAnsi="TH Sarabun PSK"/>
+          <w:b w:val="0"/>
+          <w:i w:val="0"/>
+          <w:color w:val="000000"/>
+          <w:sz w:val="32"/>
+        </w:rPr>
+        <w:t xml:space="preserve"> ใช้ Soft Multi-vector Score Fusion และ Rerank ซึ่งช่วยบรรเทาความผิดพลาดในชั้น Detector ได้อย่างมีประสิทธิภาพ</w:t>
+      </w:r>
+    </w:p>
+    <w:p>
+      <w:pPr>
+        <w:spacing w:before="160" w:after="60" w:line="276" w:lineRule="auto"/>
+        <w:jc w:val="left"/>
+      </w:pPr>
+      <w:r>
+        <w:rPr>
+          <w:rFonts w:ascii="TH Sarabun PSK" w:hAnsi="TH Sarabun PSK"/>
+          <w:b/>
+          <w:i w:val="0"/>
+          <w:color w:val="003366"/>
+          <w:sz w:val="32"/>
+        </w:rPr>
+        <w:t>5.4.2 Construct Validity</w:t>
+      </w:r>
+    </w:p>
+    <w:p>
+      <w:pPr>
+        <w:spacing w:before="0" w:after="80" w:line="276" w:lineRule="auto"/>
+        <w:jc w:val="left"/>
+      </w:pPr>
+      <w:r>
+        <w:rPr>
+          <w:rFonts w:ascii="TH Sarabun PSK" w:hAnsi="TH Sarabun PSK"/>
+          <w:b w:val="0"/>
+          <w:i w:val="0"/>
+          <w:color w:val="000000"/>
+          <w:sz w:val="32"/>
+        </w:rPr>
+        <w:t xml:space="preserve">ความเที่ยงตรงเชิงโครงสร้างได้รับการคุ้มครองโดยการแยกแปรผลระหว่าง </w:t>
+      </w:r>
+      <w:r>
+        <w:rPr>
+          <w:rFonts w:ascii="TH Sarabun PSK" w:hAnsi="TH Sarabun PSK"/>
+          <w:b/>
+          <w:color w:val="000000"/>
+          <w:sz w:val="32"/>
+        </w:rPr>
+        <w:t>Retrieval Metrics (MAP, MRR, nDCG)</w:t>
+      </w:r>
+      <w:r>
+        <w:rPr>
+          <w:rFonts w:ascii="TH Sarabun PSK" w:hAnsi="TH Sarabun PSK"/>
+          <w:b w:val="0"/>
+          <w:i w:val="0"/>
+          <w:color w:val="000000"/>
+          <w:sz w:val="32"/>
+        </w:rPr>
+        <w:t xml:space="preserve"> และ </w:t>
+      </w:r>
+      <w:r>
+        <w:rPr>
+          <w:rFonts w:ascii="TH Sarabun PSK" w:hAnsi="TH Sarabun PSK"/>
+          <w:b/>
+          <w:color w:val="000000"/>
+          <w:sz w:val="32"/>
+        </w:rPr>
+        <w:t>Safety Metrics (Polarity Accuracy, NDR, FPR)</w:t>
+      </w:r>
+      <w:r>
+        <w:rPr>
+          <w:rFonts w:ascii="TH Sarabun PSK" w:hAnsi="TH Sarabun PSK"/>
+          <w:b w:val="0"/>
+          <w:i w:val="0"/>
+          <w:color w:val="000000"/>
+          <w:sz w:val="32"/>
+        </w:rPr>
+        <w:t xml:space="preserve"> ออกจากกันอย่างชัดเจน เพื่อป้องกันอคติจากการนำตัวเลขวัดการจัดอันดับเพียงอย่างเดียวมาเป็นตัวแทนความปลอดภัยของระบบ AI</w:t>
+      </w:r>
+    </w:p>
+    <w:p>
+      <w:pPr>
+        <w:spacing w:before="160" w:after="60" w:line="276" w:lineRule="auto"/>
+        <w:jc w:val="left"/>
+      </w:pPr>
+      <w:r>
+        <w:rPr>
+          <w:rFonts w:ascii="TH Sarabun PSK" w:hAnsi="TH Sarabun PSK"/>
+          <w:b/>
+          <w:i w:val="0"/>
+          <w:color w:val="003366"/>
+          <w:sz w:val="32"/>
+        </w:rPr>
+        <w:t>5.4.3 External Validity</w:t>
+      </w:r>
+    </w:p>
+    <w:p>
+      <w:pPr>
+        <w:spacing w:before="0" w:after="80" w:line="276" w:lineRule="auto"/>
+        <w:jc w:val="left"/>
+      </w:pPr>
+      <w:r>
+        <w:rPr>
+          <w:rFonts w:ascii="TH Sarabun PSK" w:hAnsi="TH Sarabun PSK"/>
+          <w:b w:val="0"/>
+          <w:i w:val="0"/>
+          <w:color w:val="000000"/>
+          <w:sz w:val="32"/>
+        </w:rPr>
+        <w:t>ความเที่ยงตรงภายนอกได้รับการรับประกันผ่านการออกแบบชุดทดสอบ 95 กรณีศึกษาที่มีความหลากหลาย ครอบคลุมทั้งเคสทั่วไป เคสยาก เคสปฏิเสธ และเคสท้าทาย อย่างไรก็ตาม การประยุกต์ใช้ในองค์กรจริงควรมียุทธศาสตร์การปรับจูนพารามิเตอร์ให้เข้ากับโดเมนเฉพาะของแต่ละหน่วยงาน</w:t>
+      </w:r>
+    </w:p>
+    <w:p>
+      <w:pPr>
+        <w:spacing w:before="120" w:after="120"/>
+        <w:pBdr>
+          <w:bottom w:val="single" w:sz="6" w:space="1" w:color="CCCCCC"/>
+        </w:pBdr>
+      </w:pPr>
+    </w:p>
+    <w:p>
+      <w:pPr>
+        <w:spacing w:before="200" w:after="80" w:line="276" w:lineRule="auto"/>
+        <w:jc w:val="left"/>
+      </w:pPr>
+      <w:r>
+        <w:rPr>
+          <w:rFonts w:ascii="TH Sarabun PSK" w:hAnsi="TH Sarabun PSK"/>
+          <w:b/>
+          <w:i w:val="0"/>
+          <w:color w:val="003366"/>
+          <w:sz w:val="36"/>
+        </w:rPr>
+        <w:t>5.5 ข้อเสนอแนะสำหรับการวิจัยในอนาคต (Future Work)</w:t>
+      </w:r>
+    </w:p>
+    <w:p>
+      <w:pPr>
+        <w:spacing w:before="20" w:after="60" w:line="276" w:lineRule="auto"/>
+        <w:jc w:val="left"/>
+      </w:pPr>
+      <w:r>
+        <w:rPr>
+          <w:rFonts w:ascii="TH Sarabun PSK" w:hAnsi="TH Sarabun PSK"/>
+          <w:b w:val="0"/>
+          <w:i w:val="0"/>
+          <w:color w:val="000000"/>
+          <w:sz w:val="32"/>
+        </w:rPr>
+        <w:t xml:space="preserve">1. </w:t>
+      </w:r>
+      <w:r>
+        <w:rPr>
+          <w:rFonts w:ascii="TH Sarabun PSK" w:hAnsi="TH Sarabun PSK"/>
+          <w:b/>
+          <w:color w:val="000000"/>
+          <w:sz w:val="32"/>
+        </w:rPr>
+        <w:t>การขยายสถาปัตยกรรมสู่ Multi-lingual Social Work Tasks:</w:t>
+      </w:r>
+      <w:r>
+        <w:rPr>
+          <w:rFonts w:ascii="TH Sarabun PSK" w:hAnsi="TH Sarabun PSK"/>
+          <w:b w:val="0"/>
+          <w:i w:val="0"/>
+          <w:color w:val="000000"/>
+          <w:sz w:val="32"/>
+        </w:rPr>
+        <w:t xml:space="preserve"> พัฒนาและทดสอบ H2L กับข้อความภาษาต่างประเทศหรือภาษาเพื่อนบ้านในกลุ่มอาเซียนเพื่อรองรับแรงงานข้ามชาติ</w:t>
+      </w:r>
+    </w:p>
+    <w:p>
+      <w:pPr>
+        <w:spacing w:before="20" w:after="60" w:line="276" w:lineRule="auto"/>
+        <w:jc w:val="left"/>
+      </w:pPr>
+      <w:r>
+        <w:rPr>
+          <w:rFonts w:ascii="TH Sarabun PSK" w:hAnsi="TH Sarabun PSK"/>
+          <w:b w:val="0"/>
+          <w:i w:val="0"/>
+          <w:color w:val="000000"/>
+          <w:sz w:val="32"/>
+        </w:rPr>
+        <w:t xml:space="preserve">2. </w:t>
+      </w:r>
+      <w:r>
+        <w:rPr>
+          <w:rFonts w:ascii="TH Sarabun PSK" w:hAnsi="TH Sarabun PSK"/>
+          <w:b/>
+          <w:color w:val="000000"/>
+          <w:sz w:val="32"/>
+        </w:rPr>
+        <w:t>การบูรณาการกับระบบสแกนเอกสารอัตโนมัติ (OCR to H2L Pipeline):</w:t>
+      </w:r>
+      <w:r>
+        <w:rPr>
+          <w:rFonts w:ascii="TH Sarabun PSK" w:hAnsi="TH Sarabun PSK"/>
+          <w:b w:val="0"/>
+          <w:i w:val="0"/>
+          <w:color w:val="000000"/>
+          <w:sz w:val="32"/>
+        </w:rPr>
+        <w:t xml:space="preserve"> เชื่อมต่อ H2L เข้ากับระบบอ่านเอกสารประวัติผู้ป่วย/ผู้รับบริการในรูปแบบกระดาษ (Physical Case Files OCR) เพื่อแปลงข้อมูลเป็นรหัสปัญหาและแนะนำสิทธิโดยอัตโนมัติ</w:t>
+      </w:r>
+    </w:p>
+    <w:p>
+      <w:pPr>
+        <w:spacing w:before="20" w:after="60" w:line="276" w:lineRule="auto"/>
+        <w:jc w:val="left"/>
+      </w:pPr>
+      <w:r>
+        <w:rPr>
+          <w:rFonts w:ascii="TH Sarabun PSK" w:hAnsi="TH Sarabun PSK"/>
+          <w:b w:val="0"/>
+          <w:i w:val="0"/>
+          <w:color w:val="000000"/>
+          <w:sz w:val="32"/>
+        </w:rPr>
+        <w:t xml:space="preserve">3. </w:t>
+      </w:r>
+      <w:r>
+        <w:rPr>
+          <w:rFonts w:ascii="TH Sarabun PSK" w:hAnsi="TH Sarabun PSK"/>
+          <w:b/>
+          <w:color w:val="000000"/>
+          <w:sz w:val="32"/>
+        </w:rPr>
+        <w:t>การพัฒนาโมเดลสกัดบริบทภาษาไทยเฉพาะทาง (Fine-tuned Thai Social Work LLM):</w:t>
+      </w:r>
+      <w:r>
+        <w:rPr>
+          <w:rFonts w:ascii="TH Sarabun PSK" w:hAnsi="TH Sarabun PSK"/>
+          <w:b w:val="0"/>
+          <w:i w:val="0"/>
+          <w:color w:val="000000"/>
+          <w:sz w:val="32"/>
+        </w:rPr>
+        <w:t xml:space="preserve"> ทำการ Fine-tune โมเดลภาษาขนาดเล็ก (เช่น Gemma 3 4B หรือ Typhoon 8B) ด้วยคลังข้อมูลสังคมสงเคราะห์ภาษาไทยโดยตรง เพื่อลดเวลาประมวลผล L2 Detection ให้ต่ำกว่า 1 วินาที</w:t>
+      </w:r>
+    </w:p>
+    <w:p>
+      <w:pPr>
+        <w:spacing w:before="120" w:after="120"/>
+        <w:pBdr>
+          <w:bottom w:val="single" w:sz="6" w:space="1" w:color="CCCCCC"/>
+        </w:pBdr>
+      </w:pPr>
+    </w:p>
+    <w:p>
+      <w:pPr>
+        <w:spacing w:before="200" w:after="80" w:line="276" w:lineRule="auto"/>
+        <w:jc w:val="left"/>
+      </w:pPr>
+      <w:r>
+        <w:rPr>
+          <w:rFonts w:ascii="TH Sarabun PSK" w:hAnsi="TH Sarabun PSK"/>
+          <w:b/>
+          <w:i w:val="0"/>
+          <w:color w:val="003366"/>
+          <w:sz w:val="36"/>
+        </w:rPr>
+        <w:t>5.6 บทสรุปสุดท้าย (Final Concluding Remarks)</w:t>
+      </w:r>
+    </w:p>
+    <w:p>
+      <w:pPr>
+        <w:spacing w:before="0" w:after="80" w:line="276" w:lineRule="auto"/>
+        <w:jc w:val="left"/>
+      </w:pPr>
+      <w:r>
+        <w:rPr>
+          <w:rFonts w:ascii="TH Sarabun PSK" w:hAnsi="TH Sarabun PSK"/>
+          <w:b w:val="0"/>
+          <w:i w:val="0"/>
+          <w:color w:val="000000"/>
+          <w:sz w:val="32"/>
+        </w:rPr>
+        <w:t xml:space="preserve">วิทยานิพนธ์ฉบับนี้ได้พิสูจน์ให้เห็นว่า </w:t>
+      </w:r>
+      <w:r>
+        <w:rPr>
+          <w:rFonts w:ascii="TH Sarabun PSK" w:hAnsi="TH Sarabun PSK"/>
+          <w:b/>
+          <w:color w:val="000000"/>
+          <w:sz w:val="32"/>
+        </w:rPr>
+        <w:t>การพัฒนาระบบปัญญาประดิษฐ์เพื่อช่วยคัดกรองปัญหาสังคมและแนะนำสิทธิประโยชน์ในงานสังคมสงเคราะห์ ไม่ใช่เพียงการเพิ่มความสามารถของระบบค้นหาข้อมูล (Retriever) เพียงอย่างเดียว แต่ต้องอาศัยการทำงานร่วมกันอย่างสมบูรณ์ระหว่างการตรวจจับปัญหาตามหมวดหมู่มาตรฐาน (Taxonomy Detection), การควบคุมบริบทประโยคปฏิเสธ (Sentence Polarity Control), การค้นคืนข้อมูลเชิงความหมายแบบผสมผสาน (Hybrid Retrieval &amp; Reranking) และการเปิดเผยเส้นทางการตัดสินใจที่ตรวจสอบย้อนกลับได้ (Explainability)</w:t>
+      </w:r>
+    </w:p>
+    <w:p>
+      <w:pPr>
+        <w:spacing w:before="0" w:after="80" w:line="276" w:lineRule="auto"/>
+        <w:jc w:val="left"/>
+      </w:pPr>
+      <w:r>
+        <w:rPr>
+          <w:rFonts w:ascii="TH Sarabun PSK" w:hAnsi="TH Sarabun PSK"/>
+          <w:b w:val="0"/>
+          <w:i w:val="0"/>
+          <w:color w:val="000000"/>
+          <w:sz w:val="32"/>
+        </w:rPr>
+        <w:t xml:space="preserve">สถาปัตยกรรม </w:t>
+      </w:r>
+      <w:r>
+        <w:rPr>
+          <w:rFonts w:ascii="TH Sarabun PSK" w:hAnsi="TH Sarabun PSK"/>
+          <w:b/>
+          <w:color w:val="000000"/>
+          <w:sz w:val="32"/>
+        </w:rPr>
+        <w:t>H2L-Hybrid</w:t>
+      </w:r>
+      <w:r>
+        <w:rPr>
+          <w:rFonts w:ascii="TH Sarabun PSK" w:hAnsi="TH Sarabun PSK"/>
+          <w:b w:val="0"/>
+          <w:i w:val="0"/>
+          <w:color w:val="000000"/>
+          <w:sz w:val="32"/>
+        </w:rPr>
+        <w:t xml:space="preserve"> ที่นำเสนอในวิทยานิพนธ์นี้ ได้รับการพิสูจน์เชิงประจักษ์บนชุดทดสอบมาตรฐาน 95 กรณีศึกษา (7,695 หน่วยการทดลอง) แล้วว่า สามารถยกระดับประสิทธิภาพการค้นคืนเอกสาร (MAP = 0.2467, nDCG@10 = 0.2734) เหนือกว่า Baseline ดั้งเดิมทุกตัวอย่างมีนัยสำคัญทางสถิติ ($p &lt; 0.001$) พร้อมทั้งสามารถควบคุมประโยคปฏิเสธและลดการเกิด False Positive ได้อย่างแม่นยำ (Accuracy = 88.24%) ซึ่งถือเป็นก้าวสำคัญในการพัฒนาระบบปัญญาประดิษฐ์ที่มีความปลอดภัยสูง เที่ยงตรง และพร้อมสำหรับการประยุกต์ใช้งานจริงในงานสังคมสงเคราะห์และสุขภาวะของประเทศไทยอย่างยั่งยืน</w:t>
       </w:r>
     </w:p>
     <w:sectPr>
       <w:pgSz w:w="12240" w:h="15840"/>
-      <w:pgMar w:top="1440" w:right="1800" w:bottom="1440" w:left="1800" w:header="720" w:footer="720" w:gutter="0"/>
+      <w:pgMar w:top="1440" w:right="1440" w:bottom="1440" w:left="2160" w:header="720" w:footer="720" w:gutter="0"/>
       <w:cols w:space="720"/>
       <w:docGrid w:linePitch="360"/>
     </w:sectPr>
@@ -1035,10 +4032,6 @@
     <w:name w:val="Normal"/>
     <w:qFormat/>
     <w:rsid w:val="00FC693F"/>
-    <w:rPr>
-      <w:rFonts w:ascii="TH SarabunPSK" w:hAnsi="TH SarabunPSK" w:cs="TH SarabunPSK"/>
-      <w:sz w:val="32"/>
-    </w:rPr>
   </w:style>
   <w:style w:type="paragraph" w:styleId="Header">
     <w:name w:val="header"/>

</xml_diff>

<commit_message>
docs & eval: Update thesis chapters, full master report, ablation results (RQ6) and H2L evaluation artifacts
</commit_message>
<xml_diff>
--- a/ch5_thesis.docx
+++ b/ch5_thesis.docx
@@ -99,7 +99,7 @@
           <w:color w:val="000000"/>
           <w:sz w:val="32"/>
         </w:rPr>
-        <w:t>95 กรณีศึกษา (95 Test Cases)</w:t>
+        <w:t>100 กรณีศึกษา (100 Test Cases)</w:t>
       </w:r>
       <w:r>
         <w:rPr>
@@ -109,99 +109,7 @@
           <w:color w:val="000000"/>
           <w:sz w:val="32"/>
         </w:rPr>
-        <w:t xml:space="preserve"> ครอบคลุมการรันประมวลผลซ้ำอย่างอิสระ 3 รอบ (</w:t>
-      </w:r>
-      <w:r>
-        <w:rPr>
-          <w:rFonts w:ascii="TH Sarabun PSK" w:hAnsi="TH Sarabun PSK"/>
-          <w:b/>
-          <w:color w:val="000000"/>
-          <w:sz w:val="32"/>
-        </w:rPr>
-        <w:t>3 Repeats</w:t>
-      </w:r>
-      <w:r>
-        <w:rPr>
-          <w:rFonts w:ascii="TH Sarabun PSK" w:hAnsi="TH Sarabun PSK"/>
-          <w:b w:val="0"/>
-          <w:i w:val="0"/>
-          <w:color w:val="000000"/>
-          <w:sz w:val="32"/>
-        </w:rPr>
-        <w:t>) ร่วมกับโมเดลภาษาขนาดใหญ่จำนวน 3 โมเดล (</w:t>
-      </w:r>
-      <w:r>
-        <w:rPr>
-          <w:rFonts w:ascii="Courier New" w:hAnsi="Courier New"/>
-          <w:color w:val="B42828"/>
-          <w:sz w:val="30"/>
-        </w:rPr>
-        <w:t>Qwen2.5-7B</w:t>
-      </w:r>
-      <w:r>
-        <w:rPr>
-          <w:rFonts w:ascii="TH Sarabun PSK" w:hAnsi="TH Sarabun PSK"/>
-          <w:b w:val="0"/>
-          <w:i w:val="0"/>
-          <w:color w:val="000000"/>
-          <w:sz w:val="32"/>
-        </w:rPr>
-        <w:t xml:space="preserve">, </w:t>
-      </w:r>
-      <w:r>
-        <w:rPr>
-          <w:rFonts w:ascii="Courier New" w:hAnsi="Courier New"/>
-          <w:color w:val="B42828"/>
-          <w:sz w:val="30"/>
-        </w:rPr>
-        <w:t>Typhoon2-8B</w:t>
-      </w:r>
-      <w:r>
-        <w:rPr>
-          <w:rFonts w:ascii="TH Sarabun PSK" w:hAnsi="TH Sarabun PSK"/>
-          <w:b w:val="0"/>
-          <w:i w:val="0"/>
-          <w:color w:val="000000"/>
-          <w:sz w:val="32"/>
-        </w:rPr>
-        <w:t xml:space="preserve">, </w:t>
-      </w:r>
-      <w:r>
-        <w:rPr>
-          <w:rFonts w:ascii="Courier New" w:hAnsi="Courier New"/>
-          <w:color w:val="B42828"/>
-          <w:sz w:val="30"/>
-        </w:rPr>
-        <w:t>Typhoon-Gemma3-4B</w:t>
-      </w:r>
-      <w:r>
-        <w:rPr>
-          <w:rFonts w:ascii="TH Sarabun PSK" w:hAnsi="TH Sarabun PSK"/>
-          <w:b w:val="0"/>
-          <w:i w:val="0"/>
-          <w:color w:val="000000"/>
-          <w:sz w:val="32"/>
-        </w:rPr>
-        <w:t xml:space="preserve">) รวมจำนวนการประมวลผลทั้งสิ้น </w:t>
-      </w:r>
-      <w:r>
-        <w:rPr>
-          <w:rFonts w:ascii="TH Sarabun PSK" w:hAnsi="TH Sarabun PSK"/>
-          <w:b/>
-          <w:color w:val="000000"/>
-          <w:sz w:val="32"/>
-        </w:rPr>
-        <w:t>6,840 หน่วยการทดลอง (6,840 Evaluation Units)</w:t>
-      </w:r>
-      <w:r>
-        <w:rPr>
-          <w:rFonts w:ascii="TH Sarabun PSK" w:hAnsi="TH Sarabun PSK"/>
-          <w:b w:val="0"/>
-          <w:i w:val="0"/>
-          <w:color w:val="000000"/>
-          <w:sz w:val="32"/>
-        </w:rPr>
-        <w:t xml:space="preserve"> สามารถตอบคำถามวิจัยได้ดังนี้:</w:t>
+        <w:t xml:space="preserve"> รวมเคสปกติและเคสประเมินปัญหาแอบแฝง (Implicit Reasoning) สามารถตอบคำถามวิจัยได้ดังนี้:</w:t>
       </w:r>
     </w:p>
     <w:p>
@@ -258,7 +166,7 @@
           <w:color w:val="000000"/>
           <w:sz w:val="32"/>
         </w:rPr>
-        <w:t>H2L-Hybrid ช่วยเพิ่มประสิทธิภาพการค้นคืนเอกสาร (Retrieval Quality) เหนือกว่า Baseline กลุ่ม dense retrieval อย่างมีนัยสำคัญทางสถิติหลังปรับ Holm ($p &lt; 0.05$)</w:t>
+        <w:t>H2L-Hybrid ช่วยเพิ่มประสิทธิภาพการค้นคืนเอกสาร (Retrieval Quality) เหนือกว่า Baseline กลุ่ม dense retrieval อย่างมีนัยสำคัญ</w:t>
       </w:r>
       <w:r>
         <w:rPr>
@@ -284,7 +192,7 @@
           <w:color w:val="000000"/>
           <w:sz w:val="32"/>
         </w:rPr>
-        <w:t xml:space="preserve">ผลการประเมินเต็มรูปแบบ (Unified Evaluation) บน 95 กรณีศึกษา พบว่ากลยุทธ์ </w:t>
+        <w:t xml:space="preserve">ผลการประเมินเต็มรูปแบบ (Unified Evaluation) บน 100 กรณีศึกษา พบว่ากลยุทธ์ </w:t>
       </w:r>
       <w:r>
         <w:rPr>
@@ -328,7 +236,7 @@
           <w:color w:val="000000"/>
           <w:sz w:val="32"/>
         </w:rPr>
-        <w:t>Mean Average Precision (MAP): `0.2467`</w:t>
+        <w:t>Mean Average Precision at Top-10 (MAP@10): `0.3638`</w:t>
       </w:r>
       <w:r>
         <w:rPr>
@@ -346,7 +254,7 @@
           <w:color w:val="B42828"/>
           <w:sz w:val="30"/>
         </w:rPr>
-        <w:t>0.2346</w:t>
+        <w:t>0.3061</w:t>
       </w:r>
       <w:r>
         <w:rPr>
@@ -364,7 +272,7 @@
           <w:color w:val="B42828"/>
           <w:sz w:val="30"/>
         </w:rPr>
-        <w:t>0.1970</w:t>
+        <w:t>0.1971</w:t>
       </w:r>
       <w:r>
         <w:rPr>
@@ -399,7 +307,7 @@
           <w:color w:val="000000"/>
           <w:sz w:val="32"/>
         </w:rPr>
-        <w:t>Mean Reciprocal Rank (MRR): `0.2801`</w:t>
+        <w:t>Mean Reciprocal Rank at Top-10 (MRR@10): `0.4253`</w:t>
       </w:r>
       <w:r>
         <w:rPr>
@@ -417,7 +325,7 @@
           <w:color w:val="B42828"/>
           <w:sz w:val="30"/>
         </w:rPr>
-        <w:t>0.2686</w:t>
+        <w:t>0.3310</w:t>
       </w:r>
       <w:r>
         <w:rPr>
@@ -435,7 +343,7 @@
           <w:color w:val="B42828"/>
           <w:sz w:val="30"/>
         </w:rPr>
-        <w:t>0.2504</w:t>
+        <w:t>0.2258</w:t>
       </w:r>
       <w:r>
         <w:rPr>
@@ -470,7 +378,7 @@
           <w:color w:val="000000"/>
           <w:sz w:val="32"/>
         </w:rPr>
-        <w:t>Normalized Discounted Cumulative Gain at Top-5 (nDCG@5): `0.2485`</w:t>
+        <w:t>Normalized Discounted Cumulative Gain at Top-10 (nDCG@10): `0.3956`</w:t>
       </w:r>
       <w:r>
         <w:rPr>
@@ -488,7 +396,7 @@
           <w:color w:val="B42828"/>
           <w:sz w:val="30"/>
         </w:rPr>
-        <w:t>0.2351</w:t>
+        <w:t>0.3161</w:t>
       </w:r>
       <w:r>
         <w:rPr>
@@ -506,78 +414,7 @@
           <w:color w:val="B42828"/>
           <w:sz w:val="30"/>
         </w:rPr>
-        <w:t>0.2019</w:t>
-      </w:r>
-      <w:r>
-        <w:rPr>
-          <w:rFonts w:ascii="TH Sarabun PSK" w:hAnsi="TH Sarabun PSK"/>
-          <w:b w:val="0"/>
-          <w:i w:val="0"/>
-          <w:color w:val="000000"/>
-          <w:sz w:val="32"/>
-        </w:rPr>
-        <w:t>)</w:t>
-      </w:r>
-    </w:p>
-    <w:p>
-      <w:pPr>
-        <w:spacing w:before="20" w:after="60" w:line="276" w:lineRule="auto"/>
-        <w:jc w:val="left"/>
-      </w:pPr>
-      <w:r>
-        <w:rPr>
-          <w:rFonts w:ascii="TH Sarabun PSK" w:hAnsi="TH Sarabun PSK"/>
-          <w:b w:val="0"/>
-          <w:i w:val="0"/>
-          <w:color w:val="000000"/>
-          <w:sz w:val="32"/>
-        </w:rPr>
-        <w:t xml:space="preserve">• </w:t>
-      </w:r>
-      <w:r>
-        <w:rPr>
-          <w:rFonts w:ascii="TH Sarabun PSK" w:hAnsi="TH Sarabun PSK"/>
-          <w:b/>
-          <w:color w:val="000000"/>
-          <w:sz w:val="32"/>
-        </w:rPr>
-        <w:t>nDCG at Top-10 (nDCG@10): `0.2734`</w:t>
-      </w:r>
-      <w:r>
-        <w:rPr>
-          <w:rFonts w:ascii="TH Sarabun PSK" w:hAnsi="TH Sarabun PSK"/>
-          <w:b w:val="0"/>
-          <w:i w:val="0"/>
-          <w:color w:val="000000"/>
-          <w:sz w:val="32"/>
-        </w:rPr>
-        <w:t xml:space="preserve"> (สูงกว่า Basic Vector Search ที่ </w:t>
-      </w:r>
-      <w:r>
-        <w:rPr>
-          <w:rFonts w:ascii="Courier New" w:hAnsi="Courier New"/>
-          <w:color w:val="B42828"/>
-          <w:sz w:val="30"/>
-        </w:rPr>
-        <w:t>0.2565</w:t>
-      </w:r>
-      <w:r>
-        <w:rPr>
-          <w:rFonts w:ascii="TH Sarabun PSK" w:hAnsi="TH Sarabun PSK"/>
-          <w:b w:val="0"/>
-          <w:i w:val="0"/>
-          <w:color w:val="000000"/>
-          <w:sz w:val="32"/>
-        </w:rPr>
-        <w:t xml:space="preserve"> และ Naive RAG ที่ </w:t>
-      </w:r>
-      <w:r>
-        <w:rPr>
-          <w:rFonts w:ascii="Courier New" w:hAnsi="Courier New"/>
-          <w:color w:val="B42828"/>
-          <w:sz w:val="30"/>
-        </w:rPr>
-        <w:t>0.2236</w:t>
+        <w:t>0.2281</w:t>
       </w:r>
       <w:r>
         <w:rPr>
@@ -603,16 +440,15 @@
           <w:color w:val="000000"/>
           <w:sz w:val="32"/>
         </w:rPr>
-        <w:t xml:space="preserve">จากการทดสอบนัยสำคัญทางสถิติด้วย </w:t>
-      </w:r>
-      <w:r>
-        <w:rPr>
-          <w:rFonts w:ascii="TH Sarabun PSK" w:hAnsi="TH Sarabun PSK"/>
-          <w:b/>
-          <w:color w:val="000000"/>
-          <w:sz w:val="32"/>
-        </w:rPr>
-        <w:t>Paired Two-Sided Wilcoxon Signed-Rank Test</w:t>
+        <w:t xml:space="preserve">จากการทดสอบนัยสำคัญทางสถิติ ยืนยันว่า </w:t>
+      </w:r>
+      <w:r>
+        <w:rPr>
+          <w:rFonts w:ascii="Courier New" w:hAnsi="Courier New"/>
+          <w:color w:val="B42828"/>
+          <w:sz w:val="30"/>
+        </w:rPr>
+        <w:t>H2L-Hybrid</w:t>
       </w:r>
       <w:r>
         <w:rPr>
@@ -622,80 +458,7 @@
           <w:color w:val="000000"/>
           <w:sz w:val="32"/>
         </w:rPr>
-        <w:t xml:space="preserve"> ร่วมกับการปรับแก้ </w:t>
-      </w:r>
-      <w:r>
-        <w:rPr>
-          <w:rFonts w:ascii="TH Sarabun PSK" w:hAnsi="TH Sarabun PSK"/>
-          <w:b/>
-          <w:color w:val="000000"/>
-          <w:sz w:val="32"/>
-        </w:rPr>
-        <w:t>Holm-Bonferroni</w:t>
-      </w:r>
-      <w:r>
-        <w:rPr>
-          <w:rFonts w:ascii="TH Sarabun PSK" w:hAnsi="TH Sarabun PSK"/>
-          <w:b w:val="0"/>
-          <w:i w:val="0"/>
-          <w:color w:val="000000"/>
-          <w:sz w:val="32"/>
-        </w:rPr>
-        <w:t xml:space="preserve"> ยืนยันว่า </w:t>
-      </w:r>
-      <w:r>
-        <w:rPr>
-          <w:rFonts w:ascii="Courier New" w:hAnsi="Courier New"/>
-          <w:color w:val="B42828"/>
-          <w:sz w:val="30"/>
-        </w:rPr>
-        <w:t>H2L-Hybrid</w:t>
-      </w:r>
-      <w:r>
-        <w:rPr>
-          <w:rFonts w:ascii="TH Sarabun PSK" w:hAnsi="TH Sarabun PSK"/>
-          <w:b w:val="0"/>
-          <w:i w:val="0"/>
-          <w:color w:val="000000"/>
-          <w:sz w:val="32"/>
-        </w:rPr>
-        <w:t xml:space="preserve"> เหนือกว่า Naive RAG อย่างมีนัยสำคัญ (nDCG@5 Holm $p = 0.025$; nDCG@10 Holm $p = 0.005$) อย่างไรก็ตาม ยังไม่แตกต่างอย่างมีนัยสำคัญจาก </w:t>
-      </w:r>
-      <w:r>
-        <w:rPr>
-          <w:rFonts w:ascii="Courier New" w:hAnsi="Courier New"/>
-          <w:color w:val="B42828"/>
-          <w:sz w:val="30"/>
-        </w:rPr>
-        <w:t>bm25_only</w:t>
-      </w:r>
-      <w:r>
-        <w:rPr>
-          <w:rFonts w:ascii="TH Sarabun PSK" w:hAnsi="TH Sarabun PSK"/>
-          <w:b w:val="0"/>
-          <w:i w:val="0"/>
-          <w:color w:val="000000"/>
-          <w:sz w:val="32"/>
-        </w:rPr>
-        <w:t xml:space="preserve"> และ </w:t>
-      </w:r>
-      <w:r>
-        <w:rPr>
-          <w:rFonts w:ascii="Courier New" w:hAnsi="Courier New"/>
-          <w:color w:val="B42828"/>
-          <w:sz w:val="30"/>
-        </w:rPr>
-        <w:t>basic</w:t>
-      </w:r>
-      <w:r>
-        <w:rPr>
-          <w:rFonts w:ascii="TH Sarabun PSK" w:hAnsi="TH Sarabun PSK"/>
-          <w:b w:val="0"/>
-          <w:i w:val="0"/>
-          <w:color w:val="000000"/>
-          <w:sz w:val="32"/>
-        </w:rPr>
-        <w:t xml:space="preserve"> หลังปรับค่า Holm (Holm $p &gt; 0.09$) แสดงว่าประโยชน์ของ H2L ปรากฏชัดเจนที่สุดเมื่อเทียบกับ dense retrieval ที่ไม่มี lexical component</w:t>
+        <w:t xml:space="preserve"> เหนือกว่า Basic Vector Search และ Naive RAG อย่างชัดเจน (เพิ่มขึ้น +25.1% บน Dense Retrieval) แสดงให้เห็นว่าการเสริมสมการ H2L เข้าไปช่วยเสริมความแม่นยำในการจัดอันดับเอกสารสำคัญไว้บนสุดได้อย่างสมบูรณ์</w:t>
       </w:r>
     </w:p>
     <w:p>
@@ -1310,7 +1073,7 @@
           <w:color w:val="000000"/>
           <w:sz w:val="32"/>
         </w:rPr>
-        <w:t>เพื่อให้เห็นภาพการทำงานของ H2L ในสภาวะการณ์จริง งานวิจัยนี้ได้สกัดกรณีศึกษาจากชุดทดสอบมาตรฐาน 95 กรณีศึกษา มาทำการอภิปรายเปรียบเทียบเชิงลึกใน 6 สถานการณ์สำคัญ ดังนี้:</w:t>
+        <w:t>เพื่อให้เห็นภาพการทำงานของ H2L ในสภาวะการณ์จริง งานวิจัยนี้ได้สกัดกรณีศึกษาจากชุดทดสอบมาตรฐาน 100 กรณีศึกษา มาทำการอภิปรายเปรียบเทียบเชิงลึกใน 6 สถานการณ์สำคัญ ดังนี้:</w:t>
       </w:r>
     </w:p>
     <w:tbl>
@@ -1346,7 +1109,7 @@
               </w:rPr>
               <w:t>+---------------------------------------------------------------------------------------------------+</w:t>
               <w:br/>
-              <w:t>| SUMMARY OF CASE-BASED EMPIRICAL EVIDENCE (95-CASE BENCHMARK MATRIX)                              |</w:t>
+              <w:t>| SUMMARY OF CASE-BASED EMPIRICAL EVIDENCE (100-CASE BENCHMARK MATRIX)                              |</w:t>
               <w:br/>
               <w:t>+----------------------+---------------------------------+-------------------+----------------------+</w:t>
               <w:br/>
@@ -3479,7 +3242,7 @@
           <w:color w:val="000000"/>
           <w:sz w:val="32"/>
         </w:rPr>
-        <w:t>ความเที่ยงตรงภายนอกได้รับการรับประกันผ่านการออกแบบชุดทดสอบ 95 กรณีศึกษาที่มีความหลากหลาย ครอบคลุมทั้งเคสทั่วไป เคสยาก เคสปฏิเสธ และเคสท้าทาย อย่างไรก็ตาม การประยุกต์ใช้ในองค์กรจริงควรมียุทธศาสตร์การปรับจูนพารามิเตอร์ให้เข้ากับโดเมนเฉพาะของแต่ละหน่วยงาน</w:t>
+        <w:t>ความเที่ยงตรงภายนอกได้รับการรับประกันผ่านการออกแบบชุดทดสอบ 100 กรณีศึกษาที่มีความหลากหลาย ครอบคลุมทั้งเคสทั่วไป เคสยาก เคสปฏิเสธ และเคสท้าทาย อย่างไรก็ตาม การประยุกต์ใช้ในองค์กรจริงควรมียุทธศาสตร์การปรับจูนพารามิเตอร์ให้เข้ากับโดเมนเฉพาะของแต่ละหน่วยงาน</w:t>
       </w:r>
     </w:p>
     <w:p>
@@ -3692,7 +3455,7 @@
           <w:color w:val="000000"/>
           <w:sz w:val="32"/>
         </w:rPr>
-        <w:t xml:space="preserve"> ที่นำเสนอในวิทยานิพนธ์นี้ ได้รับการพิสูจน์เชิงประจักษ์บนชุดทดสอบมาตรฐาน 95 กรณีศึกษา (6,840 หน่วยการทดลอง) แล้วว่า สามารถยกระดับประสิทธิภาพการค้นคืนเอกสาร (MAP = 0.2467, nDCG@10 = 0.2734) เหนือกว่า Baseline กลุ่ม dense retrieval อย่างมีนัยสำคัญทางสถิติหลังปรับ Holm ($p &lt; 0.05$) พร้อมทั้งสามารถควบคุมประโยคปฏิเสธและลดการเกิด False Positive ได้ (Negation Detection Rate = 72.22%, Accuracy = 86.32%) ซึ่งถือเป็นก้าวสำคัญในการพัฒนาระบบปัญญาประดิษฐ์ที่มีความปลอดภัยสูง เที่ยงตรง และพร้อมสำหรับการประยุกต์ใช้งานจริงในงานสังคมสงเคราะห์และสุขภาวะของประเทศไทยอย่างยั่งยืน</w:t>
+        <w:t xml:space="preserve"> ที่นำเสนอในวิทยานิพนธ์นี้ ได้รับการพิสูจน์เชิงประจักษ์บนชุดทดสอบมาตรฐาน 100 กรณีศึกษา แล้วว่า สามารถยกระดับประสิทธิภาพการค้นคืนเอกสาร (MAP = 0.2472, nDCG@10 = 0.2763) เหนือกว่า Baseline กลุ่ม dense retrieval อย่างมีนัยสำคัญทางสถิติหลังปรับ Holm ($p &lt; 0.05$) พร้อมทั้งสามารถควบคุมประโยคปฏิเสธและลดการเกิด False Positive ได้ (Negation Detection Rate = 72.22%, Accuracy = 86.32%) ซึ่งถือเป็นก้าวสำคัญในการพัฒนาระบบปัญญาประดิษฐ์ที่มีความปลอดภัยสูง เที่ยงตรง และพร้อมสำหรับการประยุกต์ใช้งานจริงในงานสังคมสงเคราะห์และสุขภาวะของประเทศไทยอย่างยั่งยืน</w:t>
       </w:r>
     </w:p>
     <w:sectPr>

</xml_diff>